<commit_message>
docs: update Design & Implementation Spec — auth retarget done; deepen + de-patronize manager prose
</commit_message>
<xml_diff>
--- a/docs/ICJIA-Research-Hub-Studio-2026-Design-and-Implementation-Spec.docx
+++ b/docs/ICJIA-Research-Hub-Studio-2026-Design-and-Implementation-Spec.docx
@@ -1303,7 +1303,7 @@
         <w:t xml:space="preserve"> </w:t>
       </w:r>
       <w:r>
-        <w:t xml:space="preserve">The point is simply to make the iceberg visible.</w:t>
+        <w:t xml:space="preserve">The point is to make the iceberg visible.</w:t>
       </w:r>
     </w:p>
     <w:bookmarkStart w:id="12" w:name="X97d5da5c997cb9a2835d0937b26fd20cd7004d0"/>
@@ -1348,41 +1348,79 @@
         <w:pStyle w:val="FirstParagraph"/>
       </w:pPr>
       <w:r>
-        <w:t xml:space="preserve">A login box looks like one text field, one password field, and a button. But a</w:t>
-      </w:r>
-      <w:r>
-        <w:t xml:space="preserve"> </w:t>
-      </w:r>
-      <w:r>
-        <w:t xml:space="preserve">login that you can trust has to: keep your session secure across page reloads,</w:t>
-      </w:r>
-      <w:r>
-        <w:t xml:space="preserve"> </w:t>
-      </w:r>
-      <w:r>
-        <w:t xml:space="preserve">re-check with the server on every app start that you are still who you say you</w:t>
-      </w:r>
-      <w:r>
-        <w:t xml:space="preserve"> </w:t>
-      </w:r>
-      <w:r>
-        <w:t xml:space="preserve">are, send you back to the login screen the moment your access expires, and —</w:t>
-      </w:r>
-      <w:r>
-        <w:t xml:space="preserve"> </w:t>
-      </w:r>
-      <w:r>
-        <w:t xml:space="preserve">critically — know</w:t>
-      </w:r>
-      <w:r>
-        <w:t xml:space="preserve"> </w:t>
-      </w:r>
-      <w:r>
-        <w:rPr>
-          <w:b/>
-          <w:bCs/>
-        </w:rPr>
-        <w:t xml:space="preserve">what you are allowed to do</w:t>
+        <w:t xml:space="preserve">A login you can actually trust has to do several things at once that aren’t</w:t>
+      </w:r>
+      <w:r>
+        <w:t xml:space="preserve"> </w:t>
+      </w:r>
+      <w:r>
+        <w:t xml:space="preserve">visible on the screen. It keeps your session secure across page reloads so you</w:t>
+      </w:r>
+      <w:r>
+        <w:t xml:space="preserve"> </w:t>
+      </w:r>
+      <w:r>
+        <w:t xml:space="preserve">aren’t asked to sign in again every few minutes. It re-checks with the server on</w:t>
+      </w:r>
+      <w:r>
+        <w:t xml:space="preserve"> </w:t>
+      </w:r>
+      <w:r>
+        <w:t xml:space="preserve">every app start that your account is still valid and still has the access it had</w:t>
+      </w:r>
+      <w:r>
+        <w:t xml:space="preserve"> </w:t>
+      </w:r>
+      <w:r>
+        <w:t xml:space="preserve">yesterday — because the answer can change between visits (an account can be</w:t>
+      </w:r>
+      <w:r>
+        <w:t xml:space="preserve"> </w:t>
+      </w:r>
+      <w:r>
+        <w:t xml:space="preserve">disabled, a role can be reduced) and the app must honor that immediately rather</w:t>
+      </w:r>
+      <w:r>
+        <w:t xml:space="preserve"> </w:t>
+      </w:r>
+      <w:r>
+        <w:t xml:space="preserve">than trust a stale local copy. It sends you back to the login screen the moment</w:t>
+      </w:r>
+      <w:r>
+        <w:t xml:space="preserve"> </w:t>
+      </w:r>
+      <w:r>
+        <w:t xml:space="preserve">your access expires, mid-session, without losing or corrupting work in progress.</w:t>
+      </w:r>
+      <w:r>
+        <w:t xml:space="preserve"> </w:t>
+      </w:r>
+      <w:r>
+        <w:t xml:space="preserve">And — the part that carries the most weight — it has to know</w:t>
+      </w:r>
+      <w:r>
+        <w:t xml:space="preserve"> </w:t>
+      </w:r>
+      <w:r>
+        <w:rPr>
+          <w:b/>
+          <w:bCs/>
+        </w:rPr>
+        <w:t xml:space="preserve">what you are</w:t>
+      </w:r>
+      <w:r>
+        <w:rPr>
+          <w:b/>
+          <w:bCs/>
+        </w:rPr>
+        <w:t xml:space="preserve"> </w:t>
+      </w:r>
+      <w:r>
+        <w:rPr>
+          <w:b/>
+          <w:bCs/>
+        </w:rPr>
+        <w:t xml:space="preserve">allowed to do</w:t>
       </w:r>
       <w:r>
         <w:t xml:space="preserve"> </w:t>
@@ -1396,63 +1434,142 @@
         <w:pStyle w:val="BodyText"/>
       </w:pPr>
       <w:r>
-        <w:t xml:space="preserve">That last part is the real work. The whole tool hinges on a rule:</w:t>
-      </w:r>
-      <w:r>
-        <w:t xml:space="preserve"> </w:t>
-      </w:r>
-      <w:r>
-        <w:rPr>
-          <w:b/>
-          <w:bCs/>
-        </w:rPr>
-        <w:t xml:space="preserve">Authors can</w:t>
-      </w:r>
-      <w:r>
-        <w:rPr>
-          <w:b/>
-          <w:bCs/>
-        </w:rPr>
-        <w:t xml:space="preserve"> </w:t>
-      </w:r>
-      <w:r>
-        <w:rPr>
-          <w:b/>
-          <w:bCs/>
-        </w:rPr>
-        <w:t xml:space="preserve">write and save drafts but cannot publish; Editors and Super Admins can publish</w:t>
-      </w:r>
-      <w:r>
-        <w:rPr>
-          <w:b/>
-          <w:bCs/>
-        </w:rPr>
-        <w:t xml:space="preserve"> </w:t>
-      </w:r>
-      <w:r>
-        <w:rPr>
-          <w:b/>
-          <w:bCs/>
-        </w:rPr>
-        <w:t xml:space="preserve">(make content live).</w:t>
-      </w:r>
-      <w:r>
-        <w:t xml:space="preserve"> </w:t>
-      </w:r>
-      <w:r>
-        <w:t xml:space="preserve">That rule has to be enforced by the system itself — not</w:t>
-      </w:r>
-      <w:r>
-        <w:t xml:space="preserve"> </w:t>
-      </w:r>
-      <w:r>
-        <w:t xml:space="preserve">merely by hiding a button — so that no one can publish who shouldn’t, even if</w:t>
-      </w:r>
-      <w:r>
-        <w:t xml:space="preserve"> </w:t>
-      </w:r>
-      <w:r>
-        <w:t xml:space="preserve">they go looking for a way around the screen.</w:t>
+        <w:t xml:space="preserve">That last part is the real work, and it is harder than it sounds because it is a</w:t>
+      </w:r>
+      <w:r>
+        <w:t xml:space="preserve"> </w:t>
+      </w:r>
+      <w:r>
+        <w:rPr>
+          <w:i/>
+          <w:iCs/>
+        </w:rPr>
+        <w:t xml:space="preserve">security boundary</w:t>
+      </w:r>
+      <w:r>
+        <w:t xml:space="preserve">, not a screen behavior. The whole tool hinges on a rule:</w:t>
+      </w:r>
+      <w:r>
+        <w:t xml:space="preserve"> </w:t>
+      </w:r>
+      <w:r>
+        <w:rPr>
+          <w:b/>
+          <w:bCs/>
+        </w:rPr>
+        <w:t xml:space="preserve">Authors can write and save drafts but cannot publish; Editors and Super Admins</w:t>
+      </w:r>
+      <w:r>
+        <w:rPr>
+          <w:b/>
+          <w:bCs/>
+        </w:rPr>
+        <w:t xml:space="preserve"> </w:t>
+      </w:r>
+      <w:r>
+        <w:rPr>
+          <w:b/>
+          <w:bCs/>
+        </w:rPr>
+        <w:t xml:space="preserve">can publish (make content live).</w:t>
+      </w:r>
+      <w:r>
+        <w:t xml:space="preserve"> </w:t>
+      </w:r>
+      <w:r>
+        <w:t xml:space="preserve">Hiding the Publish button from an author is</w:t>
+      </w:r>
+      <w:r>
+        <w:t xml:space="preserve"> </w:t>
+      </w:r>
+      <w:r>
+        <w:t xml:space="preserve">trivial and worthless on its own — the button is just paint. The browser is a</w:t>
+      </w:r>
+      <w:r>
+        <w:t xml:space="preserve"> </w:t>
+      </w:r>
+      <w:r>
+        <w:t xml:space="preserve">fundamentally untrusted place: a determined person can read the page’s code, see</w:t>
+      </w:r>
+      <w:r>
+        <w:t xml:space="preserve"> </w:t>
+      </w:r>
+      <w:r>
+        <w:t xml:space="preserve">every request it makes, and replay those requests by hand with the button out of</w:t>
+      </w:r>
+      <w:r>
+        <w:t xml:space="preserve"> </w:t>
+      </w:r>
+      <w:r>
+        <w:t xml:space="preserve">the picture entirely. So the rule has to be enforced where the request actually</w:t>
+      </w:r>
+      <w:r>
+        <w:t xml:space="preserve"> </w:t>
+      </w:r>
+      <w:r>
+        <w:t xml:space="preserve">lands — by the server that owns the content — and the rule the</w:t>
+      </w:r>
+      <w:r>
+        <w:t xml:space="preserve"> </w:t>
+      </w:r>
+      <w:r>
+        <w:rPr>
+          <w:i/>
+          <w:iCs/>
+        </w:rPr>
+        <w:t xml:space="preserve">server</w:t>
+      </w:r>
+      <w:r>
+        <w:t xml:space="preserve"> </w:t>
+      </w:r>
+      <w:r>
+        <w:t xml:space="preserve">applies</w:t>
+      </w:r>
+      <w:r>
+        <w:t xml:space="preserve"> </w:t>
+      </w:r>
+      <w:r>
+        <w:t xml:space="preserve">and the rule the</w:t>
+      </w:r>
+      <w:r>
+        <w:t xml:space="preserve"> </w:t>
+      </w:r>
+      <w:r>
+        <w:rPr>
+          <w:i/>
+          <w:iCs/>
+        </w:rPr>
+        <w:t xml:space="preserve">screen</w:t>
+      </w:r>
+      <w:r>
+        <w:t xml:space="preserve"> </w:t>
+      </w:r>
+      <w:r>
+        <w:t xml:space="preserve">implies have to agree exactly, in every state, or you</w:t>
+      </w:r>
+      <w:r>
+        <w:t xml:space="preserve"> </w:t>
+      </w:r>
+      <w:r>
+        <w:t xml:space="preserve">get either a silent security hole or a confusing app that offers actions it then</w:t>
+      </w:r>
+      <w:r>
+        <w:t xml:space="preserve"> </w:t>
+      </w:r>
+      <w:r>
+        <w:t xml:space="preserve">refuses. Reconciling those two layers, and proving they agree, is the genuine</w:t>
+      </w:r>
+      <w:r>
+        <w:t xml:space="preserve"> </w:t>
+      </w:r>
+      <w:r>
+        <w:t xml:space="preserve">work hiding behind</w:t>
+      </w:r>
+      <w:r>
+        <w:t xml:space="preserve"> </w:t>
+      </w:r>
+      <w:r>
+        <w:t xml:space="preserve">“just let them log in.”</w:t>
       </w:r>
     </w:p>
     <w:p>
@@ -1866,7 +1983,98 @@
         <w:t xml:space="preserve"> </w:t>
       </w:r>
       <w:r>
-        <w:t xml:space="preserve">anything.</w:t>
+        <w:t xml:space="preserve">anything. The difficulty is not the count of fields — it is that several of them</w:t>
+      </w:r>
+      <w:r>
+        <w:t xml:space="preserve"> </w:t>
+      </w:r>
+      <w:r>
+        <w:t xml:space="preserve">are not flat values but</w:t>
+      </w:r>
+      <w:r>
+        <w:t xml:space="preserve"> </w:t>
+      </w:r>
+      <w:r>
+        <w:rPr>
+          <w:i/>
+          <w:iCs/>
+        </w:rPr>
+        <w:t xml:space="preserve">structures</w:t>
+      </w:r>
+      <w:r>
+        <w:t xml:space="preserve">: a list of authors, a list of figures each</w:t>
+      </w:r>
+      <w:r>
+        <w:t xml:space="preserve"> </w:t>
+      </w:r>
+      <w:r>
+        <w:t xml:space="preserve">with its own image and caption, a time period with a start and end, links from</w:t>
+      </w:r>
+      <w:r>
+        <w:t xml:space="preserve"> </w:t>
+      </w:r>
+      <w:r>
+        <w:t xml:space="preserve">one article out to related apps and datasets. Each of those has to survive a full</w:t>
+      </w:r>
+      <w:r>
+        <w:t xml:space="preserve"> </w:t>
+      </w:r>
+      <w:r>
+        <w:t xml:space="preserve">round trip — read from the content system, shown in a form, edited, and saved</w:t>
+      </w:r>
+      <w:r>
+        <w:t xml:space="preserve"> </w:t>
+      </w:r>
+      <w:r>
+        <w:t xml:space="preserve">back — landing in exactly the shape the system expects, because a single field</w:t>
+      </w:r>
+      <w:r>
+        <w:t xml:space="preserve"> </w:t>
+      </w:r>
+      <w:r>
+        <w:t xml:space="preserve">read or written in the wrong shape doesn’t fail loudly; it quietly produces a</w:t>
+      </w:r>
+      <w:r>
+        <w:t xml:space="preserve"> </w:t>
+      </w:r>
+      <w:r>
+        <w:t xml:space="preserve">record that looks fine in Studio and is broken on the public site. And the only</w:t>
+      </w:r>
+      <w:r>
+        <w:t xml:space="preserve"> </w:t>
+      </w:r>
+      <w:r>
+        <w:t xml:space="preserve">trustworthy source for what each field’s</w:t>
+      </w:r>
+      <w:r>
+        <w:t xml:space="preserve"> </w:t>
+      </w:r>
+      <w:r>
+        <w:t xml:space="preserve">“correct shape”</w:t>
+      </w:r>
+      <w:r>
+        <w:t xml:space="preserve"> </w:t>
+      </w:r>
+      <w:r>
+        <w:t xml:space="preserve">actually is, is the live</w:t>
+      </w:r>
+      <w:r>
+        <w:t xml:space="preserve"> </w:t>
+      </w:r>
+      <w:r>
+        <w:t xml:space="preserve">content system itself, not a document or an assumption — which is why the real</w:t>
+      </w:r>
+      <w:r>
+        <w:t xml:space="preserve"> </w:t>
+      </w:r>
+      <w:r>
+        <w:t xml:space="preserve">field shapes here were confirmed by inspecting the live data directly rather than</w:t>
+      </w:r>
+      <w:r>
+        <w:t xml:space="preserve"> </w:t>
+      </w:r>
+      <w:r>
+        <w:t xml:space="preserve">taken on faith.</w:t>
       </w:r>
     </w:p>
     <w:p>
@@ -2139,7 +2347,13 @@
         <w:t xml:space="preserve"> </w:t>
       </w:r>
       <w:r>
-        <w:t xml:space="preserve">hides four separate requirements:</w:t>
+        <w:t xml:space="preserve">carries four separate requirements that pull in different</w:t>
+      </w:r>
+      <w:r>
+        <w:t xml:space="preserve"> </w:t>
+      </w:r>
+      <w:r>
+        <w:t xml:space="preserve">directions, and the work is in satisfying all four at once:</w:t>
       </w:r>
     </w:p>
     <w:p>
@@ -2155,62 +2369,73 @@
           <w:b/>
           <w:bCs/>
         </w:rPr>
-        <w:t xml:space="preserve">No giant embedded blobs.</w:t>
-      </w:r>
-      <w:r>
-        <w:t xml:space="preserve"> </w:t>
-      </w:r>
-      <w:r>
-        <w:t xml:space="preserve">The old tool stored each image by converting it</w:t>
-      </w:r>
-      <w:r>
-        <w:t xml:space="preserve"> </w:t>
-      </w:r>
-      <w:r>
-        <w:t xml:space="preserve">into an enormous block of text and stuffing that text directly into the</w:t>
-      </w:r>
-      <w:r>
-        <w:t xml:space="preserve"> </w:t>
-      </w:r>
-      <w:r>
-        <w:t xml:space="preserve">content record (a technique called</w:t>
-      </w:r>
-      <w:r>
-        <w:t xml:space="preserve"> </w:t>
-      </w:r>
-      <w:r>
-        <w:t xml:space="preserve">“base64”</w:t>
-      </w:r>
-      <w:r>
-        <w:t xml:space="preserve">). It bloats the database, slows</w:t>
-      </w:r>
-      <w:r>
-        <w:t xml:space="preserve"> </w:t>
-      </w:r>
-      <w:r>
-        <w:t xml:space="preserve">everything down, and makes images impossible to reuse. The new Studio</w:t>
-      </w:r>
-      <w:r>
-        <w:t xml:space="preserve"> </w:t>
-      </w:r>
-      <w:r>
-        <w:rPr>
-          <w:b/>
-          <w:bCs/>
-        </w:rPr>
-        <w:t xml:space="preserve">never</w:t>
-      </w:r>
-      <w:r>
-        <w:t xml:space="preserve"> </w:t>
-      </w:r>
-      <w:r>
-        <w:t xml:space="preserve">does this. Every image is uploaded once to a shared Media Library</w:t>
-      </w:r>
-      <w:r>
-        <w:t xml:space="preserve"> </w:t>
-      </w:r>
-      <w:r>
-        <w:t xml:space="preserve">and referenced by a link.</w:t>
+        <w:t xml:space="preserve">No image stored as embedded text (base64).</w:t>
+      </w:r>
+      <w:r>
+        <w:t xml:space="preserve"> </w:t>
+      </w:r>
+      <w:r>
+        <w:t xml:space="preserve">The old tool stored each image</w:t>
+      </w:r>
+      <w:r>
+        <w:t xml:space="preserve"> </w:t>
+      </w:r>
+      <w:r>
+        <w:t xml:space="preserve">by converting it into an enormous block of text — base64 — and writing that</w:t>
+      </w:r>
+      <w:r>
+        <w:t xml:space="preserve"> </w:t>
+      </w:r>
+      <w:r>
+        <w:t xml:space="preserve">text directly into the content record alongside the article. The consequences</w:t>
+      </w:r>
+      <w:r>
+        <w:t xml:space="preserve"> </w:t>
+      </w:r>
+      <w:r>
+        <w:t xml:space="preserve">compound: the database swells with image data it was never meant to hold,</w:t>
+      </w:r>
+      <w:r>
+        <w:t xml:space="preserve"> </w:t>
+      </w:r>
+      <w:r>
+        <w:t xml:space="preserve">every read and backup drags the images along whether you need them or not, and</w:t>
+      </w:r>
+      <w:r>
+        <w:t xml:space="preserve"> </w:t>
+      </w:r>
+      <w:r>
+        <w:t xml:space="preserve">the same picture used in three places is stored three separate times because a</w:t>
+      </w:r>
+      <w:r>
+        <w:t xml:space="preserve"> </w:t>
+      </w:r>
+      <w:r>
+        <w:t xml:space="preserve">record can’t share text with another record. The new Studio refuses this</w:t>
+      </w:r>
+      <w:r>
+        <w:t xml:space="preserve"> </w:t>
+      </w:r>
+      <w:r>
+        <w:t xml:space="preserve">outright. Each image is uploaded once to a shared Media Library and the record</w:t>
+      </w:r>
+      <w:r>
+        <w:t xml:space="preserve"> </w:t>
+      </w:r>
+      <w:r>
+        <w:t xml:space="preserve">keeps only a link to it. Holding that line is not a one-time decision; an</w:t>
+      </w:r>
+      <w:r>
+        <w:t xml:space="preserve"> </w:t>
+      </w:r>
+      <w:r>
+        <w:t xml:space="preserve">embedded image can sneak in through a pasted editor, a copied field, or an</w:t>
+      </w:r>
+      <w:r>
+        <w:t xml:space="preserve"> </w:t>
+      </w:r>
+      <w:r>
+        <w:t xml:space="preserve">import, so the prohibition has to be actively guarded rather than assumed.</w:t>
       </w:r>
     </w:p>
     <w:p>
@@ -2226,7 +2451,7 @@
           <w:b/>
           <w:bCs/>
         </w:rPr>
-        <w:t xml:space="preserve">Accessibility.</w:t>
+        <w:t xml:space="preserve">Accessibility is a legal-grade requirement, not polish.</w:t>
       </w:r>
       <w:r>
         <w:t xml:space="preserve"> </w:t>
@@ -2248,19 +2473,13 @@
         <w:t xml:space="preserve"> </w:t>
       </w:r>
       <w:r>
-        <w:t xml:space="preserve">(a short text description so</w:t>
-      </w:r>
-      <w:r>
-        <w:t xml:space="preserve"> </w:t>
-      </w:r>
-      <w:r>
-        <w:t xml:space="preserve">screen-reader users and search engines understand the image) and may carry an</w:t>
-      </w:r>
-      <w:r>
-        <w:t xml:space="preserve"> </w:t>
-      </w:r>
-      <w:r>
-        <w:t xml:space="preserve">optional</w:t>
+        <w:t xml:space="preserve">— a short written description that a screen reader speaks aloud to</w:t>
+      </w:r>
+      <w:r>
+        <w:t xml:space="preserve"> </w:t>
+      </w:r>
+      <w:r>
+        <w:t xml:space="preserve">someone who can’t see the image — and may carry an optional</w:t>
       </w:r>
       <w:r>
         <w:t xml:space="preserve"> </w:t>
@@ -2273,13 +2492,47 @@
         <w:t xml:space="preserve">caption</w:t>
       </w:r>
       <w:r>
-        <w:t xml:space="preserve">. This is not optional polish; it is what makes the public</w:t>
-      </w:r>
-      <w:r>
-        <w:t xml:space="preserve"> </w:t>
-      </w:r>
-      <w:r>
-        <w:t xml:space="preserve">content usable by everyone and compliant with accessibility expectations.</w:t>
+        <w:t xml:space="preserve">. For a</w:t>
+      </w:r>
+      <w:r>
+        <w:t xml:space="preserve"> </w:t>
+      </w:r>
+      <w:r>
+        <w:t xml:space="preserve">public government website this is a compliance obligation, not a nicety, which</w:t>
+      </w:r>
+      <w:r>
+        <w:t xml:space="preserve"> </w:t>
+      </w:r>
+      <w:r>
+        <w:t xml:space="preserve">means the tool can’t merely</w:t>
+      </w:r>
+      <w:r>
+        <w:t xml:space="preserve"> </w:t>
+      </w:r>
+      <w:r>
+        <w:rPr>
+          <w:i/>
+          <w:iCs/>
+        </w:rPr>
+        <w:t xml:space="preserve">offer</w:t>
+      </w:r>
+      <w:r>
+        <w:t xml:space="preserve"> </w:t>
+      </w:r>
+      <w:r>
+        <w:t xml:space="preserve">an alt-text box; it has to make supplying</w:t>
+      </w:r>
+      <w:r>
+        <w:t xml:space="preserve"> </w:t>
+      </w:r>
+      <w:r>
+        <w:t xml:space="preserve">one the path of least resistance so that accessible content is what naturally</w:t>
+      </w:r>
+      <w:r>
+        <w:t xml:space="preserve"> </w:t>
+      </w:r>
+      <w:r>
+        <w:t xml:space="preserve">gets produced.</w:t>
       </w:r>
     </w:p>
     <w:p>
@@ -2295,25 +2548,37 @@
           <w:b/>
           <w:bCs/>
         </w:rPr>
-        <w:t xml:space="preserve">Safe SVGs.</w:t>
-      </w:r>
-      <w:r>
-        <w:t xml:space="preserve"> </w:t>
-      </w:r>
-      <w:r>
-        <w:t xml:space="preserve">SVG image files are actually little programs and can carry</w:t>
-      </w:r>
-      <w:r>
-        <w:t xml:space="preserve"> </w:t>
-      </w:r>
-      <w:r>
-        <w:t xml:space="preserve">hidden scripts. Allowing staff to upload SVGs without cleaning them would be a</w:t>
-      </w:r>
-      <w:r>
-        <w:t xml:space="preserve"> </w:t>
-      </w:r>
-      <w:r>
-        <w:t xml:space="preserve">security hole. Studio strips anything dangerous out of an SVG</w:t>
+        <w:t xml:space="preserve">SVG uploads are an attack surface.</w:t>
+      </w:r>
+      <w:r>
+        <w:t xml:space="preserve"> </w:t>
+      </w:r>
+      <w:r>
+        <w:t xml:space="preserve">An SVG is not a flat picture like a JPG;</w:t>
+      </w:r>
+      <w:r>
+        <w:t xml:space="preserve"> </w:t>
+      </w:r>
+      <w:r>
+        <w:t xml:space="preserve">it is a text document that can legally contain executable instructions, which</w:t>
+      </w:r>
+      <w:r>
+        <w:t xml:space="preserve"> </w:t>
+      </w:r>
+      <w:r>
+        <w:t xml:space="preserve">is exactly what makes it dangerous to accept from a logged-in user — a booby-</w:t>
+      </w:r>
+      <w:r>
+        <w:t xml:space="preserve"> </w:t>
+      </w:r>
+      <w:r>
+        <w:t xml:space="preserve">trapped SVG can carry a script that runs in the browser of the next person who</w:t>
+      </w:r>
+      <w:r>
+        <w:t xml:space="preserve"> </w:t>
+      </w:r>
+      <w:r>
+        <w:t xml:space="preserve">views it. Studio strips the dangerous parts out of every SVG</w:t>
       </w:r>
       <w:r>
         <w:t xml:space="preserve"> </w:t>
@@ -2335,7 +2600,13 @@
         <w:t xml:space="preserve"> </w:t>
       </w:r>
       <w:r>
-        <w:t xml:space="preserve">ever stored.</w:t>
+        <w:t xml:space="preserve">stored, so a hostile file is defused at the door rather than trusted and served</w:t>
+      </w:r>
+      <w:r>
+        <w:t xml:space="preserve"> </w:t>
+      </w:r>
+      <w:r>
+        <w:t xml:space="preserve">to the public.</w:t>
       </w:r>
     </w:p>
     <w:p>
@@ -2351,25 +2622,53 @@
           <w:b/>
           <w:bCs/>
         </w:rPr>
-        <w:t xml:space="preserve">Only valid image formats.</w:t>
-      </w:r>
-      <w:r>
-        <w:t xml:space="preserve"> </w:t>
-      </w:r>
-      <w:r>
-        <w:t xml:space="preserve">The tool accepts real image formats (JPG, PNG,</w:t>
-      </w:r>
-      <w:r>
-        <w:t xml:space="preserve"> </w:t>
-      </w:r>
-      <w:r>
-        <w:t xml:space="preserve">SVG) and rejects the rest, with a clear message — without over-rejecting valid</w:t>
-      </w:r>
-      <w:r>
-        <w:t xml:space="preserve"> </w:t>
-      </w:r>
-      <w:r>
-        <w:t xml:space="preserve">files, which was a bug in the old tool.</w:t>
+        <w:t xml:space="preserve">Accept valid formats without over-rejecting.</w:t>
+      </w:r>
+      <w:r>
+        <w:t xml:space="preserve"> </w:t>
+      </w:r>
+      <w:r>
+        <w:t xml:space="preserve">The tool accepts real image</w:t>
+      </w:r>
+      <w:r>
+        <w:t xml:space="preserve"> </w:t>
+      </w:r>
+      <w:r>
+        <w:t xml:space="preserve">formats (JPG, PNG, SVG) and turns away the rest with a clear message. The</w:t>
+      </w:r>
+      <w:r>
+        <w:t xml:space="preserve"> </w:t>
+      </w:r>
+      <w:r>
+        <w:t xml:space="preserve">subtle part is the second half: the old tool was</w:t>
+      </w:r>
+      <w:r>
+        <w:t xml:space="preserve"> </w:t>
+      </w:r>
+      <w:r>
+        <w:rPr>
+          <w:i/>
+          <w:iCs/>
+        </w:rPr>
+        <w:t xml:space="preserve">too</w:t>
+      </w:r>
+      <w:r>
+        <w:t xml:space="preserve"> </w:t>
+      </w:r>
+      <w:r>
+        <w:t xml:space="preserve">strict and rejected</w:t>
+      </w:r>
+      <w:r>
+        <w:t xml:space="preserve"> </w:t>
+      </w:r>
+      <w:r>
+        <w:t xml:space="preserve">legitimate files, so getting this right means being precise about what counts</w:t>
+      </w:r>
+      <w:r>
+        <w:t xml:space="preserve"> </w:t>
+      </w:r>
+      <w:r>
+        <w:t xml:space="preserve">as valid rather than merely cautious.</w:t>
       </w:r>
     </w:p>
     <w:p>
@@ -2705,13 +3004,13 @@
         <w:pStyle w:val="FirstParagraph"/>
       </w:pPr>
       <w:r>
-        <w:t xml:space="preserve">Non-technical staff should not have to learn a markup language to write a</w:t>
-      </w:r>
-      <w:r>
-        <w:t xml:space="preserve"> </w:t>
-      </w:r>
-      <w:r>
-        <w:t xml:space="preserve">heading, a list, a table, or a link. They need formatting</w:t>
+        <w:t xml:space="preserve">Staff should not have to learn a markup language to write a heading, a list, a</w:t>
+      </w:r>
+      <w:r>
+        <w:t xml:space="preserve"> </w:t>
+      </w:r>
+      <w:r>
+        <w:t xml:space="preserve">table, or a link. They need formatting</w:t>
       </w:r>
       <w:r>
         <w:t xml:space="preserve"> </w:t>
@@ -2724,13 +3023,7 @@
         <w:t xml:space="preserve">buttons</w:t>
       </w:r>
       <w:r>
-        <w:t xml:space="preserve">, a visual</w:t>
-      </w:r>
-      <w:r>
-        <w:t xml:space="preserve"> </w:t>
-      </w:r>
-      <w:r>
-        <w:t xml:space="preserve">table builder, and a</w:t>
+        <w:t xml:space="preserve">, a visual table builder, and a</w:t>
       </w:r>
       <w:r>
         <w:t xml:space="preserve"> </w:t>
@@ -2746,25 +3039,83 @@
         <w:t xml:space="preserve"> </w:t>
       </w:r>
       <w:r>
-        <w:t xml:space="preserve">that shows what they are creating as they</w:t>
-      </w:r>
-      <w:r>
-        <w:t xml:space="preserve"> </w:t>
-      </w:r>
-      <w:r>
-        <w:t xml:space="preserve">create it — the same comfortable experience as any modern editor. Building (or in</w:t>
-      </w:r>
-      <w:r>
-        <w:t xml:space="preserve"> </w:t>
-      </w:r>
-      <w:r>
-        <w:t xml:space="preserve">our case, adapting) such an editor, and teaching it to handle images, is a real</w:t>
-      </w:r>
-      <w:r>
-        <w:t xml:space="preserve"> </w:t>
-      </w:r>
-      <w:r>
-        <w:t xml:space="preserve">piece of work.</w:t>
+        <w:t xml:space="preserve">that shows what they are creating as they create it — the same</w:t>
+      </w:r>
+      <w:r>
+        <w:t xml:space="preserve"> </w:t>
+      </w:r>
+      <w:r>
+        <w:t xml:space="preserve">experience they already expect from any modern editor. A rich text editor is one</w:t>
+      </w:r>
+      <w:r>
+        <w:t xml:space="preserve"> </w:t>
+      </w:r>
+      <w:r>
+        <w:t xml:space="preserve">of the genuinely hard pieces of software to build well; the polished ones</w:t>
+      </w:r>
+      <w:r>
+        <w:t xml:space="preserve"> </w:t>
+      </w:r>
+      <w:r>
+        <w:t xml:space="preserve">represent years of work, because the moment you let people format text freely you</w:t>
+      </w:r>
+      <w:r>
+        <w:t xml:space="preserve"> </w:t>
+      </w:r>
+      <w:r>
+        <w:t xml:space="preserve">inherit a long tail of edge cases — pasting from Word, nested lists, tables</w:t>
+      </w:r>
+      <w:r>
+        <w:t xml:space="preserve"> </w:t>
+      </w:r>
+      <w:r>
+        <w:t xml:space="preserve">inside tables, undo that behaves the way a human expects. The right move here is</w:t>
+      </w:r>
+      <w:r>
+        <w:t xml:space="preserve"> </w:t>
+      </w:r>
+      <w:r>
+        <w:t xml:space="preserve">therefore</w:t>
+      </w:r>
+      <w:r>
+        <w:t xml:space="preserve"> </w:t>
+      </w:r>
+      <w:r>
+        <w:rPr>
+          <w:i/>
+          <w:iCs/>
+        </w:rPr>
+        <w:t xml:space="preserve">not</w:t>
+      </w:r>
+      <w:r>
+        <w:t xml:space="preserve"> </w:t>
+      </w:r>
+      <w:r>
+        <w:t xml:space="preserve">to build one. Studio adapts a capable editor ICJIA already owns,</w:t>
+      </w:r>
+      <w:r>
+        <w:t xml:space="preserve"> </w:t>
+      </w:r>
+      <w:r>
+        <w:t xml:space="preserve">which converts most of that cost into a smaller, sharper problem: making someone</w:t>
+      </w:r>
+      <w:r>
+        <w:t xml:space="preserve"> </w:t>
+      </w:r>
+      <w:r>
+        <w:t xml:space="preserve">else’s editor handle images and render its live preview with the exact same rules</w:t>
+      </w:r>
+      <w:r>
+        <w:t xml:space="preserve"> </w:t>
+      </w:r>
+      <w:r>
+        <w:t xml:space="preserve">the public site uses, so that what an author sees while typing is genuinely what</w:t>
+      </w:r>
+      <w:r>
+        <w:t xml:space="preserve"> </w:t>
+      </w:r>
+      <w:r>
+        <w:t xml:space="preserve">will publish.</w:t>
       </w:r>
     </w:p>
     <w:p>
@@ -2997,7 +3348,89 @@
         <w:t xml:space="preserve"> </w:t>
       </w:r>
       <w:r>
-        <w:t xml:space="preserve">there are no surprises after Publish.</w:t>
+        <w:t xml:space="preserve">there are no surprises after Publish. The difficulty is that the preview and the</w:t>
+      </w:r>
+      <w:r>
+        <w:t xml:space="preserve"> </w:t>
+      </w:r>
+      <w:r>
+        <w:t xml:space="preserve">live site are produced by two</w:t>
+      </w:r>
+      <w:r>
+        <w:t xml:space="preserve"> </w:t>
+      </w:r>
+      <w:r>
+        <w:rPr>
+          <w:i/>
+          <w:iCs/>
+        </w:rPr>
+        <w:t xml:space="preserve">separate</w:t>
+      </w:r>
+      <w:r>
+        <w:t xml:space="preserve"> </w:t>
+      </w:r>
+      <w:r>
+        <w:t xml:space="preserve">applications.</w:t>
+      </w:r>
+      <w:r>
+        <w:t xml:space="preserve"> </w:t>
+      </w:r>
+      <w:r>
+        <w:t xml:space="preserve">“Exactly the same”</w:t>
+      </w:r>
+      <w:r>
+        <w:t xml:space="preserve"> </w:t>
+      </w:r>
+      <w:r>
+        <w:t xml:space="preserve">is only</w:t>
+      </w:r>
+      <w:r>
+        <w:t xml:space="preserve"> </w:t>
+      </w:r>
+      <w:r>
+        <w:t xml:space="preserve">true if both turn the author’s text into a page using the identical set of</w:t>
+      </w:r>
+      <w:r>
+        <w:t xml:space="preserve"> </w:t>
+      </w:r>
+      <w:r>
+        <w:t xml:space="preserve">formatting rules — and ICJIA’s content leans on the rules that are easiest to get</w:t>
+      </w:r>
+      <w:r>
+        <w:t xml:space="preserve"> </w:t>
+      </w:r>
+      <w:r>
+        <w:t xml:space="preserve">subtly wrong: footnotes, mathematical notation, and multi-row tables. If the</w:t>
+      </w:r>
+      <w:r>
+        <w:t xml:space="preserve"> </w:t>
+      </w:r>
+      <w:r>
+        <w:t xml:space="preserve">preview’s rules and the public site’s rules drift even slightly apart, the</w:t>
+      </w:r>
+      <w:r>
+        <w:t xml:space="preserve"> </w:t>
+      </w:r>
+      <w:r>
+        <w:t xml:space="preserve">preview becomes a confident lie, and the author finds out only after the content</w:t>
+      </w:r>
+      <w:r>
+        <w:t xml:space="preserve"> </w:t>
+      </w:r>
+      <w:r>
+        <w:t xml:space="preserve">is already public. Keeping the two renderers provably in step is the real task</w:t>
+      </w:r>
+      <w:r>
+        <w:t xml:space="preserve"> </w:t>
+      </w:r>
+      <w:r>
+        <w:t xml:space="preserve">hiding inside the word</w:t>
+      </w:r>
+      <w:r>
+        <w:t xml:space="preserve"> </w:t>
+      </w:r>
+      <w:r>
+        <w:t xml:space="preserve">“preview.”</w:t>
       </w:r>
     </w:p>
     <w:p>
@@ -3139,13 +3572,13 @@
         <w:pStyle w:val="FirstParagraph"/>
       </w:pPr>
       <w:r>
-        <w:t xml:space="preserve">In a real organization, content often gets a second set of eyes before it goes</w:t>
-      </w:r>
-      <w:r>
-        <w:t xml:space="preserve"> </w:t>
-      </w:r>
-      <w:r>
-        <w:t xml:space="preserve">public. Studio supports a</w:t>
+        <w:t xml:space="preserve">In organizations, content often gets a second set of eyes before it goes public.</w:t>
+      </w:r>
+      <w:r>
+        <w:t xml:space="preserve"> </w:t>
+      </w:r>
+      <w:r>
+        <w:t xml:space="preserve">Studio supports a</w:t>
       </w:r>
       <w:r>
         <w:t xml:space="preserve"> </w:t>
@@ -3158,13 +3591,13 @@
         <w:t xml:space="preserve">review step</w:t>
       </w:r>
       <w:r>
-        <w:t xml:space="preserve">: an author can request review, which</w:t>
-      </w:r>
-      <w:r>
-        <w:t xml:space="preserve"> </w:t>
-      </w:r>
-      <w:r>
-        <w:t xml:space="preserve">sends the author’s manager(s) an</w:t>
+        <w:t xml:space="preserve">: an author can request review, which sends the</w:t>
+      </w:r>
+      <w:r>
+        <w:t xml:space="preserve"> </w:t>
+      </w:r>
+      <w:r>
+        <w:t xml:space="preserve">author’s manager(s) an</w:t>
       </w:r>
       <w:r>
         <w:t xml:space="preserve"> </w:t>
@@ -3196,25 +3629,89 @@
         <w:t xml:space="preserve"> </w:t>
       </w:r>
       <w:r>
-        <w:t xml:space="preserve">to the</w:t>
-      </w:r>
-      <w:r>
-        <w:t xml:space="preserve"> </w:t>
-      </w:r>
-      <w:r>
-        <w:t xml:space="preserve">exact draft. The manager opens the link, sees the article as it will be</w:t>
-      </w:r>
-      <w:r>
-        <w:t xml:space="preserve"> </w:t>
-      </w:r>
-      <w:r>
-        <w:t xml:space="preserve">published, and proceeds. Sending reliable email from a web app — securely, without</w:t>
-      </w:r>
-      <w:r>
-        <w:t xml:space="preserve"> </w:t>
-      </w:r>
-      <w:r>
-        <w:t xml:space="preserve">exposing credentials — is its own small system.</w:t>
+        <w:t xml:space="preserve">to the exact</w:t>
+      </w:r>
+      <w:r>
+        <w:t xml:space="preserve"> </w:t>
+      </w:r>
+      <w:r>
+        <w:t xml:space="preserve">draft. The manager opens the link, sees the article as it will be published, and</w:t>
+      </w:r>
+      <w:r>
+        <w:t xml:space="preserve"> </w:t>
+      </w:r>
+      <w:r>
+        <w:t xml:space="preserve">proceeds. Sending email reliably from a web app is its own small system, for a</w:t>
+      </w:r>
+      <w:r>
+        <w:t xml:space="preserve"> </w:t>
+      </w:r>
+      <w:r>
+        <w:t xml:space="preserve">reason that isn’t obvious from the outside: the app runs in the user’s browser,</w:t>
+      </w:r>
+      <w:r>
+        <w:t xml:space="preserve"> </w:t>
+      </w:r>
+      <w:r>
+        <w:t xml:space="preserve">and a browser is the wrong place to send mail from. The credential that lets you</w:t>
+      </w:r>
+      <w:r>
+        <w:t xml:space="preserve"> </w:t>
+      </w:r>
+      <w:r>
+        <w:t xml:space="preserve">send mail through the email service is a secret — anyone who obtains it can send</w:t>
+      </w:r>
+      <w:r>
+        <w:t xml:space="preserve"> </w:t>
+      </w:r>
+      <w:r>
+        <w:t xml:space="preserve">mail as ICJIA — and anything the browser holds, the user can read. So the send</w:t>
+      </w:r>
+      <w:r>
+        <w:t xml:space="preserve"> </w:t>
+      </w:r>
+      <w:r>
+        <w:t xml:space="preserve">has to happen on a server the public can’t inspect, with the browser merely</w:t>
+      </w:r>
+      <w:r>
+        <w:t xml:space="preserve"> </w:t>
+      </w:r>
+      <w:r>
+        <w:rPr>
+          <w:i/>
+          <w:iCs/>
+        </w:rPr>
+        <w:t xml:space="preserve">asking</w:t>
+      </w:r>
+      <w:r>
+        <w:t xml:space="preserve"> </w:t>
+      </w:r>
+      <w:r>
+        <w:t xml:space="preserve">that server to send, and the server deciding whether the request is</w:t>
+      </w:r>
+      <w:r>
+        <w:t xml:space="preserve"> </w:t>
+      </w:r>
+      <w:r>
+        <w:t xml:space="preserve">legitimate before it does. That split — keep the secret off the browser, verify</w:t>
+      </w:r>
+      <w:r>
+        <w:t xml:space="preserve"> </w:t>
+      </w:r>
+      <w:r>
+        <w:t xml:space="preserve">the request, then send — is a small piece of back-end machinery standing behind a</w:t>
+      </w:r>
+      <w:r>
+        <w:t xml:space="preserve"> </w:t>
+      </w:r>
+      <w:r>
+        <w:t xml:space="preserve">feature that, on screen, is one button labeled</w:t>
+      </w:r>
+      <w:r>
+        <w:t xml:space="preserve"> </w:t>
+      </w:r>
+      <w:r>
+        <w:t xml:space="preserve">“Request review.”</w:t>
       </w:r>
     </w:p>
     <w:p>
@@ -3381,31 +3878,85 @@
         <w:t xml:space="preserve"> </w:t>
       </w:r>
       <w:r>
-        <w:t xml:space="preserve">Until that rebuild finishes (typically a minute or two), the content isn’t</w:t>
-      </w:r>
-      <w:r>
-        <w:t xml:space="preserve"> </w:t>
-      </w:r>
-      <w:r>
-        <w:t xml:space="preserve">visible publicly. Wiring that up — and keeping the</w:t>
-      </w:r>
-      <w:r>
-        <w:t xml:space="preserve"> </w:t>
-      </w:r>
-      <w:r>
-        <w:t xml:space="preserve">“doorbell”</w:t>
-      </w:r>
-      <w:r>
-        <w:t xml:space="preserve"> </w:t>
-      </w:r>
-      <w:r>
-        <w:t xml:space="preserve">address private so</w:t>
-      </w:r>
-      <w:r>
-        <w:t xml:space="preserve"> </w:t>
-      </w:r>
-      <w:r>
-        <w:t xml:space="preserve">not just anyone can trigger a public rebuild — is real work.</w:t>
+        <w:t xml:space="preserve">Those two steps live in two different systems, which creates the real engineering</w:t>
+      </w:r>
+      <w:r>
+        <w:t xml:space="preserve"> </w:t>
+      </w:r>
+      <w:r>
+        <w:t xml:space="preserve">question here: what happens when the first succeeds and the second fails? The</w:t>
+      </w:r>
+      <w:r>
+        <w:t xml:space="preserve"> </w:t>
+      </w:r>
+      <w:r>
+        <w:t xml:space="preserve">content is marked published but the public site hasn’t picked it up, and an</w:t>
+      </w:r>
+      <w:r>
+        <w:t xml:space="preserve"> </w:t>
+      </w:r>
+      <w:r>
+        <w:t xml:space="preserve">author who is told</w:t>
+      </w:r>
+      <w:r>
+        <w:t xml:space="preserve"> </w:t>
+      </w:r>
+      <w:r>
+        <w:t xml:space="preserve">“published!”</w:t>
+      </w:r>
+      <w:r>
+        <w:t xml:space="preserve"> </w:t>
+      </w:r>
+      <w:r>
+        <w:t xml:space="preserve">and then can’t find their article on the live</w:t>
+      </w:r>
+      <w:r>
+        <w:t xml:space="preserve"> </w:t>
+      </w:r>
+      <w:r>
+        <w:t xml:space="preserve">site has every reason to distrust the tool. So the publish flow has to treat the</w:t>
+      </w:r>
+      <w:r>
+        <w:t xml:space="preserve"> </w:t>
+      </w:r>
+      <w:r>
+        <w:t xml:space="preserve">two steps honestly — report</w:t>
+      </w:r>
+      <w:r>
+        <w:t xml:space="preserve"> </w:t>
+      </w:r>
+      <w:r>
+        <w:t xml:space="preserve">“published, but the site rebuild didn’t trigger”</w:t>
+      </w:r>
+      <w:r>
+        <w:t xml:space="preserve"> </w:t>
+      </w:r>
+      <w:r>
+        <w:t xml:space="preserve">as</w:t>
+      </w:r>
+      <w:r>
+        <w:t xml:space="preserve"> </w:t>
+      </w:r>
+      <w:r>
+        <w:t xml:space="preserve">its own distinct outcome rather than a flat success or a flat failure. And the</w:t>
+      </w:r>
+      <w:r>
+        <w:t xml:space="preserve"> </w:t>
+      </w:r>
+      <w:r>
+        <w:t xml:space="preserve">doorbell itself is a liability if it’s left lying around: the address that</w:t>
+      </w:r>
+      <w:r>
+        <w:t xml:space="preserve"> </w:t>
+      </w:r>
+      <w:r>
+        <w:t xml:space="preserve">triggers a public rebuild has to stay private, because a rebuild is something only</w:t>
+      </w:r>
+      <w:r>
+        <w:t xml:space="preserve"> </w:t>
+      </w:r>
+      <w:r>
+        <w:t xml:space="preserve">a publisher should be able to set off, not anyone who happens to find the URL.</w:t>
       </w:r>
     </w:p>
     <w:p>
@@ -3536,7 +4087,77 @@
         <w:pStyle w:val="FirstParagraph"/>
       </w:pPr>
       <w:r>
-        <w:t xml:space="preserve">The review-by-email feature needs to know</w:t>
+        <w:t xml:space="preserve">The review-by-email feature can’t email a manager it doesn’t know about, so the</w:t>
+      </w:r>
+      <w:r>
+        <w:t xml:space="preserve"> </w:t>
+      </w:r>
+      <w:r>
+        <w:t xml:space="preserve">information has to be captured somewhere — and the first sign-in is the one moment</w:t>
+      </w:r>
+      <w:r>
+        <w:t xml:space="preserve"> </w:t>
+      </w:r>
+      <w:r>
+        <w:t xml:space="preserve">you can require it without nagging people later. The first time a staff member</w:t>
+      </w:r>
+      <w:r>
+        <w:t xml:space="preserve"> </w:t>
+      </w:r>
+      <w:r>
+        <w:t xml:space="preserve">signs in, Studio collects a short profile: their manager email(s), which</w:t>
+      </w:r>
+      <w:r>
+        <w:t xml:space="preserve"> </w:t>
+      </w:r>
+      <w:r>
+        <w:rPr>
+          <w:b/>
+          <w:bCs/>
+        </w:rPr>
+        <w:t xml:space="preserve">center</w:t>
+      </w:r>
+      <w:r>
+        <w:t xml:space="preserve"> </w:t>
+      </w:r>
+      <w:r>
+        <w:t xml:space="preserve">they belong to, and their own (prefilled, editable) author email, and</w:t>
+      </w:r>
+      <w:r>
+        <w:t xml:space="preserve"> </w:t>
+      </w:r>
+      <w:r>
+        <w:t xml:space="preserve">it holds the rest of the tool closed until that profile exists. Two things make</w:t>
+      </w:r>
+      <w:r>
+        <w:t xml:space="preserve"> </w:t>
+      </w:r>
+      <w:r>
+        <w:t xml:space="preserve">this more than a form. First,</w:t>
+      </w:r>
+      <w:r>
+        <w:t xml:space="preserve"> </w:t>
+      </w:r>
+      <w:r>
+        <w:t xml:space="preserve">“hold the tool closed until complete”</w:t>
+      </w:r>
+      <w:r>
+        <w:t xml:space="preserve"> </w:t>
+      </w:r>
+      <w:r>
+        <w:t xml:space="preserve">is an</w:t>
+      </w:r>
+      <w:r>
+        <w:t xml:space="preserve"> </w:t>
+      </w:r>
+      <w:r>
+        <w:t xml:space="preserve">enforced gate, which means every path into the app has to route through it — a</w:t>
+      </w:r>
+      <w:r>
+        <w:t xml:space="preserve"> </w:t>
+      </w:r>
+      <w:r>
+        <w:t xml:space="preserve">gate with one unguarded side door isn’t a gate. Second, the profile has to be</w:t>
       </w:r>
       <w:r>
         <w:t xml:space="preserve"> </w:t>
@@ -3546,56 +4167,19 @@
           <w:i/>
           <w:iCs/>
         </w:rPr>
-        <w:t xml:space="preserve">who your managers are</w:t>
-      </w:r>
-      <w:r>
-        <w:t xml:space="preserve">. The first time</w:t>
-      </w:r>
-      <w:r>
-        <w:t xml:space="preserve"> </w:t>
-      </w:r>
-      <w:r>
-        <w:t xml:space="preserve">a staff member signs in, Studio collects a little profile: their manager</w:t>
-      </w:r>
-      <w:r>
-        <w:t xml:space="preserve"> </w:t>
-      </w:r>
-      <w:r>
-        <w:t xml:space="preserve">email(s), which</w:t>
-      </w:r>
-      <w:r>
-        <w:t xml:space="preserve"> </w:t>
-      </w:r>
-      <w:r>
-        <w:rPr>
-          <w:b/>
-          <w:bCs/>
-        </w:rPr>
-        <w:t xml:space="preserve">center</w:t>
-      </w:r>
-      <w:r>
-        <w:t xml:space="preserve"> </w:t>
-      </w:r>
-      <w:r>
-        <w:t xml:space="preserve">they belong to, and their own (prefilled, editable)</w:t>
-      </w:r>
-      <w:r>
-        <w:t xml:space="preserve"> </w:t>
-      </w:r>
-      <w:r>
-        <w:t xml:space="preserve">author email. The Studio is gated behind this on first login until it’s complete.</w:t>
-      </w:r>
-      <w:r>
-        <w:t xml:space="preserve"> </w:t>
-      </w:r>
-      <w:r>
-        <w:t xml:space="preserve">Collecting, storing, and enforcing that profile is, again, a small feature in its</w:t>
-      </w:r>
-      <w:r>
-        <w:t xml:space="preserve"> </w:t>
-      </w:r>
-      <w:r>
-        <w:t xml:space="preserve">own right.</w:t>
+        <w:t xml:space="preserve">stored</w:t>
+      </w:r>
+      <w:r>
+        <w:t xml:space="preserve"> </w:t>
+      </w:r>
+      <w:r>
+        <w:t xml:space="preserve">somewhere durable and tied to the person, which (as §2.9 gets into) the</w:t>
+      </w:r>
+      <w:r>
+        <w:t xml:space="preserve"> </w:t>
+      </w:r>
+      <w:r>
+        <w:t xml:space="preserve">content system doesn’t offer for free — a place to keep it has to be added.</w:t>
       </w:r>
     </w:p>
     <w:p>
@@ -3776,13 +4360,19 @@
         <w:t xml:space="preserve"> </w:t>
       </w:r>
       <w:r>
-        <w:t xml:space="preserve">published items, how images attach, how relationships are read and written. You</w:t>
-      </w:r>
-      <w:r>
-        <w:t xml:space="preserve"> </w:t>
-      </w:r>
-      <w:r>
-        <w:t xml:space="preserve">have to learn and respect those rules precisely.</w:t>
+        <w:t xml:space="preserve">published items, how images attach, how relationships are read and written. Those</w:t>
+      </w:r>
+      <w:r>
+        <w:t xml:space="preserve"> </w:t>
+      </w:r>
+      <w:r>
+        <w:t xml:space="preserve">rules have to be learned and respected precisely, and the only authoritative</w:t>
+      </w:r>
+      <w:r>
+        <w:t xml:space="preserve"> </w:t>
+      </w:r>
+      <w:r>
+        <w:t xml:space="preserve">source for what they actually are is the running system, not its documentation.</w:t>
       </w:r>
     </w:p>
     <w:p>
@@ -3825,6 +4415,19 @@
         <w:t xml:space="preserve">while building</w:t>
       </w:r>
       <w:r>
+        <w:t xml:space="preserve">, and since</w:t>
+      </w:r>
+      <w:r>
+        <w:t xml:space="preserve"> </w:t>
+      </w:r>
+      <w:r>
+        <w:rPr>
+          <w:b/>
+          <w:bCs/>
+        </w:rPr>
+        <w:t xml:space="preserve">resolved</w:t>
+      </w:r>
+      <w:r>
         <w:t xml:space="preserve">:</w:t>
       </w:r>
     </w:p>
@@ -3833,7 +4436,7 @@
         <w:pStyle w:val="BodyText"/>
       </w:pPr>
       <w:r>
-        <w:t xml:space="preserve">When we set out, the plan was for Studio to talk to Strapi’s</w:t>
+        <w:t xml:space="preserve">When the project set out, the plan was for Studio to talk to Strapi’s</w:t>
       </w:r>
       <w:r>
         <w:t xml:space="preserve"> </w:t>
@@ -3849,19 +4452,13 @@
         <w:t xml:space="preserve"> </w:t>
       </w:r>
       <w:r>
-        <w:t xml:space="preserve">API and for</w:t>
-      </w:r>
-      <w:r>
-        <w:t xml:space="preserve"> </w:t>
-      </w:r>
-      <w:r>
-        <w:t xml:space="preserve">us to configure the publish permissions ourselves. Mid-build, we confirmed</w:t>
-      </w:r>
-      <w:r>
-        <w:t xml:space="preserve"> </w:t>
-      </w:r>
-      <w:r>
-        <w:t xml:space="preserve">something important: ICJIA staff are</w:t>
+        <w:t xml:space="preserve">API and for the team to configure the publish permissions by hand. Mid-build, a</w:t>
+      </w:r>
+      <w:r>
+        <w:t xml:space="preserve"> </w:t>
+      </w:r>
+      <w:r>
+        <w:t xml:space="preserve">better path surfaced: ICJIA staff are</w:t>
       </w:r>
       <w:r>
         <w:t xml:space="preserve"> </w:t>
@@ -3987,13 +4584,25 @@
         <w:t xml:space="preserve"> </w:t>
       </w:r>
       <w:r>
-        <w:t xml:space="preserve">than the one our first login</w:t>
-      </w:r>
-      <w:r>
-        <w:t xml:space="preserve"> </w:t>
-      </w:r>
-      <w:r>
-        <w:t xml:space="preserve">used.</w:t>
+        <w:t xml:space="preserve">than the one the first login</w:t>
+      </w:r>
+      <w:r>
+        <w:t xml:space="preserve"> </w:t>
+      </w:r>
+      <w:r>
+        <w:t xml:space="preserve">used. The catch is that this isn’t visible from outside the system; you can only</w:t>
+      </w:r>
+      <w:r>
+        <w:t xml:space="preserve"> </w:t>
+      </w:r>
+      <w:r>
+        <w:t xml:space="preserve">learn that the admin door enforces the rule, and the public door doesn’t, by</w:t>
+      </w:r>
+      <w:r>
+        <w:t xml:space="preserve"> </w:t>
+      </w:r>
+      <w:r>
+        <w:t xml:space="preserve">building far enough to knock on both.</w:t>
       </w:r>
     </w:p>
     <w:p>
@@ -4001,37 +4610,50 @@
         <w:pStyle w:val="BodyText"/>
       </w:pPr>
       <w:r>
-        <w:t xml:space="preserve">So we made a surgical change: we</w:t>
-      </w:r>
-      <w:r>
-        <w:t xml:space="preserve"> </w:t>
-      </w:r>
-      <w:r>
-        <w:rPr>
-          <w:b/>
-          <w:bCs/>
-        </w:rPr>
-        <w:t xml:space="preserve">retargeted the login and all content access to</w:t>
-      </w:r>
-      <w:r>
-        <w:rPr>
-          <w:b/>
-          <w:bCs/>
-        </w:rPr>
-        <w:t xml:space="preserve"> </w:t>
-      </w:r>
-      <w:r>
-        <w:rPr>
-          <w:b/>
-          <w:bCs/>
-        </w:rPr>
-        <w:t xml:space="preserve">the admin Content-Manager API.</w:t>
-      </w:r>
-      <w:r>
-        <w:t xml:space="preserve"> </w:t>
-      </w:r>
-      <w:r>
-        <w:t xml:space="preserve">The payoff is large —</w:t>
+        <w:t xml:space="preserve">That discovery has now been acted on. The login and all content access have been</w:t>
+      </w:r>
+      <w:r>
+        <w:t xml:space="preserve"> </w:t>
+      </w:r>
+      <w:r>
+        <w:rPr>
+          <w:b/>
+          <w:bCs/>
+        </w:rPr>
+        <w:t xml:space="preserve">retargeted to the admin Content-Manager API</w:t>
+      </w:r>
+      <w:r>
+        <w:t xml:space="preserve">, and that change is</w:t>
+      </w:r>
+      <w:r>
+        <w:t xml:space="preserve"> </w:t>
+      </w:r>
+      <w:r>
+        <w:rPr>
+          <w:b/>
+          <w:bCs/>
+        </w:rPr>
+        <w:t xml:space="preserve">built,</w:t>
+      </w:r>
+      <w:r>
+        <w:rPr>
+          <w:b/>
+          <w:bCs/>
+        </w:rPr>
+        <w:t xml:space="preserve"> </w:t>
+      </w:r>
+      <w:r>
+        <w:rPr>
+          <w:b/>
+          <w:bCs/>
+        </w:rPr>
+        <w:t xml:space="preserve">tested, and merged.</w:t>
+      </w:r>
+      <w:r>
+        <w:t xml:space="preserve"> </w:t>
+      </w:r>
+      <w:r>
+        <w:t xml:space="preserve">The payoff is exactly what was hoped for:</w:t>
       </w:r>
       <w:r>
         <w:t xml:space="preserve"> </w:t>
@@ -4043,25 +4665,31 @@
         <w:t xml:space="preserve"> </w:t>
       </w:r>
       <w:r>
-        <w:t xml:space="preserve">is now</w:t>
-      </w:r>
-      <w:r>
-        <w:t xml:space="preserve"> </w:t>
-      </w:r>
-      <w:r>
-        <w:t xml:space="preserve">decided by your real Strapi roles, natively, with no custom permission code to</w:t>
-      </w:r>
-      <w:r>
-        <w:t xml:space="preserve"> </w:t>
-      </w:r>
-      <w:r>
-        <w:t xml:space="preserve">build or maintain. But discovering this required actually building far enough to</w:t>
-      </w:r>
-      <w:r>
-        <w:t xml:space="preserve"> </w:t>
-      </w:r>
-      <w:r>
-        <w:t xml:space="preserve">hit it. That is the nature of a first iteration:</w:t>
+        <w:t xml:space="preserve">is now decided by each person’s real Strapi role, natively, with no custom</w:t>
+      </w:r>
+      <w:r>
+        <w:t xml:space="preserve"> </w:t>
+      </w:r>
+      <w:r>
+        <w:t xml:space="preserve">permission code to build or maintain — and the change was small and surgical</w:t>
+      </w:r>
+      <w:r>
+        <w:t xml:space="preserve"> </w:t>
+      </w:r>
+      <w:r>
+        <w:t xml:space="preserve">rather than a redo, because the original code had been structured so that only the</w:t>
+      </w:r>
+      <w:r>
+        <w:t xml:space="preserve"> </w:t>
+      </w:r>
+      <w:r>
+        <w:t xml:space="preserve">“door”</w:t>
+      </w:r>
+      <w:r>
+        <w:t xml:space="preserve"> </w:t>
+      </w:r>
+      <w:r>
+        <w:t xml:space="preserve">needed to move. This is the nature of a disciplined first iteration:</w:t>
       </w:r>
       <w:r>
         <w:t xml:space="preserve"> </w:t>
@@ -4071,7 +4699,7 @@
           <w:i/>
           <w:iCs/>
         </w:rPr>
-        <w:t xml:space="preserve">you find the deep requirements</w:t>
+        <w:t xml:space="preserve">you</w:t>
       </w:r>
       <w:r>
         <w:rPr>
@@ -4085,37 +4713,43 @@
           <w:i/>
           <w:iCs/>
         </w:rPr>
-        <w:t xml:space="preserve">by building toward them, then you adjust.</w:t>
-      </w:r>
-      <w:r>
-        <w:t xml:space="preserve"> </w:t>
-      </w:r>
-      <w:r>
-        <w:t xml:space="preserve">This one discovery, on its own,</w:t>
-      </w:r>
-      <w:r>
-        <w:t xml:space="preserve"> </w:t>
-      </w:r>
-      <w:r>
-        <w:t xml:space="preserve">answers</w:t>
-      </w:r>
-      <w:r>
-        <w:t xml:space="preserve"> </w:t>
-      </w:r>
-      <w:r>
-        <w:t xml:space="preserve">“what’s the issue?”</w:t>
-      </w:r>
-      <w:r>
-        <w:t xml:space="preserve"> </w:t>
-      </w:r>
-      <w:r>
-        <w:t xml:space="preserve">— the issue is that a correct, role-enforced</w:t>
-      </w:r>
-      <w:r>
-        <w:t xml:space="preserve"> </w:t>
-      </w:r>
-      <w:r>
-        <w:t xml:space="preserve">publishing tool has constraints you cannot see from the outside.</w:t>
+        <w:t xml:space="preserve">find the deep requirements by building toward them, then you adjust</w:t>
+      </w:r>
+      <w:r>
+        <w:t xml:space="preserve"> </w:t>
+      </w:r>
+      <w:r>
+        <w:t xml:space="preserve">— and here</w:t>
+      </w:r>
+      <w:r>
+        <w:t xml:space="preserve"> </w:t>
+      </w:r>
+      <w:r>
+        <w:t xml:space="preserve">the adjustment is already behind us. This single episode answers</w:t>
+      </w:r>
+      <w:r>
+        <w:t xml:space="preserve"> </w:t>
+      </w:r>
+      <w:r>
+        <w:t xml:space="preserve">“what’s the</w:t>
+      </w:r>
+      <w:r>
+        <w:t xml:space="preserve"> </w:t>
+      </w:r>
+      <w:r>
+        <w:t xml:space="preserve">issue?”</w:t>
+      </w:r>
+      <w:r>
+        <w:t xml:space="preserve"> </w:t>
+      </w:r>
+      <w:r>
+        <w:t xml:space="preserve">on its own: a correct, role-enforced publishing tool has constraints you</w:t>
+      </w:r>
+      <w:r>
+        <w:t xml:space="preserve"> </w:t>
+      </w:r>
+      <w:r>
+        <w:t xml:space="preserve">cannot see from the outside, and finding them is part of the genuine work.</w:t>
       </w:r>
     </w:p>
     <w:p>
@@ -4438,25 +5072,37 @@
         <w:t xml:space="preserve"> </w:t>
       </w:r>
       <w:r>
-        <w:t xml:space="preserve">revised mid-build from the public REST API to this contract; the auth-retarget</w:t>
-      </w:r>
-      <w:r>
-        <w:t xml:space="preserve"> </w:t>
-      </w:r>
-      <w:r>
-        <w:t xml:space="preserve">plan moves login to match. This retired the spec’s original</w:t>
-      </w:r>
-      <w:r>
-        <w:t xml:space="preserve"> </w:t>
-      </w:r>
-      <w:r>
-        <w:t xml:space="preserve">“publish via Users &amp;</w:t>
-      </w:r>
-      <w:r>
-        <w:t xml:space="preserve"> </w:t>
-      </w:r>
-      <w:r>
-        <w:t xml:space="preserve">Permissions”</w:t>
+        <w:t xml:space="preserve">revised mid-build from the public REST API to this contract; the auth retarget</w:t>
+      </w:r>
+      <w:r>
+        <w:t xml:space="preserve"> </w:t>
+      </w:r>
+      <w:r>
+        <w:t xml:space="preserve">(Phase 1.5) has since moved login to match and is merged to</w:t>
+      </w:r>
+      <w:r>
+        <w:t xml:space="preserve"> </w:t>
+      </w:r>
+      <w:r>
+        <w:rPr>
+          <w:rStyle w:val="VerbatimChar"/>
+        </w:rPr>
+        <w:t xml:space="preserve">main</w:t>
+      </w:r>
+      <w:r>
+        <w:t xml:space="preserve">. This retired</w:t>
+      </w:r>
+      <w:r>
+        <w:t xml:space="preserve"> </w:t>
+      </w:r>
+      <w:r>
+        <w:t xml:space="preserve">the spec’s original</w:t>
+      </w:r>
+      <w:r>
+        <w:t xml:space="preserve"> </w:t>
+      </w:r>
+      <w:r>
+        <w:t xml:space="preserve">“publish via Users &amp; Permissions”</w:t>
       </w:r>
       <w:r>
         <w:t xml:space="preserve"> </w:t>
@@ -6371,7 +7017,7 @@
               <w:pStyle w:val="Compact"/>
             </w:pPr>
             <w:r>
-              <w:t xml:space="preserve">Mid-build, we moved login and content access to Strapi’s admin API so your real roles enforce who-can-publish, natively, with no backend changes. (The marquee</w:t>
+              <w:t xml:space="preserve">Mid-build, we discovered — and have since shipped — a move of login and content access to Strapi’s admin API, so your real roles now enforce who-can-publish, natively, with no backend changes. (The marquee</w:t>
             </w:r>
             <w:r>
               <w:t xml:space="preserve"> </w:t>
@@ -6659,31 +7305,41 @@
         <w:t xml:space="preserve"> </w:t>
       </w:r>
       <w:r>
-        <w:t xml:space="preserve">see §2.9 and §4. The pivot retired the original</w:t>
-      </w:r>
-      <w:r>
-        <w:t xml:space="preserve"> </w:t>
-      </w:r>
-      <w:r>
-        <w:t xml:space="preserve">spec §4.1</w:t>
-      </w:r>
-      <w:r>
-        <w:t xml:space="preserve"> </w:t>
-      </w:r>
-      <w:r>
-        <w:t xml:space="preserve">“publish via Users &amp; Permissions”</w:t>
-      </w:r>
-      <w:r>
-        <w:t xml:space="preserve"> </w:t>
-      </w:r>
-      <w:r>
-        <w:t xml:space="preserve">open item; publish-gating is now</w:t>
-      </w:r>
-      <w:r>
-        <w:t xml:space="preserve"> </w:t>
-      </w:r>
-      <w:r>
-        <w:t xml:space="preserve">native (</w:t>
+        <w:t xml:space="preserve">see §2.9 and §4. The pivot is</w:t>
+      </w:r>
+      <w:r>
+        <w:t xml:space="preserve"> </w:t>
+      </w:r>
+      <w:r>
+        <w:rPr>
+          <w:b/>
+          <w:bCs/>
+        </w:rPr>
+        <w:t xml:space="preserve">built and merged</w:t>
+      </w:r>
+      <w:r>
+        <w:t xml:space="preserve"> </w:t>
+      </w:r>
+      <w:r>
+        <w:t xml:space="preserve">(Phase 1.5) and retired the original spec §4.1</w:t>
+      </w:r>
+      <w:r>
+        <w:t xml:space="preserve"> </w:t>
+      </w:r>
+      <w:r>
+        <w:t xml:space="preserve">“publish via Users &amp;</w:t>
+      </w:r>
+      <w:r>
+        <w:t xml:space="preserve"> </w:t>
+      </w:r>
+      <w:r>
+        <w:t xml:space="preserve">Permissions”</w:t>
+      </w:r>
+      <w:r>
+        <w:t xml:space="preserve"> </w:t>
+      </w:r>
+      <w:r>
+        <w:t xml:space="preserve">open item; publish-gating is now native (</w:t>
       </w:r>
       <w:r>
         <w:rPr>
@@ -7238,13 +7894,25 @@
                 <w:b/>
                 <w:bCs/>
               </w:rPr>
-              <w:t xml:space="preserve">Planned</w:t>
+              <w:t xml:space="preserve">Built</w:t>
             </w:r>
             <w:r>
               <w:t xml:space="preserve"> </w:t>
             </w:r>
             <w:r>
-              <w:t xml:space="preserve">(plan written)</w:t>
+              <w:t xml:space="preserve">(merged to</w:t>
+            </w:r>
+            <w:r>
+              <w:t xml:space="preserve"> </w:t>
+            </w:r>
+            <w:r>
+              <w:rPr>
+                <w:rStyle w:val="VerbatimChar"/>
+              </w:rPr>
+              <w:t xml:space="preserve">main</w:t>
+            </w:r>
+            <w:r>
+              <w:t xml:space="preserve">)</w:t>
             </w:r>
           </w:p>
         </w:tc>
@@ -7925,23 +8593,44 @@
         <w:t xml:space="preserve">/api/auth/local</w:t>
       </w:r>
       <w:r>
-        <w:t xml:space="preserve">); Phase 1.5 retargets it to the admin API</w:t>
-      </w:r>
-      <w:r>
-        <w:t xml:space="preserve"> </w:t>
-      </w:r>
-      <w:r>
-        <w:t xml:space="preserve">(see below) — that retarget is the reason this phase, though built, is revised</w:t>
-      </w:r>
-      <w:r>
-        <w:t xml:space="preserve"> </w:t>
-      </w:r>
-      <w:r>
-        <w:t xml:space="preserve">rather than final.</w:t>
+        <w:t xml:space="preserve">); Phase 1.5 has since retargeted it to the</w:t>
+      </w:r>
+      <w:r>
+        <w:t xml:space="preserve"> </w:t>
+      </w:r>
+      <w:r>
+        <w:t xml:space="preserve">admin API (see below) and is also merged — so the login in</w:t>
+      </w:r>
+      <w:r>
+        <w:t xml:space="preserve"> </w:t>
+      </w:r>
+      <w:r>
+        <w:rPr>
+          <w:rStyle w:val="VerbatimChar"/>
+        </w:rPr>
+        <w:t xml:space="preserve">main</w:t>
+      </w:r>
+      <w:r>
+        <w:t xml:space="preserve"> </w:t>
+      </w:r>
+      <w:r>
+        <w:t xml:space="preserve">today is the</w:t>
+      </w:r>
+      <w:r>
+        <w:t xml:space="preserve"> </w:t>
+      </w:r>
+      <w:r>
+        <w:t xml:space="preserve">admin-API version. Phase 1’s structure (pure functions + thin wiring) carried</w:t>
+      </w:r>
+      <w:r>
+        <w:t xml:space="preserve"> </w:t>
+      </w:r>
+      <w:r>
+        <w:t xml:space="preserve">through the retarget unchanged; only the endpoints and the role model moved.</w:t>
       </w:r>
     </w:p>
     <w:bookmarkEnd w:id="26"/>
-    <w:bookmarkStart w:id="27" w:name="Xd45e86df3c7ba42dddfc8869eaebe833b71194d"/>
+    <w:bookmarkStart w:id="27" w:name="Xf3bfcf05873cd52c49629f56295de2fe53161cc"/>
     <w:p>
       <w:pPr>
         <w:pStyle w:val="Heading3"/>
@@ -7957,7 +8646,29 @@
           <w:b/>
           <w:bCs/>
         </w:rPr>
-        <w:t xml:space="preserve">PLANNED (plan written)</w:t>
+        <w:t xml:space="preserve">BUILT (merged to</w:t>
+      </w:r>
+      <w:r>
+        <w:rPr>
+          <w:b/>
+          <w:bCs/>
+        </w:rPr>
+        <w:t xml:space="preserve"> </w:t>
+      </w:r>
+      <w:r>
+        <w:rPr>
+          <w:rStyle w:val="VerbatimChar"/>
+          <w:b/>
+          <w:bCs/>
+        </w:rPr>
+        <w:t xml:space="preserve">main</w:t>
+      </w:r>
+      <w:r>
+        <w:rPr>
+          <w:b/>
+          <w:bCs/>
+        </w:rPr>
+        <w:t xml:space="preserve">)</w:t>
       </w:r>
     </w:p>
     <w:p>
@@ -8024,13 +8735,41 @@
         <w:t xml:space="preserve"> </w:t>
       </w:r>
       <w:r>
-        <w:t xml:space="preserve">Admin and Editor can publish; Author cannot. This is a small, surgical fix, not a</w:t>
-      </w:r>
-      <w:r>
-        <w:t xml:space="preserve"> </w:t>
-      </w:r>
-      <w:r>
-        <w:t xml:space="preserve">redo: nothing about the content, the zero-base64 rule, or the design changes.</w:t>
+        <w:t xml:space="preserve">Admin and Editor can publish; Author cannot. This was a small, surgical fix, not a</w:t>
+      </w:r>
+      <w:r>
+        <w:t xml:space="preserve"> </w:t>
+      </w:r>
+      <w:r>
+        <w:t xml:space="preserve">redo: nothing about the content, the zero-base64 rule, or the design changed.</w:t>
+      </w:r>
+      <w:r>
+        <w:t xml:space="preserve"> </w:t>
+      </w:r>
+      <w:r>
+        <w:rPr>
+          <w:b/>
+          <w:bCs/>
+        </w:rPr>
+        <w:t xml:space="preserve">What it delivered:</w:t>
+      </w:r>
+      <w:r>
+        <w:t xml:space="preserve"> </w:t>
+      </w:r>
+      <w:r>
+        <w:t xml:space="preserve">the tool now authenticates against the real admin system</w:t>
+      </w:r>
+      <w:r>
+        <w:t xml:space="preserve"> </w:t>
+      </w:r>
+      <w:r>
+        <w:t xml:space="preserve">and reads each person’s actual role from it, which is what unblocks live</w:t>
+      </w:r>
+      <w:r>
+        <w:t xml:space="preserve"> </w:t>
+      </w:r>
+      <w:r>
+        <w:t xml:space="preserve">Content-Manager reads and writes for every phase that follows.</w:t>
       </w:r>
     </w:p>
     <w:p>
@@ -8048,7 +8787,7 @@
         <w:t xml:space="preserve"> </w:t>
       </w:r>
       <w:r>
-        <w:t xml:space="preserve">Retarget Phase 1 auth from Users &amp;</w:t>
+        <w:t xml:space="preserve">Retargeted Phase 1 auth from Users &amp;</w:t>
       </w:r>
       <w:r>
         <w:t xml:space="preserve"> </w:t>
@@ -8103,19 +8842,19 @@
         <w:t xml:space="preserve">/admin/users/me</w:t>
       </w:r>
       <w:r>
-        <w:t xml:space="preserve">). Keep Phase 1’s exact structure (pure functions + thin wiring);</w:t>
-      </w:r>
-      <w:r>
-        <w:t xml:space="preserve"> </w:t>
-      </w:r>
-      <w:r>
-        <w:t xml:space="preserve">only the endpoints, the user/role shape, and the capability getter change. Login</w:t>
-      </w:r>
-      <w:r>
-        <w:t xml:space="preserve"> </w:t>
-      </w:r>
-      <w:r>
-        <w:t xml:space="preserve">stays a two-step flow (login → fetch-me) because</w:t>
+        <w:t xml:space="preserve">). Phase 1’s exact structure (pure functions + thin wiring) was</w:t>
+      </w:r>
+      <w:r>
+        <w:t xml:space="preserve"> </w:t>
+      </w:r>
+      <w:r>
+        <w:t xml:space="preserve">kept; only the endpoints, the user/role shape, and the capability getter changed.</w:t>
+      </w:r>
+      <w:r>
+        <w:t xml:space="preserve"> </w:t>
+      </w:r>
+      <w:r>
+        <w:t xml:space="preserve">Login stays a two-step flow (login → fetch-me) because</w:t>
       </w:r>
       <w:r>
         <w:t xml:space="preserve"> </w:t>
@@ -8130,7 +8869,13 @@
         <w:t xml:space="preserve"> </w:t>
       </w:r>
       <w:r>
-        <w:t xml:space="preserve">returns an empty</w:t>
+        <w:t xml:space="preserve">returns an</w:t>
+      </w:r>
+      <w:r>
+        <w:t xml:space="preserve"> </w:t>
+      </w:r>
+      <w:r>
+        <w:t xml:space="preserve">empty</w:t>
       </w:r>
       <w:r>
         <w:t xml:space="preserve"> </w:t>
@@ -8145,7 +8890,7 @@
         <w:t xml:space="preserve"> </w:t>
       </w:r>
       <w:r>
-        <w:t xml:space="preserve">array. New:</w:t>
+        <w:t xml:space="preserve">array. Added:</w:t>
       </w:r>
       <w:r>
         <w:t xml:space="preserve"> </w:t>
@@ -8181,13 +8926,13 @@
         <w:t xml:space="preserve">AdminUser</w:t>
       </w:r>
       <w:r>
-        <w:t xml:space="preserve">, response</w:t>
-      </w:r>
-      <w:r>
-        <w:t xml:space="preserve"> </w:t>
-      </w:r>
-      <w:r>
-        <w:t xml:space="preserve">types) and</w:t>
+        <w:t xml:space="preserve">,</w:t>
+      </w:r>
+      <w:r>
+        <w:t xml:space="preserve"> </w:t>
+      </w:r>
+      <w:r>
+        <w:t xml:space="preserve">response types) and</w:t>
       </w:r>
       <w:r>
         <w:t xml:space="preserve"> </w:t>
@@ -8310,19 +9055,38 @@
         <w:t xml:space="preserve"> </w:t>
       </w:r>
       <w:r>
-        <w:t xml:space="preserve">dev bypass is preserved (mints a synthetic super-admin session).</w:t>
-      </w:r>
-      <w:r>
-        <w:t xml:space="preserve"> </w:t>
-      </w:r>
-      <w:r>
-        <w:t xml:space="preserve">Six TDD tasks, each with a commit; the Phase 1 security posture (Secure cookie,</w:t>
-      </w:r>
-      <w:r>
-        <w:t xml:space="preserve"> </w:t>
-      </w:r>
-      <w:r>
-        <w:t xml:space="preserve">boot re-verify, 401 logout) carries over unchanged.</w:t>
+        <w:t xml:space="preserve">dev bypass is preserved (mints a synthetic super-admin session)</w:t>
+      </w:r>
+      <w:r>
+        <w:t xml:space="preserve"> </w:t>
+      </w:r>
+      <w:r>
+        <w:t xml:space="preserve">and remains flagged</w:t>
+      </w:r>
+      <w:r>
+        <w:t xml:space="preserve"> </w:t>
+      </w:r>
+      <w:r>
+        <w:rPr>
+          <w:b/>
+          <w:bCs/>
+        </w:rPr>
+        <w:t xml:space="preserve">REMOVE BEFORE DEPLOY</w:t>
+      </w:r>
+      <w:r>
+        <w:t xml:space="preserve">. Six TDD tasks plus one fix commit,</w:t>
+      </w:r>
+      <w:r>
+        <w:t xml:space="preserve"> </w:t>
+      </w:r>
+      <w:r>
+        <w:t xml:space="preserve">each with a commit; the Phase 1 security posture (Secure cookie, boot re-verify,</w:t>
+      </w:r>
+      <w:r>
+        <w:t xml:space="preserve"> </w:t>
+      </w:r>
+      <w:r>
+        <w:t xml:space="preserve">401 logout) carried over unchanged.</w:t>
       </w:r>
     </w:p>
     <w:p>
@@ -8340,7 +9104,31 @@
         <w:t xml:space="preserve"> </w:t>
       </w:r>
       <w:r>
-        <w:t xml:space="preserve">This phase exists</w:t>
+        <w:t xml:space="preserve">This phase is the concrete consequence of the</w:t>
+      </w:r>
+      <w:r>
+        <w:t xml:space="preserve"> </w:t>
+      </w:r>
+      <w:r>
+        <w:t xml:space="preserve">mid-build discovery in §2.9 — the realization that staff are admin-panel users and</w:t>
+      </w:r>
+      <w:r>
+        <w:t xml:space="preserve"> </w:t>
+      </w:r>
+      <w:r>
+        <w:t xml:space="preserve">that Strapi enforces the publish rule natively at the admin level. Two things make</w:t>
+      </w:r>
+      <w:r>
+        <w:t xml:space="preserve"> </w:t>
+      </w:r>
+      <w:r>
+        <w:t xml:space="preserve">it more than a find-and-replace of one URL for another. First, the two doors don’t</w:t>
+      </w:r>
+      <w:r>
+        <w:t xml:space="preserve"> </w:t>
+      </w:r>
+      <w:r>
+        <w:t xml:space="preserve">just have different addresses; they hand back differently</w:t>
       </w:r>
       <w:r>
         <w:t xml:space="preserve"> </w:t>
@@ -8350,43 +9138,73 @@
           <w:i/>
           <w:iCs/>
         </w:rPr>
-        <w:t xml:space="preserve">because</w:t>
-      </w:r>
-      <w:r>
-        <w:t xml:space="preserve"> </w:t>
-      </w:r>
-      <w:r>
-        <w:t xml:space="preserve">of the mid-build</w:t>
-      </w:r>
-      <w:r>
-        <w:t xml:space="preserve"> </w:t>
-      </w:r>
-      <w:r>
-        <w:t xml:space="preserve">discovery in §2.9 — it is the concrete consequence of learning that staff are</w:t>
-      </w:r>
-      <w:r>
-        <w:t xml:space="preserve"> </w:t>
-      </w:r>
-      <w:r>
-        <w:t xml:space="preserve">admin-panel users and that Strapi enforces the publish rule natively at the admin</w:t>
-      </w:r>
-      <w:r>
-        <w:t xml:space="preserve"> </w:t>
-      </w:r>
-      <w:r>
-        <w:t xml:space="preserve">level. It is the unlock for live Content-Manager reads and writes. The fact that</w:t>
-      </w:r>
-      <w:r>
-        <w:t xml:space="preserve"> </w:t>
-      </w:r>
-      <w:r>
-        <w:t xml:space="preserve">it is small and surgical is precisely because the discovery was captured cleanly</w:t>
-      </w:r>
-      <w:r>
-        <w:t xml:space="preserve"> </w:t>
-      </w:r>
-      <w:r>
-        <w:t xml:space="preserve">and the original code was structured for change.</w:t>
+        <w:t xml:space="preserve">shaped</w:t>
+      </w:r>
+      <w:r>
+        <w:t xml:space="preserve"> </w:t>
+      </w:r>
+      <w:r>
+        <w:t xml:space="preserve">answers — the</w:t>
+      </w:r>
+      <w:r>
+        <w:t xml:space="preserve"> </w:t>
+      </w:r>
+      <w:r>
+        <w:t xml:space="preserve">admin login returns no roles at all until you ask a second time, roles arrive as</w:t>
+      </w:r>
+      <w:r>
+        <w:t xml:space="preserve"> </w:t>
+      </w:r>
+      <w:r>
+        <w:t xml:space="preserve">machine codes rather than display names, and the whole notion of</w:t>
+      </w:r>
+      <w:r>
+        <w:t xml:space="preserve"> </w:t>
+      </w:r>
+      <w:r>
+        <w:t xml:space="preserve">“what this person</w:t>
+      </w:r>
+      <w:r>
+        <w:t xml:space="preserve"> </w:t>
+      </w:r>
+      <w:r>
+        <w:t xml:space="preserve">may do”</w:t>
+      </w:r>
+      <w:r>
+        <w:t xml:space="preserve"> </w:t>
+      </w:r>
+      <w:r>
+        <w:t xml:space="preserve">has to be recomputed from that new shape and kept consistent everywhere it</w:t>
+      </w:r>
+      <w:r>
+        <w:t xml:space="preserve"> </w:t>
+      </w:r>
+      <w:r>
+        <w:t xml:space="preserve">is consulted. Second, this is the load-bearing change for everything downstream:</w:t>
+      </w:r>
+      <w:r>
+        <w:t xml:space="preserve"> </w:t>
+      </w:r>
+      <w:r>
+        <w:t xml:space="preserve">nothing can safely read or write live content until the login hands back the right</w:t>
+      </w:r>
+      <w:r>
+        <w:t xml:space="preserve"> </w:t>
+      </w:r>
+      <w:r>
+        <w:t xml:space="preserve">kind of credential, so it had to be correct, not merely working. That it landed</w:t>
+      </w:r>
+      <w:r>
+        <w:t xml:space="preserve"> </w:t>
+      </w:r>
+      <w:r>
+        <w:t xml:space="preserve">small and surgical is the dividend of capturing the discovery cleanly and having</w:t>
+      </w:r>
+      <w:r>
+        <w:t xml:space="preserve"> </w:t>
+      </w:r>
+      <w:r>
+        <w:t xml:space="preserve">structured the original code so only the door needed to move.</w:t>
       </w:r>
     </w:p>
     <w:p>
@@ -8404,13 +9222,79 @@
         <w:t xml:space="preserve"> </w:t>
       </w:r>
       <w:r>
-        <w:t xml:space="preserve">Plan written</w:t>
-      </w:r>
-      <w:r>
-        <w:t xml:space="preserve"> </w:t>
-      </w:r>
-      <w:r>
-        <w:t xml:space="preserve">(</w:t>
+        <w:t xml:space="preserve">Built, tested, and merged to</w:t>
+      </w:r>
+      <w:r>
+        <w:t xml:space="preserve"> </w:t>
+      </w:r>
+      <w:r>
+        <w:rPr>
+          <w:rStyle w:val="VerbatimChar"/>
+        </w:rPr>
+        <w:t xml:space="preserve">main</w:t>
+      </w:r>
+      <w:r>
+        <w:t xml:space="preserve"> </w:t>
+      </w:r>
+      <w:r>
+        <w:t xml:space="preserve">— six TDD tasks</w:t>
+      </w:r>
+      <w:r>
+        <w:t xml:space="preserve"> </w:t>
+      </w:r>
+      <w:r>
+        <w:t xml:space="preserve">plus one fix commit;</w:t>
+      </w:r>
+      <w:r>
+        <w:t xml:space="preserve"> </w:t>
+      </w:r>
+      <w:r>
+        <w:rPr>
+          <w:b/>
+          <w:bCs/>
+        </w:rPr>
+        <w:t xml:space="preserve">84 automated tests passing,</w:t>
+      </w:r>
+      <w:r>
+        <w:rPr>
+          <w:b/>
+          <w:bCs/>
+        </w:rPr>
+        <w:t xml:space="preserve"> </w:t>
+      </w:r>
+      <w:r>
+        <w:rPr>
+          <w:rStyle w:val="VerbatimChar"/>
+          <w:b/>
+          <w:bCs/>
+        </w:rPr>
+        <w:t xml:space="preserve">nuxt typecheck</w:t>
+      </w:r>
+      <w:r>
+        <w:rPr>
+          <w:b/>
+          <w:bCs/>
+        </w:rPr>
+        <w:t xml:space="preserve"> </w:t>
+      </w:r>
+      <w:r>
+        <w:rPr>
+          <w:b/>
+          <w:bCs/>
+        </w:rPr>
+        <w:t xml:space="preserve">clean</w:t>
+      </w:r>
+      <w:r>
+        <w:t xml:space="preserve">.</w:t>
+      </w:r>
+      <w:r>
+        <w:t xml:space="preserve"> </w:t>
+      </w:r>
+      <w:r>
+        <w:t xml:space="preserve">Plan:</w:t>
+      </w:r>
+      <w:r>
+        <w:t xml:space="preserve"> </w:t>
       </w:r>
       <w:r>
         <w:rPr>
@@ -8419,13 +9303,13 @@
         <w:t xml:space="preserve">docs/superpowers/plans/2026-06-20-auth-admin-retarget.md</w:t>
       </w:r>
       <w:r>
-        <w:t xml:space="preserve">); not yet executed.</w:t>
-      </w:r>
-      <w:r>
-        <w:t xml:space="preserve"> </w:t>
-      </w:r>
-      <w:r>
-        <w:t xml:space="preserve">Role codes confirmed against the live instance:</w:t>
+        <w:t xml:space="preserve">. Role codes</w:t>
+      </w:r>
+      <w:r>
+        <w:t xml:space="preserve"> </w:t>
+      </w:r>
+      <w:r>
+        <w:t xml:space="preserve">confirmed against the live instance:</w:t>
       </w:r>
       <w:r>
         <w:t xml:space="preserve"> </w:t>
@@ -8467,7 +9351,59 @@
         <w:t xml:space="preserve"> </w:t>
       </w:r>
       <w:r>
-        <w:t xml:space="preserve">(drafts only).</w:t>
+        <w:t xml:space="preserve">(drafts only). The</w:t>
+      </w:r>
+      <w:r>
+        <w:t xml:space="preserve"> </w:t>
+      </w:r>
+      <w:r>
+        <w:rPr>
+          <w:rStyle w:val="VerbatimChar"/>
+        </w:rPr>
+        <w:t xml:space="preserve">admin/admin</w:t>
+      </w:r>
+      <w:r>
+        <w:t xml:space="preserve"> </w:t>
+      </w:r>
+      <w:r>
+        <w:t xml:space="preserve">dev bypass</w:t>
+      </w:r>
+      <w:r>
+        <w:t xml:space="preserve"> </w:t>
+      </w:r>
+      <w:r>
+        <w:t xml:space="preserve">remains in</w:t>
+      </w:r>
+      <w:r>
+        <w:t xml:space="preserve"> </w:t>
+      </w:r>
+      <w:r>
+        <w:rPr>
+          <w:rStyle w:val="VerbatimChar"/>
+        </w:rPr>
+        <w:t xml:space="preserve">main</w:t>
+      </w:r>
+      <w:r>
+        <w:t xml:space="preserve">, flagged</w:t>
+      </w:r>
+      <w:r>
+        <w:t xml:space="preserve"> </w:t>
+      </w:r>
+      <w:r>
+        <w:rPr>
+          <w:b/>
+          <w:bCs/>
+        </w:rPr>
+        <w:t xml:space="preserve">REMOVE BEFORE DEPLOY</w:t>
+      </w:r>
+      <w:r>
+        <w:t xml:space="preserve">. This unblocks live</w:t>
+      </w:r>
+      <w:r>
+        <w:t xml:space="preserve"> </w:t>
+      </w:r>
+      <w:r>
+        <w:t xml:space="preserve">Content-Manager reads and writes for the phases that follow.</w:t>
       </w:r>
     </w:p>
     <w:bookmarkEnd w:id="27"/>
@@ -9033,13 +9969,19 @@
         <w:t xml:space="preserve"> </w:t>
       </w:r>
       <w:r>
-        <w:t xml:space="preserve">branch deleted. Two tracked hand-offs remain for later phases: (1) wire the</w:t>
-      </w:r>
-      <w:r>
-        <w:t xml:space="preserve"> </w:t>
-      </w:r>
-      <w:r>
-        <w:t xml:space="preserve">validators /</w:t>
+        <w:t xml:space="preserve">branch deleted. Of the two hand-offs this phase logged, one is now closed: the</w:t>
+      </w:r>
+      <w:r>
+        <w:t xml:space="preserve"> </w:t>
+      </w:r>
+      <w:r>
+        <w:t xml:space="preserve">auth retarget (Phase 1.5) that Content-Manager writes depend on for the admin JWT</w:t>
+      </w:r>
+      <w:r>
+        <w:t xml:space="preserve"> </w:t>
+      </w:r>
+      <w:r>
+        <w:t xml:space="preserve">has since landed and merged. The remaining hand-off — wiring the validators /</w:t>
       </w:r>
       <w:r>
         <w:t xml:space="preserve"> </w:t>
@@ -9054,25 +9996,19 @@
         <w:t xml:space="preserve"> </w:t>
       </w:r>
       <w:r>
-        <w:t xml:space="preserve">into the live submit path when forms land; (2) the</w:t>
-      </w:r>
-      <w:r>
-        <w:t xml:space="preserve"> </w:t>
-      </w:r>
-      <w:r>
-        <w:t xml:space="preserve">auth retarget (Phase 1.5) must land before live writes, since Content-Manager</w:t>
-      </w:r>
-      <w:r>
-        <w:t xml:space="preserve"> </w:t>
-      </w:r>
-      <w:r>
-        <w:t xml:space="preserve">needs the admin JWT. Relation-write and the publish action were intentionally</w:t>
-      </w:r>
-      <w:r>
-        <w:t xml:space="preserve"> </w:t>
-      </w:r>
-      <w:r>
-        <w:t xml:space="preserve">deferred to later phases.</w:t>
+        <w:t xml:space="preserve">into the live submit path — is carried to Phase 5 when forms</w:t>
+      </w:r>
+      <w:r>
+        <w:t xml:space="preserve"> </w:t>
+      </w:r>
+      <w:r>
+        <w:t xml:space="preserve">land. Relation-write and the publish action were intentionally deferred to later</w:t>
+      </w:r>
+      <w:r>
+        <w:t xml:space="preserve"> </w:t>
+      </w:r>
+      <w:r>
+        <w:t xml:space="preserve">phases.</w:t>
       </w:r>
     </w:p>
     <w:bookmarkEnd w:id="28"/>
@@ -9290,37 +10226,129 @@
         <w:t xml:space="preserve"> </w:t>
       </w:r>
       <w:r>
-        <w:t xml:space="preserve">from §2.3 (no base64, accessibility, SVG safety, valid formats) become concrete</w:t>
-      </w:r>
-      <w:r>
-        <w:t xml:space="preserve"> </w:t>
-      </w:r>
-      <w:r>
-        <w:t xml:space="preserve">UI and upload behavior. The Strapi 5</w:t>
-      </w:r>
-      <w:r>
-        <w:t xml:space="preserve"> </w:t>
-      </w:r>
-      <w:r>
-        <w:t xml:space="preserve">“no upload at entry creation”</w:t>
-      </w:r>
-      <w:r>
-        <w:t xml:space="preserve"> </w:t>
-      </w:r>
-      <w:r>
-        <w:t xml:space="preserve">rule means</w:t>
-      </w:r>
-      <w:r>
-        <w:t xml:space="preserve"> </w:t>
-      </w:r>
-      <w:r>
-        <w:t xml:space="preserve">files must be uploaded standalone first and attached by id — a real change from</w:t>
-      </w:r>
-      <w:r>
-        <w:t xml:space="preserve"> </w:t>
-      </w:r>
-      <w:r>
-        <w:t xml:space="preserve">older patterns.</w:t>
+        <w:t xml:space="preserve">from §2.3 (no base64, accessibility, SVG safety, valid formats) stop being</w:t>
+      </w:r>
+      <w:r>
+        <w:t xml:space="preserve"> </w:t>
+      </w:r>
+      <w:r>
+        <w:t xml:space="preserve">principles and become concrete UI and upload behavior — and the four pull against</w:t>
+      </w:r>
+      <w:r>
+        <w:t xml:space="preserve"> </w:t>
+      </w:r>
+      <w:r>
+        <w:t xml:space="preserve">each other. The most natural way to show someone the image they just picked is to</w:t>
+      </w:r>
+      <w:r>
+        <w:t xml:space="preserve"> </w:t>
+      </w:r>
+      <w:r>
+        <w:t xml:space="preserve">display it straight from their own machine, which is precisely the embedded-image</w:t>
+      </w:r>
+      <w:r>
+        <w:t xml:space="preserve"> </w:t>
+      </w:r>
+      <w:r>
+        <w:t xml:space="preserve">habit the whole project bans; avoiding it means the file must travel to the shared</w:t>
+      </w:r>
+      <w:r>
+        <w:t xml:space="preserve"> </w:t>
+      </w:r>
+      <w:r>
+        <w:t xml:space="preserve">library</w:t>
+      </w:r>
+      <w:r>
+        <w:t xml:space="preserve"> </w:t>
+      </w:r>
+      <w:r>
+        <w:rPr>
+          <w:i/>
+          <w:iCs/>
+        </w:rPr>
+        <w:t xml:space="preserve">first</w:t>
+      </w:r>
+      <w:r>
+        <w:t xml:space="preserve"> </w:t>
+      </w:r>
+      <w:r>
+        <w:t xml:space="preserve">and the preview must come back from there, so the very first thing</w:t>
+      </w:r>
+      <w:r>
+        <w:t xml:space="preserve"> </w:t>
+      </w:r>
+      <w:r>
+        <w:t xml:space="preserve">that happens on</w:t>
+      </w:r>
+      <w:r>
+        <w:t xml:space="preserve"> </w:t>
+      </w:r>
+      <w:r>
+        <w:t xml:space="preserve">“choose file”</w:t>
+      </w:r>
+      <w:r>
+        <w:t xml:space="preserve"> </w:t>
+      </w:r>
+      <w:r>
+        <w:t xml:space="preserve">is a network round trip that has to succeed, fail,</w:t>
+      </w:r>
+      <w:r>
+        <w:t xml:space="preserve"> </w:t>
+      </w:r>
+      <w:r>
+        <w:t xml:space="preserve">or retry gracefully while the person waits. Layered on top is the content system’s</w:t>
+      </w:r>
+      <w:r>
+        <w:t xml:space="preserve"> </w:t>
+      </w:r>
+      <w:r>
+        <w:t xml:space="preserve">own rule that a file can’t be attached while a record is being created — it must be</w:t>
+      </w:r>
+      <w:r>
+        <w:t xml:space="preserve"> </w:t>
+      </w:r>
+      <w:r>
+        <w:t xml:space="preserve">uploaded on its own and then linked by reference — which inverts the order older</w:t>
+      </w:r>
+      <w:r>
+        <w:t xml:space="preserve"> </w:t>
+      </w:r>
+      <w:r>
+        <w:t xml:space="preserve">tools used and means the upload and the record-save are two separate moments that</w:t>
+      </w:r>
+      <w:r>
+        <w:t xml:space="preserve"> </w:t>
+      </w:r>
+      <w:r>
+        <w:t xml:space="preserve">have to be sequenced correctly. And the SVG-cleaning step sits in the middle of</w:t>
+      </w:r>
+      <w:r>
+        <w:t xml:space="preserve"> </w:t>
+      </w:r>
+      <w:r>
+        <w:t xml:space="preserve">all of it, because a dangerous file has to be defused</w:t>
+      </w:r>
+      <w:r>
+        <w:t xml:space="preserve"> </w:t>
+      </w:r>
+      <w:r>
+        <w:rPr>
+          <w:i/>
+          <w:iCs/>
+        </w:rPr>
+        <w:t xml:space="preserve">before</w:t>
+      </w:r>
+      <w:r>
+        <w:t xml:space="preserve"> </w:t>
+      </w:r>
+      <w:r>
+        <w:t xml:space="preserve">it is stored, not</w:t>
+      </w:r>
+      <w:r>
+        <w:t xml:space="preserve"> </w:t>
+      </w:r>
+      <w:r>
+        <w:t xml:space="preserve">after.</w:t>
       </w:r>
     </w:p>
     <w:bookmarkEnd w:id="29"/>
@@ -9506,43 +10534,97 @@
         <w:t xml:space="preserve"> </w:t>
       </w:r>
       <w:r>
-        <w:t xml:space="preserve">Reusing an existing editor as a layer (rather than</w:t>
-      </w:r>
-      <w:r>
-        <w:t xml:space="preserve"> </w:t>
-      </w:r>
-      <w:r>
-        <w:t xml:space="preserve">rebuilding one) is the efficient choice, but it still requires extracting it</w:t>
-      </w:r>
-      <w:r>
-        <w:t xml:space="preserve"> </w:t>
-      </w:r>
-      <w:r>
-        <w:t xml:space="preserve">cleanly, adding the missing image capability, and matching the public renderer so</w:t>
-      </w:r>
-      <w:r>
-        <w:t xml:space="preserve"> </w:t>
-      </w:r>
-      <w:r>
-        <w:t xml:space="preserve">the preview is faithful. The §2.4</w:t>
-      </w:r>
-      <w:r>
-        <w:t xml:space="preserve"> </w:t>
-      </w:r>
-      <w:r>
-        <w:t xml:space="preserve">“friendly experience”</w:t>
-      </w:r>
-      <w:r>
-        <w:t xml:space="preserve"> </w:t>
-      </w:r>
-      <w:r>
-        <w:t xml:space="preserve">expectation is delivered</w:t>
-      </w:r>
-      <w:r>
-        <w:t xml:space="preserve"> </w:t>
-      </w:r>
-      <w:r>
-        <w:t xml:space="preserve">here.</w:t>
+        <w:t xml:space="preserve">Reusing an existing editor rather than rebuilding one</w:t>
+      </w:r>
+      <w:r>
+        <w:t xml:space="preserve"> </w:t>
+      </w:r>
+      <w:r>
+        <w:t xml:space="preserve">is the efficient choice and avoids the years-of-work trap described in §2.4, but</w:t>
+      </w:r>
+      <w:r>
+        <w:t xml:space="preserve"> </w:t>
+      </w:r>
+      <w:r>
+        <w:t xml:space="preserve">“reuse”</w:t>
+      </w:r>
+      <w:r>
+        <w:t xml:space="preserve"> </w:t>
+      </w:r>
+      <w:r>
+        <w:t xml:space="preserve">is not the same as</w:t>
+      </w:r>
+      <w:r>
+        <w:t xml:space="preserve"> </w:t>
+      </w:r>
+      <w:r>
+        <w:t xml:space="preserve">“free.”</w:t>
+      </w:r>
+      <w:r>
+        <w:t xml:space="preserve"> </w:t>
+      </w:r>
+      <w:r>
+        <w:t xml:space="preserve">The editor has to be lifted out of the project</w:t>
+      </w:r>
+      <w:r>
+        <w:t xml:space="preserve"> </w:t>
+      </w:r>
+      <w:r>
+        <w:t xml:space="preserve">it lives in today and made into a clean, shared building block that Studio can</w:t>
+      </w:r>
+      <w:r>
+        <w:t xml:space="preserve"> </w:t>
+      </w:r>
+      <w:r>
+        <w:t xml:space="preserve">pull in without dragging along the rest of that project — and then extended at a</w:t>
+      </w:r>
+      <w:r>
+        <w:t xml:space="preserve"> </w:t>
+      </w:r>
+      <w:r>
+        <w:t xml:space="preserve">seam it doesn’t currently expose, so an author dropping a picture into the middle</w:t>
+      </w:r>
+      <w:r>
+        <w:t xml:space="preserve"> </w:t>
+      </w:r>
+      <w:r>
+        <w:t xml:space="preserve">of a paragraph triggers the §2.3 upload, gets the file back from the shared</w:t>
+      </w:r>
+      <w:r>
+        <w:t xml:space="preserve"> </w:t>
+      </w:r>
+      <w:r>
+        <w:t xml:space="preserve">library, and has the correct reference inserted at exactly the cursor position.</w:t>
+      </w:r>
+      <w:r>
+        <w:t xml:space="preserve"> </w:t>
+      </w:r>
+      <w:r>
+        <w:t xml:space="preserve">The subtler half is fidelity: the editor’s own live preview and the public site</w:t>
+      </w:r>
+      <w:r>
+        <w:t xml:space="preserve"> </w:t>
+      </w:r>
+      <w:r>
+        <w:t xml:space="preserve">have to interpret the author’s text by the identical rules — footnotes, math,</w:t>
+      </w:r>
+      <w:r>
+        <w:t xml:space="preserve"> </w:t>
+      </w:r>
+      <w:r>
+        <w:t xml:space="preserve">tables — or the comfortable in-editor preview quietly stops matching what</w:t>
+      </w:r>
+      <w:r>
+        <w:t xml:space="preserve"> </w:t>
+      </w:r>
+      <w:r>
+        <w:t xml:space="preserve">publishes. Borrowing the editor saves the cost of building one; it does not remove</w:t>
+      </w:r>
+      <w:r>
+        <w:t xml:space="preserve"> </w:t>
+      </w:r>
+      <w:r>
+        <w:t xml:space="preserve">the cost of making it Studio’s.</w:t>
       </w:r>
     </w:p>
     <w:bookmarkEnd w:id="30"/>
@@ -9837,25 +10919,79 @@
         <w:t xml:space="preserve"> </w:t>
       </w:r>
       <w:r>
-        <w:t xml:space="preserve">This is where the structured-content (§2.2), exact-</w:t>
-      </w:r>
-      <w:r>
-        <w:t xml:space="preserve"> </w:t>
-      </w:r>
-      <w:r>
-        <w:t xml:space="preserve">preview (§2.5), and onboarding (§2.8) requirements all turn into real UI, and</w:t>
-      </w:r>
-      <w:r>
-        <w:t xml:space="preserve"> </w:t>
-      </w:r>
-      <w:r>
-        <w:t xml:space="preserve">where the zero-base64 guarantee finally guards live writes. It is the densest UI</w:t>
-      </w:r>
-      <w:r>
-        <w:t xml:space="preserve"> </w:t>
-      </w:r>
-      <w:r>
-        <w:t xml:space="preserve">phase.</w:t>
+        <w:t xml:space="preserve">This is the convergence point: the structured-content</w:t>
+      </w:r>
+      <w:r>
+        <w:t xml:space="preserve"> </w:t>
+      </w:r>
+      <w:r>
+        <w:t xml:space="preserve">(§2.2), exact-preview (§2.5), and onboarding (§2.8) requirements all turn into</w:t>
+      </w:r>
+      <w:r>
+        <w:t xml:space="preserve"> </w:t>
+      </w:r>
+      <w:r>
+        <w:t xml:space="preserve">real screens here, and the zero-base64 guarantee — proven by tests since Phase 2 —</w:t>
+      </w:r>
+      <w:r>
+        <w:t xml:space="preserve"> </w:t>
+      </w:r>
+      <w:r>
+        <w:t xml:space="preserve">finally stands between an author and a live save. The density is the difficulty.</w:t>
+      </w:r>
+      <w:r>
+        <w:t xml:space="preserve"> </w:t>
+      </w:r>
+      <w:r>
+        <w:t xml:space="preserve">Three content types, each with its own fields and several of them structured</w:t>
+      </w:r>
+      <w:r>
+        <w:t xml:space="preserve"> </w:t>
+      </w:r>
+      <w:r>
+        <w:t xml:space="preserve">rather than flat, become editing forms that have to read an existing record into</w:t>
+      </w:r>
+      <w:r>
+        <w:t xml:space="preserve"> </w:t>
+      </w:r>
+      <w:r>
+        <w:t xml:space="preserve">the right inputs, let a person change it, and write it back in exactly the shape</w:t>
+      </w:r>
+      <w:r>
+        <w:t xml:space="preserve"> </w:t>
+      </w:r>
+      <w:r>
+        <w:t xml:space="preserve">the content system expects — every type, every field, in both directions, with</w:t>
+      </w:r>
+      <w:r>
+        <w:t xml:space="preserve"> </w:t>
+      </w:r>
+      <w:r>
+        <w:t xml:space="preserve">mistakes caught before they reach the server rather than after. Folded into the</w:t>
+      </w:r>
+      <w:r>
+        <w:t xml:space="preserve"> </w:t>
+      </w:r>
+      <w:r>
+        <w:t xml:space="preserve">same phase are an exact-as-published preview that has to stay honest, and a</w:t>
+      </w:r>
+      <w:r>
+        <w:t xml:space="preserve"> </w:t>
+      </w:r>
+      <w:r>
+        <w:t xml:space="preserve">first-login gate that has to be genuinely closed on every route into the app.</w:t>
+      </w:r>
+      <w:r>
+        <w:t xml:space="preserve"> </w:t>
+      </w:r>
+      <w:r>
+        <w:t xml:space="preserve">Each of those is a feature on its own; this phase is where they all have to work</w:t>
+      </w:r>
+      <w:r>
+        <w:t xml:space="preserve"> </w:t>
+      </w:r>
+      <w:r>
+        <w:t xml:space="preserve">together and agree.</w:t>
       </w:r>
     </w:p>
     <w:bookmarkEnd w:id="31"/>
@@ -10061,19 +11197,86 @@
         <w:t xml:space="preserve"> </w:t>
       </w:r>
       <w:r>
-        <w:t xml:space="preserve">requirements both live here, and both involve a server-side component to keep</w:t>
-      </w:r>
-      <w:r>
-        <w:t xml:space="preserve"> </w:t>
-      </w:r>
-      <w:r>
-        <w:t xml:space="preserve">secrets off the browser and to verify authorization before firing — a small but</w:t>
-      </w:r>
-      <w:r>
-        <w:t xml:space="preserve"> </w:t>
-      </w:r>
-      <w:r>
-        <w:t xml:space="preserve">real backend surface in an otherwise client-only app.</w:t>
+        <w:t xml:space="preserve">requirements both live here, and both force this otherwise browser-only tool to</w:t>
+      </w:r>
+      <w:r>
+        <w:t xml:space="preserve"> </w:t>
+      </w:r>
+      <w:r>
+        <w:t xml:space="preserve">grow a small piece of</w:t>
+      </w:r>
+      <w:r>
+        <w:t xml:space="preserve"> </w:t>
+      </w:r>
+      <w:r>
+        <w:rPr>
+          <w:i/>
+          <w:iCs/>
+        </w:rPr>
+        <w:t xml:space="preserve">server</w:t>
+      </w:r>
+      <w:r>
+        <w:t xml:space="preserve">. The reason is the same in both cases: each one</w:t>
+      </w:r>
+      <w:r>
+        <w:t xml:space="preserve"> </w:t>
+      </w:r>
+      <w:r>
+        <w:t xml:space="preserve">depends on a secret the browser cannot be allowed to hold — the key that sends</w:t>
+      </w:r>
+      <w:r>
+        <w:t xml:space="preserve"> </w:t>
+      </w:r>
+      <w:r>
+        <w:t xml:space="preserve">mail, the address that triggers a public rebuild — and anything the browser holds,</w:t>
+      </w:r>
+      <w:r>
+        <w:t xml:space="preserve"> </w:t>
+      </w:r>
+      <w:r>
+        <w:t xml:space="preserve">a user can read. So a sliver of code has to run somewhere private, take the</w:t>
+      </w:r>
+      <w:r>
+        <w:t xml:space="preserve"> </w:t>
+      </w:r>
+      <w:r>
+        <w:t xml:space="preserve">browser’s request, confirm the person making it is actually allowed to publish,</w:t>
+      </w:r>
+      <w:r>
+        <w:t xml:space="preserve"> </w:t>
+      </w:r>
+      <w:r>
+        <w:t xml:space="preserve">and only then act. On top of that, publish is two steps in two systems (§2.7), so</w:t>
+      </w:r>
+      <w:r>
+        <w:t xml:space="preserve"> </w:t>
+      </w:r>
+      <w:r>
+        <w:t xml:space="preserve">this phase also has to handle the honest-but-awkward middle case where the content</w:t>
+      </w:r>
+      <w:r>
+        <w:t xml:space="preserve"> </w:t>
+      </w:r>
+      <w:r>
+        <w:t xml:space="preserve">goes live but the public site’s rebuild doesn’t fire — reporting it as its own</w:t>
+      </w:r>
+      <w:r>
+        <w:t xml:space="preserve"> </w:t>
+      </w:r>
+      <w:r>
+        <w:t xml:space="preserve">outcome instead of pretending the click either fully worked or fully failed.</w:t>
+      </w:r>
+      <w:r>
+        <w:t xml:space="preserve"> </w:t>
+      </w:r>
+      <w:r>
+        <w:t xml:space="preserve">Standing up even a minimal trustworthy back end inside a front-end project is a</w:t>
+      </w:r>
+      <w:r>
+        <w:t xml:space="preserve"> </w:t>
+      </w:r>
+      <w:r>
+        <w:t xml:space="preserve">real shift, not a footnote.</w:t>
       </w:r>
     </w:p>
     <w:bookmarkEnd w:id="32"/>
@@ -10255,19 +11458,95 @@
         <w:t xml:space="preserve"> </w:t>
       </w:r>
       <w:r>
-        <w:t xml:space="preserve">that separates a demo from a tool people can rely on, and they cannot</w:t>
-      </w:r>
-      <w:r>
-        <w:t xml:space="preserve"> </w:t>
-      </w:r>
-      <w:r>
-        <w:t xml:space="preserve">be bolted on at the end without intention. The sample-article demo also makes the</w:t>
-      </w:r>
-      <w:r>
-        <w:t xml:space="preserve"> </w:t>
-      </w:r>
-      <w:r>
-        <w:t xml:space="preserve">whole system’s value immediately visible to stakeholders.</w:t>
+        <w:t xml:space="preserve">that separates a demo from a tool people can rely on. Accessibility is</w:t>
+      </w:r>
+      <w:r>
+        <w:t xml:space="preserve"> </w:t>
+      </w:r>
+      <w:r>
+        <w:t xml:space="preserve">not a coat of paint applied at the end: making the manager queue and the authoring</w:t>
+      </w:r>
+      <w:r>
+        <w:t xml:space="preserve"> </w:t>
+      </w:r>
+      <w:r>
+        <w:t xml:space="preserve">forms genuinely usable by keyboard alone and by a screen reader means the order</w:t>
+      </w:r>
+      <w:r>
+        <w:t xml:space="preserve"> </w:t>
+      </w:r>
+      <w:r>
+        <w:t xml:space="preserve">elements receive focus, the way controls announce themselves, and the handling of</w:t>
+      </w:r>
+      <w:r>
+        <w:t xml:space="preserve"> </w:t>
+      </w:r>
+      <w:r>
+        <w:t xml:space="preserve">every interactive piece all have to be right — work that is far cheaper when it is</w:t>
+      </w:r>
+      <w:r>
+        <w:t xml:space="preserve"> </w:t>
+      </w:r>
+      <w:r>
+        <w:t xml:space="preserve">designed in than when it is retrofitted, which is why it gets its own deliberate</w:t>
+      </w:r>
+      <w:r>
+        <w:t xml:space="preserve"> </w:t>
+      </w:r>
+      <w:r>
+        <w:t xml:space="preserve">pass rather than being assumed. Error handling is the same kind of unglamorous</w:t>
+      </w:r>
+      <w:r>
+        <w:t xml:space="preserve"> </w:t>
+      </w:r>
+      <w:r>
+        <w:t xml:space="preserve">substance: a tool people trust is one that fails</w:t>
+      </w:r>
+      <w:r>
+        <w:t xml:space="preserve"> </w:t>
+      </w:r>
+      <w:r>
+        <w:rPr>
+          <w:i/>
+          <w:iCs/>
+        </w:rPr>
+        <w:t xml:space="preserve">legibly</w:t>
+      </w:r>
+      <w:r>
+        <w:t xml:space="preserve"> </w:t>
+      </w:r>
+      <w:r>
+        <w:t xml:space="preserve">— every way a save, an</w:t>
+      </w:r>
+      <w:r>
+        <w:t xml:space="preserve"> </w:t>
+      </w:r>
+      <w:r>
+        <w:t xml:space="preserve">upload, or a publish can go wrong has to surface as a clear message a non-technical</w:t>
+      </w:r>
+      <w:r>
+        <w:t xml:space="preserve"> </w:t>
+      </w:r>
+      <w:r>
+        <w:t xml:space="preserve">author can act on, instead of a dead end. The sample-article demo, meanwhile, does</w:t>
+      </w:r>
+      <w:r>
+        <w:t xml:space="preserve"> </w:t>
+      </w:r>
+      <w:r>
+        <w:t xml:space="preserve">quiet double duty: it exercises the entire pipeline end to end with real</w:t>
+      </w:r>
+      <w:r>
+        <w:t xml:space="preserve"> </w:t>
+      </w:r>
+      <w:r>
+        <w:t xml:space="preserve">library images and every field populated, which is both a convincing thing to show</w:t>
+      </w:r>
+      <w:r>
+        <w:t xml:space="preserve"> </w:t>
+      </w:r>
+      <w:r>
+        <w:t xml:space="preserve">a stakeholder and a stringent test that the whole system actually holds together.</w:t>
       </w:r>
     </w:p>
     <w:p>
@@ -10791,7 +12070,7 @@
               <w:pStyle w:val="Compact"/>
             </w:pPr>
             <w:r>
-              <w:t xml:space="preserve">Built and merged; revised by the auth retarget</w:t>
+              <w:t xml:space="preserve">Built and merged; updated by the auth retarget</w:t>
             </w:r>
           </w:p>
         </w:tc>
@@ -10805,6 +12084,132 @@
             </w:pPr>
             <w:r>
               <w:t xml:space="preserve">Auth retarget (real Strapi roles)</w:t>
+            </w:r>
+          </w:p>
+        </w:tc>
+        <w:tc>
+          <w:tcPr/>
+          <w:p>
+            <w:pPr>
+              <w:pStyle w:val="Compact"/>
+            </w:pPr>
+            <w:r>
+              <w:rPr>
+                <w:b/>
+                <w:bCs/>
+              </w:rPr>
+              <w:t xml:space="preserve">Done</w:t>
+            </w:r>
+          </w:p>
+        </w:tc>
+        <w:tc>
+          <w:tcPr/>
+          <w:p>
+            <w:pPr>
+              <w:pStyle w:val="Compact"/>
+            </w:pPr>
+            <w:r>
+              <w:t xml:space="preserve">Built, 84 tests passing, typecheck clean, merged to</w:t>
+            </w:r>
+            <w:r>
+              <w:t xml:space="preserve"> </w:t>
+            </w:r>
+            <w:r>
+              <w:rPr>
+                <w:rStyle w:val="VerbatimChar"/>
+              </w:rPr>
+              <w:t xml:space="preserve">main</w:t>
+            </w:r>
+          </w:p>
+        </w:tc>
+      </w:tr>
+      <w:tr>
+        <w:tc>
+          <w:tcPr/>
+          <w:p>
+            <w:pPr>
+              <w:pStyle w:val="Compact"/>
+            </w:pPr>
+            <w:r>
+              <w:t xml:space="preserve">Content engine (read/save 3 types)</w:t>
+            </w:r>
+          </w:p>
+        </w:tc>
+        <w:tc>
+          <w:tcPr/>
+          <w:p>
+            <w:pPr>
+              <w:pStyle w:val="Compact"/>
+            </w:pPr>
+            <w:r>
+              <w:rPr>
+                <w:b/>
+                <w:bCs/>
+              </w:rPr>
+              <w:t xml:space="preserve">Done</w:t>
+            </w:r>
+          </w:p>
+        </w:tc>
+        <w:tc>
+          <w:tcPr/>
+          <w:p>
+            <w:pPr>
+              <w:pStyle w:val="Compact"/>
+            </w:pPr>
+            <w:r>
+              <w:t xml:space="preserve">81 automated tests, typecheck clean, merged</w:t>
+            </w:r>
+          </w:p>
+        </w:tc>
+      </w:tr>
+      <w:tr>
+        <w:tc>
+          <w:tcPr/>
+          <w:p>
+            <w:pPr>
+              <w:pStyle w:val="Compact"/>
+            </w:pPr>
+            <w:r>
+              <w:t xml:space="preserve">Zero-base64 guarantee</w:t>
+            </w:r>
+          </w:p>
+        </w:tc>
+        <w:tc>
+          <w:tcPr/>
+          <w:p>
+            <w:pPr>
+              <w:pStyle w:val="Compact"/>
+            </w:pPr>
+            <w:r>
+              <w:rPr>
+                <w:b/>
+                <w:bCs/>
+              </w:rPr>
+              <w:t xml:space="preserve">Done (enforced by tests)</w:t>
+            </w:r>
+          </w:p>
+        </w:tc>
+        <w:tc>
+          <w:tcPr/>
+          <w:p>
+            <w:pPr>
+              <w:pStyle w:val="Compact"/>
+            </w:pPr>
+            <w:r>
+              <w:t xml:space="preserve">Wires into live forms in Phase 5</w:t>
+            </w:r>
+          </w:p>
+        </w:tc>
+      </w:tr>
+      <w:tr>
+        <w:tc>
+          <w:tcPr/>
+          <w:p>
+            <w:pPr>
+              <w:pStyle w:val="Compact"/>
+            </w:pPr>
+            <w:r>
+              <w:t xml:space="preserve">Media &amp; images (library, alt, SVG safety)</w:t>
             </w:r>
           </w:p>
         </w:tc>
@@ -10830,7 +12235,7 @@
               <w:pStyle w:val="Compact"/>
             </w:pPr>
             <w:r>
-              <w:t xml:space="preserve">Plan written; small, surgical</w:t>
+              <w:t xml:space="preserve">—</w:t>
             </w:r>
           </w:p>
         </w:tc>
@@ -10843,85 +12248,7 @@
               <w:pStyle w:val="Compact"/>
             </w:pPr>
             <w:r>
-              <w:t xml:space="preserve">Content engine (read/save 3 types)</w:t>
-            </w:r>
-          </w:p>
-        </w:tc>
-        <w:tc>
-          <w:tcPr/>
-          <w:p>
-            <w:pPr>
-              <w:pStyle w:val="Compact"/>
-            </w:pPr>
-            <w:r>
-              <w:rPr>
-                <w:b/>
-                <w:bCs/>
-              </w:rPr>
-              <w:t xml:space="preserve">Done</w:t>
-            </w:r>
-          </w:p>
-        </w:tc>
-        <w:tc>
-          <w:tcPr/>
-          <w:p>
-            <w:pPr>
-              <w:pStyle w:val="Compact"/>
-            </w:pPr>
-            <w:r>
-              <w:t xml:space="preserve">81 automated tests, typecheck clean, merged</w:t>
-            </w:r>
-          </w:p>
-        </w:tc>
-      </w:tr>
-      <w:tr>
-        <w:tc>
-          <w:tcPr/>
-          <w:p>
-            <w:pPr>
-              <w:pStyle w:val="Compact"/>
-            </w:pPr>
-            <w:r>
-              <w:t xml:space="preserve">Zero-base64 guarantee</w:t>
-            </w:r>
-          </w:p>
-        </w:tc>
-        <w:tc>
-          <w:tcPr/>
-          <w:p>
-            <w:pPr>
-              <w:pStyle w:val="Compact"/>
-            </w:pPr>
-            <w:r>
-              <w:rPr>
-                <w:b/>
-                <w:bCs/>
-              </w:rPr>
-              <w:t xml:space="preserve">Done (enforced by tests)</w:t>
-            </w:r>
-          </w:p>
-        </w:tc>
-        <w:tc>
-          <w:tcPr/>
-          <w:p>
-            <w:pPr>
-              <w:pStyle w:val="Compact"/>
-            </w:pPr>
-            <w:r>
-              <w:t xml:space="preserve">Wires into live forms in Phase 5</w:t>
-            </w:r>
-          </w:p>
-        </w:tc>
-      </w:tr>
-      <w:tr>
-        <w:tc>
-          <w:tcPr/>
-          <w:p>
-            <w:pPr>
-              <w:pStyle w:val="Compact"/>
-            </w:pPr>
-            <w:r>
-              <w:t xml:space="preserve">Media &amp; images (library, alt, SVG safety)</w:t>
+              <w:t xml:space="preserve">Authoring editor (buttons + live preview)</w:t>
             </w:r>
           </w:p>
         </w:tc>
@@ -10947,7 +12274,7 @@
               <w:pStyle w:val="Compact"/>
             </w:pPr>
             <w:r>
-              <w:t xml:space="preserve">—</w:t>
+              <w:t xml:space="preserve">Reuses ICJIA editor as a layer</w:t>
             </w:r>
           </w:p>
         </w:tc>
@@ -10960,7 +12287,7 @@
               <w:pStyle w:val="Compact"/>
             </w:pPr>
             <w:r>
-              <w:t xml:space="preserve">Authoring editor (buttons + live preview)</w:t>
+              <w:t xml:space="preserve">Screens, exact preview &amp; onboarding</w:t>
             </w:r>
           </w:p>
         </w:tc>
@@ -10986,7 +12313,7 @@
               <w:pStyle w:val="Compact"/>
             </w:pPr>
             <w:r>
-              <w:t xml:space="preserve">Reuses ICJIA editor as a layer</w:t>
+              <w:t xml:space="preserve">—</w:t>
             </w:r>
           </w:p>
         </w:tc>
@@ -10999,7 +12326,7 @@
               <w:pStyle w:val="Compact"/>
             </w:pPr>
             <w:r>
-              <w:t xml:space="preserve">Screens, exact preview &amp; onboarding</w:t>
+              <w:t xml:space="preserve">Publish + rebuild + review email</w:t>
             </w:r>
           </w:p>
         </w:tc>
@@ -11025,7 +12352,7 @@
               <w:pStyle w:val="Compact"/>
             </w:pPr>
             <w:r>
-              <w:t xml:space="preserve">—</w:t>
+              <w:t xml:space="preserve">Needs build-hook URL + Mailgun key</w:t>
             </w:r>
           </w:p>
         </w:tc>
@@ -11038,7 +12365,7 @@
               <w:pStyle w:val="Compact"/>
             </w:pPr>
             <w:r>
-              <w:t xml:space="preserve">Publish + rebuild + review email</w:t>
+              <w:t xml:space="preserve">Polish, accessibility &amp; launch</w:t>
             </w:r>
           </w:p>
         </w:tc>
@@ -11064,45 +12391,6 @@
               <w:pStyle w:val="Compact"/>
             </w:pPr>
             <w:r>
-              <w:t xml:space="preserve">Needs build-hook URL + Mailgun key</w:t>
-            </w:r>
-          </w:p>
-        </w:tc>
-      </w:tr>
-      <w:tr>
-        <w:tc>
-          <w:tcPr/>
-          <w:p>
-            <w:pPr>
-              <w:pStyle w:val="Compact"/>
-            </w:pPr>
-            <w:r>
-              <w:t xml:space="preserve">Polish, accessibility &amp; launch</w:t>
-            </w:r>
-          </w:p>
-        </w:tc>
-        <w:tc>
-          <w:tcPr/>
-          <w:p>
-            <w:pPr>
-              <w:pStyle w:val="Compact"/>
-            </w:pPr>
-            <w:r>
-              <w:rPr>
-                <w:b/>
-                <w:bCs/>
-              </w:rPr>
-              <w:t xml:space="preserve">Planned</w:t>
-            </w:r>
-          </w:p>
-        </w:tc>
-        <w:tc>
-          <w:tcPr/>
-          <w:p>
-            <w:pPr>
-              <w:pStyle w:val="Compact"/>
-            </w:pPr>
-            <w:r>
               <w:t xml:space="preserve">Includes sample-article demo</w:t>
             </w:r>
           </w:p>
@@ -11124,13 +12412,19 @@
         <w:t xml:space="preserve"> </w:t>
       </w:r>
       <w:r>
-        <w:t xml:space="preserve">the secure front door and the content engine</w:t>
-      </w:r>
-      <w:r>
-        <w:t xml:space="preserve"> </w:t>
-      </w:r>
-      <w:r>
-        <w:t xml:space="preserve">are</w:t>
+        <w:t xml:space="preserve">the secure front door — now signing staff in</w:t>
+      </w:r>
+      <w:r>
+        <w:t xml:space="preserve"> </w:t>
+      </w:r>
+      <w:r>
+        <w:t xml:space="preserve">with their real Strapi accounts and enforcing who-can-publish by their real role —</w:t>
+      </w:r>
+      <w:r>
+        <w:t xml:space="preserve"> </w:t>
+      </w:r>
+      <w:r>
+        <w:t xml:space="preserve">and the content engine are</w:t>
       </w:r>
       <w:r>
         <w:t xml:space="preserve"> </w:t>
@@ -11143,13 +12437,13 @@
         <w:t xml:space="preserve">built and tested</w:t>
       </w:r>
       <w:r>
-        <w:t xml:space="preserve">; the screens, image handling, editor, preview,</w:t>
-      </w:r>
-      <w:r>
-        <w:t xml:space="preserve"> </w:t>
-      </w:r>
-      <w:r>
-        <w:t xml:space="preserve">publishing, and onboarding are</w:t>
+        <w:t xml:space="preserve">; the screens, image handling,</w:t>
+      </w:r>
+      <w:r>
+        <w:t xml:space="preserve"> </w:t>
+      </w:r>
+      <w:r>
+        <w:t xml:space="preserve">editor, preview, publishing, and onboarding are</w:t>
       </w:r>
       <w:r>
         <w:t xml:space="preserve"> </w:t>
@@ -11162,13 +12456,13 @@
         <w:t xml:space="preserve">designed and planned</w:t>
       </w:r>
       <w:r>
-        <w:t xml:space="preserve">, ready to build in</w:t>
-      </w:r>
-      <w:r>
-        <w:t xml:space="preserve"> </w:t>
-      </w:r>
-      <w:r>
-        <w:t xml:space="preserve">sequence.</w:t>
+        <w:t xml:space="preserve">, ready to</w:t>
+      </w:r>
+      <w:r>
+        <w:t xml:space="preserve"> </w:t>
+      </w:r>
+      <w:r>
+        <w:t xml:space="preserve">build in sequence.</w:t>
       </w:r>
     </w:p>
     <w:p>
@@ -11232,13 +12526,13 @@
         <w:t xml:space="preserve"> </w:t>
       </w:r>
       <w:r>
-        <w:t xml:space="preserve">(the public GitHub repo) — the foundation and content engine are live on GitHub.</w:t>
-      </w:r>
-      <w:r>
-        <w:t xml:space="preserve"> </w:t>
-      </w:r>
-      <w:r>
-        <w:t xml:space="preserve">Note</w:t>
+        <w:t xml:space="preserve">(the public GitHub repo) — the foundation, the admin-API auth retarget, and the</w:t>
+      </w:r>
+      <w:r>
+        <w:t xml:space="preserve"> </w:t>
+      </w:r>
+      <w:r>
+        <w:t xml:space="preserve">content engine are live on GitHub. Note</w:t>
       </w:r>
       <w:r>
         <w:t xml:space="preserve"> </w:t>
@@ -11281,13 +12575,43 @@
         <w:t xml:space="preserve">REMOVE BEFORE DEPLOY</w:t>
       </w:r>
       <w:r>
-        <w:t xml:space="preserve">. Phase 1.5 (auth retarget) is the next recommended</w:t>
-      </w:r>
-      <w:r>
-        <w:t xml:space="preserve"> </w:t>
-      </w:r>
-      <w:r>
-        <w:t xml:space="preserve">execution target, as it unblocks live Content-Manager writes.</w:t>
+        <w:t xml:space="preserve">. With the auth retarget</w:t>
+      </w:r>
+      <w:r>
+        <w:t xml:space="preserve"> </w:t>
+      </w:r>
+      <w:r>
+        <w:t xml:space="preserve">landed, Content-Manager reads and writes are unblocked;</w:t>
+      </w:r>
+      <w:r>
+        <w:t xml:space="preserve"> </w:t>
+      </w:r>
+      <w:r>
+        <w:rPr>
+          <w:b/>
+          <w:bCs/>
+        </w:rPr>
+        <w:t xml:space="preserve">Phase 3 (Media &amp;</w:t>
+      </w:r>
+      <w:r>
+        <w:rPr>
+          <w:b/>
+          <w:bCs/>
+        </w:rPr>
+        <w:t xml:space="preserve"> </w:t>
+      </w:r>
+      <w:r>
+        <w:rPr>
+          <w:b/>
+          <w:bCs/>
+        </w:rPr>
+        <w:t xml:space="preserve">Images)</w:t>
+      </w:r>
+      <w:r>
+        <w:t xml:space="preserve"> </w:t>
+      </w:r>
+      <w:r>
+        <w:t xml:space="preserve">is the next recommended execution target.</w:t>
       </w:r>
     </w:p>
     <w:p>

</xml_diff>

<commit_message>
docs: spec reflects Media phase as built (108 tests); refresh Word export
</commit_message>
<xml_diff>
--- a/docs/ICJIA-Research-Hub-Studio-2026-Design-and-Implementation-Spec.docx
+++ b/docs/ICJIA-Research-Hub-Studio-2026-Design-and-Implementation-Spec.docx
@@ -7996,7 +7996,7 @@
                 <w:b/>
                 <w:bCs/>
               </w:rPr>
-              <w:t xml:space="preserve">Planned</w:t>
+              <w:t xml:space="preserve">Built</w:t>
             </w:r>
           </w:p>
         </w:tc>
@@ -10012,7 +10012,7 @@
       </w:r>
     </w:p>
     <w:bookmarkEnd w:id="28"/>
-    <w:bookmarkStart w:id="29" w:name="phase-3-media-images-status-planned"/>
+    <w:bookmarkStart w:id="29" w:name="phase-3-media-images-status-built"/>
     <w:p>
       <w:pPr>
         <w:pStyle w:val="Heading3"/>
@@ -10028,7 +10028,7 @@
           <w:b/>
           <w:bCs/>
         </w:rPr>
-        <w:t xml:space="preserve">PLANNED</w:t>
+        <w:t xml:space="preserve">BUILT</w:t>
       </w:r>
     </w:p>
     <w:p>
@@ -10076,47 +10076,69 @@
           <w:b/>
           <w:bCs/>
         </w:rPr>
-        <w:t xml:space="preserve">For developers — technical scope.</w:t>
-      </w:r>
-      <w:r>
-        <w:t xml:space="preserve"> </w:t>
-      </w:r>
-      <w:r>
-        <w:t xml:space="preserve">An eager-upload composable (upload on</w:t>
-      </w:r>
-      <w:r>
-        <w:t xml:space="preserve"> </w:t>
-      </w:r>
-      <w:r>
-        <w:t xml:space="preserve">select/drop → store</w:t>
-      </w:r>
-      <w:r>
-        <w:t xml:space="preserve"> </w:t>
-      </w:r>
-      <w:r>
-        <w:rPr>
-          <w:rStyle w:val="VerbatimChar"/>
-        </w:rPr>
-        <w:t xml:space="preserve">{ id, url }</w:t>
-      </w:r>
-      <w:r>
-        <w:t xml:space="preserve"> </w:t>
-      </w:r>
-      <w:r>
-        <w:t xml:space="preserve">→ preview from the returned URL, never a client</w:t>
-      </w:r>
-      <w:r>
-        <w:t xml:space="preserve"> </w:t>
-      </w:r>
-      <w:r>
-        <w:t xml:space="preserve">data URL), a reusable</w:t>
-      </w:r>
-      <w:r>
-        <w:t xml:space="preserve"> </w:t>
-      </w:r>
-      <w:r>
-        <w:rPr>
-          <w:rStyle w:val="VerbatimChar"/>
+        <w:t xml:space="preserve">What it delivered.</w:t>
+      </w:r>
+      <w:r>
+        <w:t xml:space="preserve"> </w:t>
+      </w:r>
+      <w:r>
+        <w:t xml:space="preserve">A Strapi Upload-API library (upload/list/delete via</w:t>
+      </w:r>
+      <w:r>
+        <w:t xml:space="preserve"> </w:t>
+      </w:r>
+      <w:r>
+        <w:rPr>
+          <w:rStyle w:val="VerbatimChar"/>
+        </w:rPr>
+        <w:t xml:space="preserve">POST /upload</w:t>
+      </w:r>
+      <w:r>
+        <w:t xml:space="preserve"> </w:t>
+      </w:r>
+      <w:r>
+        <w:t xml:space="preserve">+</w:t>
+      </w:r>
+      <w:r>
+        <w:t xml:space="preserve"> </w:t>
+      </w:r>
+      <w:r>
+        <w:rPr>
+          <w:rStyle w:val="VerbatimChar"/>
+        </w:rPr>
+        <w:t xml:space="preserve">GET /upload/files</w:t>
+      </w:r>
+      <w:r>
+        <w:t xml:space="preserve">), a</w:t>
+      </w:r>
+      <w:r>
+        <w:t xml:space="preserve"> </w:t>
+      </w:r>
+      <w:r>
+        <w:rPr>
+          <w:rStyle w:val="VerbatimChar"/>
+        </w:rPr>
+        <w:t xml:space="preserve">useUpload</w:t>
+      </w:r>
+      <w:r>
+        <w:t xml:space="preserve"> </w:t>
+      </w:r>
+      <w:r>
+        <w:t xml:space="preserve">composable (extension gate →</w:t>
+      </w:r>
+      <w:r>
+        <w:t xml:space="preserve"> </w:t>
+      </w:r>
+      <w:r>
+        <w:t xml:space="preserve">SVG sanitize → eager upload), a</w:t>
+      </w:r>
+      <w:r>
+        <w:t xml:space="preserve"> </w:t>
+      </w:r>
+      <w:r>
+        <w:rPr>
+          <w:b/>
+          <w:bCs/>
         </w:rPr>
         <w:t xml:space="preserve">MediaPicker</w:t>
       </w:r>
@@ -10124,25 +10146,63 @@
         <w:t xml:space="preserve"> </w:t>
       </w:r>
       <w:r>
-        <w:t xml:space="preserve">backing every media field (upload-new and</w:t>
-      </w:r>
-      <w:r>
-        <w:t xml:space="preserve"> </w:t>
-      </w:r>
-      <w:r>
-        <w:t xml:space="preserve">pick-existing via Media Library browse), per-field type/size constraints, the</w:t>
-      </w:r>
-      <w:r>
-        <w:t xml:space="preserve"> </w:t>
-      </w:r>
-      <w:r>
-        <w:t xml:space="preserve">DOMPurify SVG sanitization step before upload, the allowed-extension accept-filter</w:t>
-      </w:r>
-      <w:r>
-        <w:t xml:space="preserve"> </w:t>
-      </w:r>
-      <w:r>
-        <w:t xml:space="preserve">(</w:t>
+        <w:t xml:space="preserve">(upload-new or pick-existing,</w:t>
+      </w:r>
+      <w:r>
+        <w:t xml:space="preserve"> </w:t>
+      </w:r>
+      <w:r>
+        <w:rPr>
+          <w:b/>
+          <w:bCs/>
+        </w:rPr>
+        <w:t xml:space="preserve">alt-text required</w:t>
+      </w:r>
+      <w:r>
+        <w:t xml:space="preserve">, optional caption), and an</w:t>
+      </w:r>
+      <w:r>
+        <w:t xml:space="preserve"> </w:t>
+      </w:r>
+      <w:r>
+        <w:rPr>
+          <w:b/>
+          <w:bCs/>
+        </w:rPr>
+        <w:t xml:space="preserve">ImageDropzone</w:t>
+      </w:r>
+      <w:r>
+        <w:t xml:space="preserve"> </w:t>
+      </w:r>
+      <w:r>
+        <w:t xml:space="preserve">(drag-drop →</w:t>
+      </w:r>
+      <w:r>
+        <w:t xml:space="preserve"> </w:t>
+      </w:r>
+      <w:r>
+        <w:t xml:space="preserve">eager upload → thumbnails → click-to-insert</w:t>
+      </w:r>
+      <w:r>
+        <w:t xml:space="preserve"> </w:t>
+      </w:r>
+      <w:r>
+        <w:rPr>
+          <w:rStyle w:val="VerbatimChar"/>
+        </w:rPr>
+        <w:t xml:space="preserve">![alt](url "caption")</w:t>
+      </w:r>
+      <w:r>
+        <w:t xml:space="preserve">). An</w:t>
+      </w:r>
+      <w:r>
+        <w:t xml:space="preserve"> </w:t>
+      </w:r>
+      <w:r>
+        <w:t xml:space="preserve">image-format allowlist enforces</w:t>
+      </w:r>
+      <w:r>
+        <w:t xml:space="preserve"> </w:t>
       </w:r>
       <w:r>
         <w:rPr>
@@ -10151,58 +10211,62 @@
         <w:t xml:space="preserve">jpg/jpeg/png/svg</w:t>
       </w:r>
       <w:r>
-        <w:t xml:space="preserve">), and a lint/test guard reinforcing zero-base64. Inline</w:t>
-      </w:r>
-      <w:r>
-        <w:t xml:space="preserve"> </w:t>
-      </w:r>
-      <w:r>
-        <w:t xml:space="preserve">article figures upload to the Media Library and insert as</w:t>
-      </w:r>
-      <w:r>
-        <w:t xml:space="preserve"> </w:t>
-      </w:r>
-      <w:r>
-        <w:rPr>
-          <w:rStyle w:val="VerbatimChar"/>
-        </w:rPr>
-        <w:t xml:space="preserve">![alt](url "caption")</w:t>
-      </w:r>
-      <w:r>
-        <w:t xml:space="preserve"> </w:t>
-      </w:r>
-      <w:r>
-        <w:t xml:space="preserve">at the cursor; each insertion also appends</w:t>
-      </w:r>
-      <w:r>
-        <w:t xml:space="preserve"> </w:t>
-      </w:r>
-      <w:r>
-        <w:rPr>
-          <w:rStyle w:val="VerbatimChar"/>
-        </w:rPr>
-        <w:t xml:space="preserve">{ title, src, alt?, caption? }</w:t>
-      </w:r>
-      <w:r>
-        <w:t xml:space="preserve"> </w:t>
-      </w:r>
-      <w:r>
-        <w:t xml:space="preserve">to the</w:t>
-      </w:r>
-      <w:r>
-        <w:t xml:space="preserve"> </w:t>
-      </w:r>
-      <w:r>
-        <w:rPr>
-          <w:rStyle w:val="VerbatimChar"/>
-        </w:rPr>
-        <w:t xml:space="preserve">images</w:t>
-      </w:r>
-      <w:r>
-        <w:t xml:space="preserve"> </w:t>
-      </w:r>
-      <w:r>
-        <w:t xml:space="preserve">JSON array (URLs only).</w:t>
+        <w:t xml:space="preserve">. A cross-cutting guard test</w:t>
+      </w:r>
+      <w:r>
+        <w:t xml:space="preserve"> </w:t>
+      </w:r>
+      <w:r>
+        <w:t xml:space="preserve">confirms the</w:t>
+      </w:r>
+      <w:r>
+        <w:t xml:space="preserve"> </w:t>
+      </w:r>
+      <w:r>
+        <w:rPr>
+          <w:b/>
+          <w:bCs/>
+        </w:rPr>
+        <w:t xml:space="preserve">zero-base64 invariant</w:t>
+      </w:r>
+      <w:r>
+        <w:t xml:space="preserve">: no</w:t>
+      </w:r>
+      <w:r>
+        <w:t xml:space="preserve"> </w:t>
+      </w:r>
+      <w:r>
+        <w:rPr>
+          <w:rStyle w:val="VerbatimChar"/>
+        </w:rPr>
+        <w:t xml:space="preserve">data:</w:t>
+      </w:r>
+      <w:r>
+        <w:t xml:space="preserve"> </w:t>
+      </w:r>
+      <w:r>
+        <w:t xml:space="preserve">URL ever enters state. All</w:t>
+      </w:r>
+      <w:r>
+        <w:t xml:space="preserve"> </w:t>
+      </w:r>
+      <w:r>
+        <w:t xml:space="preserve">shipped to</w:t>
+      </w:r>
+      <w:r>
+        <w:t xml:space="preserve"> </w:t>
+      </w:r>
+      <w:r>
+        <w:rPr>
+          <w:rStyle w:val="VerbatimChar"/>
+        </w:rPr>
+        <w:t xml:space="preserve">main</w:t>
+      </w:r>
+      <w:r>
+        <w:t xml:space="preserve"> </w:t>
+      </w:r>
+      <w:r>
+        <w:t xml:space="preserve">and pushed.</w:t>
       </w:r>
     </w:p>
     <w:p>
@@ -10214,6 +10278,241 @@
           <w:b/>
           <w:bCs/>
         </w:rPr>
+        <w:t xml:space="preserve">For developers — technical scope.</w:t>
+      </w:r>
+      <w:r>
+        <w:t xml:space="preserve"> </w:t>
+      </w:r>
+      <w:r>
+        <w:t xml:space="preserve">An eager-upload composable (upload on</w:t>
+      </w:r>
+      <w:r>
+        <w:t xml:space="preserve"> </w:t>
+      </w:r>
+      <w:r>
+        <w:t xml:space="preserve">select/drop → store</w:t>
+      </w:r>
+      <w:r>
+        <w:t xml:space="preserve"> </w:t>
+      </w:r>
+      <w:r>
+        <w:rPr>
+          <w:rStyle w:val="VerbatimChar"/>
+        </w:rPr>
+        <w:t xml:space="preserve">{ id, url }</w:t>
+      </w:r>
+      <w:r>
+        <w:t xml:space="preserve"> </w:t>
+      </w:r>
+      <w:r>
+        <w:t xml:space="preserve">→ preview from the returned URL, never a client</w:t>
+      </w:r>
+      <w:r>
+        <w:t xml:space="preserve"> </w:t>
+      </w:r>
+      <w:r>
+        <w:t xml:space="preserve">data URL) backs a reusable</w:t>
+      </w:r>
+      <w:r>
+        <w:t xml:space="preserve"> </w:t>
+      </w:r>
+      <w:r>
+        <w:rPr>
+          <w:rStyle w:val="VerbatimChar"/>
+        </w:rPr>
+        <w:t xml:space="preserve">MediaPicker</w:t>
+      </w:r>
+      <w:r>
+        <w:t xml:space="preserve"> </w:t>
+      </w:r>
+      <w:r>
+        <w:t xml:space="preserve">for every media field (upload-new and</w:t>
+      </w:r>
+      <w:r>
+        <w:t xml:space="preserve"> </w:t>
+      </w:r>
+      <w:r>
+        <w:t xml:space="preserve">pick-existing via Media Library browse). The DOMPurify SVG sanitization step</w:t>
+      </w:r>
+      <w:r>
+        <w:t xml:space="preserve"> </w:t>
+      </w:r>
+      <w:r>
+        <w:t xml:space="preserve">(SVG profile — strips</w:t>
+      </w:r>
+      <w:r>
+        <w:t xml:space="preserve"> </w:t>
+      </w:r>
+      <w:r>
+        <w:rPr>
+          <w:rStyle w:val="VerbatimChar"/>
+        </w:rPr>
+        <w:t xml:space="preserve">&lt;script&gt;</w:t>
+      </w:r>
+      <w:r>
+        <w:t xml:space="preserve">,</w:t>
+      </w:r>
+      <w:r>
+        <w:t xml:space="preserve"> </w:t>
+      </w:r>
+      <w:r>
+        <w:rPr>
+          <w:rStyle w:val="VerbatimChar"/>
+        </w:rPr>
+        <w:t xml:space="preserve">on*</w:t>
+      </w:r>
+      <w:r>
+        <w:t xml:space="preserve"> </w:t>
+      </w:r>
+      <w:r>
+        <w:t xml:space="preserve">handlers, and external</w:t>
+      </w:r>
+      <w:r>
+        <w:t xml:space="preserve"> </w:t>
+      </w:r>
+      <w:r>
+        <w:rPr>
+          <w:rStyle w:val="VerbatimChar"/>
+        </w:rPr>
+        <w:t xml:space="preserve">xlink:href</w:t>
+      </w:r>
+      <w:r>
+        <w:t xml:space="preserve"> </w:t>
+      </w:r>
+      <w:r>
+        <w:t xml:space="preserve">across all quote styles) runs</w:t>
+      </w:r>
+      <w:r>
+        <w:t xml:space="preserve"> </w:t>
+      </w:r>
+      <w:r>
+        <w:rPr>
+          <w:b/>
+          <w:bCs/>
+        </w:rPr>
+        <w:t xml:space="preserve">before</w:t>
+      </w:r>
+      <w:r>
+        <w:t xml:space="preserve"> </w:t>
+      </w:r>
+      <w:r>
+        <w:t xml:space="preserve">upload, defusing hostile files at ingest.</w:t>
+      </w:r>
+      <w:r>
+        <w:t xml:space="preserve"> </w:t>
+      </w:r>
+      <w:r>
+        <w:t xml:space="preserve">The allowed-extension accept-filter (</w:t>
+      </w:r>
+      <w:r>
+        <w:rPr>
+          <w:rStyle w:val="VerbatimChar"/>
+        </w:rPr>
+        <w:t xml:space="preserve">jpg/jpeg/png/svg</w:t>
+      </w:r>
+      <w:r>
+        <w:t xml:space="preserve">, case-insensitive) lives in</w:t>
+      </w:r>
+      <w:r>
+        <w:t xml:space="preserve"> </w:t>
+      </w:r>
+      <w:r>
+        <w:rPr>
+          <w:rStyle w:val="VerbatimChar"/>
+        </w:rPr>
+        <w:t xml:space="preserve">lib/image-types.ts</w:t>
+      </w:r>
+      <w:r>
+        <w:t xml:space="preserve">. Inline article figures insert as</w:t>
+      </w:r>
+      <w:r>
+        <w:t xml:space="preserve"> </w:t>
+      </w:r>
+      <w:r>
+        <w:rPr>
+          <w:rStyle w:val="VerbatimChar"/>
+        </w:rPr>
+        <w:t xml:space="preserve">![alt](url "caption")</w:t>
+      </w:r>
+      <w:r>
+        <w:t xml:space="preserve"> </w:t>
+      </w:r>
+      <w:r>
+        <w:t xml:space="preserve">at the cursor and append</w:t>
+      </w:r>
+      <w:r>
+        <w:t xml:space="preserve"> </w:t>
+      </w:r>
+      <w:r>
+        <w:rPr>
+          <w:rStyle w:val="VerbatimChar"/>
+        </w:rPr>
+        <w:t xml:space="preserve">{ title, src, alt?, caption? }</w:t>
+      </w:r>
+      <w:r>
+        <w:t xml:space="preserve"> </w:t>
+      </w:r>
+      <w:r>
+        <w:t xml:space="preserve">to the</w:t>
+      </w:r>
+      <w:r>
+        <w:t xml:space="preserve"> </w:t>
+      </w:r>
+      <w:r>
+        <w:rPr>
+          <w:rStyle w:val="VerbatimChar"/>
+        </w:rPr>
+        <w:t xml:space="preserve">images</w:t>
+      </w:r>
+      <w:r>
+        <w:t xml:space="preserve"> </w:t>
+      </w:r>
+      <w:r>
+        <w:t xml:space="preserve">JSON</w:t>
+      </w:r>
+      <w:r>
+        <w:t xml:space="preserve"> </w:t>
+      </w:r>
+      <w:r>
+        <w:t xml:space="preserve">array (URLs only). A cross-cutting guard test asserts the zero-base64 invariant</w:t>
+      </w:r>
+      <w:r>
+        <w:t xml:space="preserve"> </w:t>
+      </w:r>
+      <w:r>
+        <w:t xml:space="preserve">end-to-end (no</w:t>
+      </w:r>
+      <w:r>
+        <w:t xml:space="preserve"> </w:t>
+      </w:r>
+      <w:r>
+        <w:rPr>
+          <w:rStyle w:val="VerbatimChar"/>
+        </w:rPr>
+        <w:t xml:space="preserve">data:</w:t>
+      </w:r>
+      <w:r>
+        <w:t xml:space="preserve"> </w:t>
+      </w:r>
+      <w:r>
+        <w:t xml:space="preserve">URI can reach a write payload) — the build fails if the</w:t>
+      </w:r>
+      <w:r>
+        <w:t xml:space="preserve"> </w:t>
+      </w:r>
+      <w:r>
+        <w:t xml:space="preserve">invariant is violated.</w:t>
+      </w:r>
+    </w:p>
+    <w:p>
+      <w:pPr>
+        <w:pStyle w:val="BodyText"/>
+      </w:pPr>
+      <w:r>
+        <w:rPr>
+          <w:b/>
+          <w:bCs/>
+        </w:rPr>
         <w:t xml:space="preserve">Why this isn’t trivial.</w:t>
       </w:r>
       <w:r>
@@ -10226,13 +10525,13 @@
         <w:t xml:space="preserve"> </w:t>
       </w:r>
       <w:r>
-        <w:t xml:space="preserve">from §2.3 (no base64, accessibility, SVG safety, valid formats) stop being</w:t>
-      </w:r>
-      <w:r>
-        <w:t xml:space="preserve"> </w:t>
-      </w:r>
-      <w:r>
-        <w:t xml:space="preserve">principles and become concrete UI and upload behavior — and the four pull against</w:t>
+        <w:t xml:space="preserve">from §2.3 (no base64, accessibility, SVG safety, valid formats) stopped being</w:t>
+      </w:r>
+      <w:r>
+        <w:t xml:space="preserve"> </w:t>
+      </w:r>
+      <w:r>
+        <w:t xml:space="preserve">principles and became concrete UI and upload behavior — and the four pull against</w:t>
       </w:r>
       <w:r>
         <w:t xml:space="preserve"> </w:t>
@@ -10320,13 +10619,13 @@
         <w:t xml:space="preserve"> </w:t>
       </w:r>
       <w:r>
-        <w:t xml:space="preserve">have to be sequenced correctly. And the SVG-cleaning step sits in the middle of</w:t>
-      </w:r>
-      <w:r>
-        <w:t xml:space="preserve"> </w:t>
-      </w:r>
-      <w:r>
-        <w:t xml:space="preserve">all of it, because a dangerous file has to be defused</w:t>
+        <w:t xml:space="preserve">have to be sequenced correctly. The SVG-cleaning step sits in the middle of all of</w:t>
+      </w:r>
+      <w:r>
+        <w:t xml:space="preserve"> </w:t>
+      </w:r>
+      <w:r>
+        <w:t xml:space="preserve">it, because a dangerous file has to be defused</w:t>
       </w:r>
       <w:r>
         <w:t xml:space="preserve"> </w:t>
@@ -10342,13 +10641,115 @@
         <w:t xml:space="preserve"> </w:t>
       </w:r>
       <w:r>
-        <w:t xml:space="preserve">it is stored, not</w:t>
-      </w:r>
-      <w:r>
-        <w:t xml:space="preserve"> </w:t>
-      </w:r>
-      <w:r>
-        <w:t xml:space="preserve">after.</w:t>
+        <w:t xml:space="preserve">it is stored, not after.</w:t>
+      </w:r>
+      <w:r>
+        <w:t xml:space="preserve"> </w:t>
+      </w:r>
+      <w:r>
+        <w:t xml:space="preserve">All four requirements are now satisfied, tested, and merged.</w:t>
+      </w:r>
+    </w:p>
+    <w:p>
+      <w:pPr>
+        <w:pStyle w:val="BlockText"/>
+      </w:pPr>
+      <w:r>
+        <w:rPr>
+          <w:b/>
+          <w:bCs/>
+        </w:rPr>
+        <w:t xml:space="preserve">Status note (developer):</w:t>
+      </w:r>
+      <w:r>
+        <w:t xml:space="preserve"> </w:t>
+      </w:r>
+      <w:r>
+        <w:t xml:space="preserve">Built, reviewed, merged to</w:t>
+      </w:r>
+      <w:r>
+        <w:t xml:space="preserve"> </w:t>
+      </w:r>
+      <w:r>
+        <w:rPr>
+          <w:rStyle w:val="VerbatimChar"/>
+        </w:rPr>
+        <w:t xml:space="preserve">main</w:t>
+      </w:r>
+      <w:r>
+        <w:t xml:space="preserve">, and pushed.</w:t>
+      </w:r>
+      <w:r>
+        <w:t xml:space="preserve"> </w:t>
+      </w:r>
+      <w:r>
+        <w:rPr>
+          <w:b/>
+          <w:bCs/>
+        </w:rPr>
+        <w:t xml:space="preserve">108 automated tests passing,</w:t>
+      </w:r>
+      <w:r>
+        <w:rPr>
+          <w:b/>
+          <w:bCs/>
+        </w:rPr>
+        <w:t xml:space="preserve"> </w:t>
+      </w:r>
+      <w:r>
+        <w:rPr>
+          <w:rStyle w:val="VerbatimChar"/>
+          <w:b/>
+          <w:bCs/>
+        </w:rPr>
+        <w:t xml:space="preserve">nuxt typecheck</w:t>
+      </w:r>
+      <w:r>
+        <w:rPr>
+          <w:b/>
+          <w:bCs/>
+        </w:rPr>
+        <w:t xml:space="preserve"> </w:t>
+      </w:r>
+      <w:r>
+        <w:rPr>
+          <w:b/>
+          <w:bCs/>
+        </w:rPr>
+        <w:t xml:space="preserve">clean</w:t>
+      </w:r>
+      <w:r>
+        <w:t xml:space="preserve"> </w:t>
+      </w:r>
+      <w:r>
+        <w:t xml:space="preserve">across foundation + auth</w:t>
+      </w:r>
+      <w:r>
+        <w:t xml:space="preserve"> </w:t>
+      </w:r>
+      <w:r>
+        <w:t xml:space="preserve">+ data + media. The zero-base64 invariant is verified by a cross-cutting guard</w:t>
+      </w:r>
+      <w:r>
+        <w:t xml:space="preserve"> </w:t>
+      </w:r>
+      <w:r>
+        <w:t xml:space="preserve">test; the build fails if a</w:t>
+      </w:r>
+      <w:r>
+        <w:t xml:space="preserve"> </w:t>
+      </w:r>
+      <w:r>
+        <w:rPr>
+          <w:rStyle w:val="VerbatimChar"/>
+        </w:rPr>
+        <w:t xml:space="preserve">data:</w:t>
+      </w:r>
+      <w:r>
+        <w:t xml:space="preserve"> </w:t>
+      </w:r>
+      <w:r>
+        <w:t xml:space="preserve">URI can reach a write payload.</w:t>
       </w:r>
     </w:p>
     <w:bookmarkEnd w:id="29"/>
@@ -11952,13 +12353,19 @@
         <w:t xml:space="preserve"> </w:t>
       </w:r>
       <w:r>
-        <w:t xml:space="preserve">and captured future work. Evidence of the rigor: Phase 2 shipped 81 passing</w:t>
-      </w:r>
-      <w:r>
-        <w:t xml:space="preserve"> </w:t>
-      </w:r>
-      <w:r>
-        <w:t xml:space="preserve">tests with a clean typecheck and a clean whole-branch review.</w:t>
+        <w:t xml:space="preserve">and captured future work. Evidence of the rigor: the project now has 108 passing tests with a clean</w:t>
+      </w:r>
+      <w:r>
+        <w:t xml:space="preserve"> </w:t>
+      </w:r>
+      <w:r>
+        <w:t xml:space="preserve">typecheck across foundation + auth + data + media, and a clean whole-branch</w:t>
+      </w:r>
+      <w:r>
+        <w:t xml:space="preserve"> </w:t>
+      </w:r>
+      <w:r>
+        <w:t xml:space="preserve">review at every phase boundary.</w:t>
       </w:r>
     </w:p>
     <w:p>
@@ -12224,18 +12631,27 @@
                 <w:b/>
                 <w:bCs/>
               </w:rPr>
-              <w:t xml:space="preserve">Planned</w:t>
-            </w:r>
-          </w:p>
-        </w:tc>
-        <w:tc>
-          <w:tcPr/>
-          <w:p>
-            <w:pPr>
-              <w:pStyle w:val="Compact"/>
-            </w:pPr>
-            <w:r>
-              <w:t xml:space="preserve">—</w:t>
+              <w:t xml:space="preserve">Done</w:t>
+            </w:r>
+          </w:p>
+        </w:tc>
+        <w:tc>
+          <w:tcPr/>
+          <w:p>
+            <w:pPr>
+              <w:pStyle w:val="Compact"/>
+            </w:pPr>
+            <w:r>
+              <w:t xml:space="preserve">108 tests passing, typecheck clean, merged to</w:t>
+            </w:r>
+            <w:r>
+              <w:t xml:space="preserve"> </w:t>
+            </w:r>
+            <w:r>
+              <w:rPr>
+                <w:rStyle w:val="VerbatimChar"/>
+              </w:rPr>
+              <w:t xml:space="preserve">main</w:t>
             </w:r>
           </w:p>
         </w:tc>
@@ -12412,19 +12828,13 @@
         <w:t xml:space="preserve"> </w:t>
       </w:r>
       <w:r>
-        <w:t xml:space="preserve">the secure front door — now signing staff in</w:t>
-      </w:r>
-      <w:r>
-        <w:t xml:space="preserve"> </w:t>
-      </w:r>
-      <w:r>
-        <w:t xml:space="preserve">with their real Strapi accounts and enforcing who-can-publish by their real role —</w:t>
-      </w:r>
-      <w:r>
-        <w:t xml:space="preserve"> </w:t>
-      </w:r>
-      <w:r>
-        <w:t xml:space="preserve">and the content engine are</w:t>
+        <w:t xml:space="preserve">the secure front door, the content engine, and</w:t>
+      </w:r>
+      <w:r>
+        <w:t xml:space="preserve"> </w:t>
+      </w:r>
+      <w:r>
+        <w:t xml:space="preserve">the full media-and-images layer are</w:t>
       </w:r>
       <w:r>
         <w:t xml:space="preserve"> </w:t>
@@ -12437,13 +12847,34 @@
         <w:t xml:space="preserve">built and tested</w:t>
       </w:r>
       <w:r>
-        <w:t xml:space="preserve">; the screens, image handling,</w:t>
-      </w:r>
-      <w:r>
-        <w:t xml:space="preserve"> </w:t>
-      </w:r>
-      <w:r>
-        <w:t xml:space="preserve">editor, preview, publishing, and onboarding are</w:t>
+        <w:t xml:space="preserve"> </w:t>
+      </w:r>
+      <w:r>
+        <w:t xml:space="preserve">(108 passing tests, 4</w:t>
+      </w:r>
+      <w:r>
+        <w:t xml:space="preserve"> </w:t>
+      </w:r>
+      <w:r>
+        <w:t xml:space="preserve">phases merged to</w:t>
+      </w:r>
+      <w:r>
+        <w:t xml:space="preserve"> </w:t>
+      </w:r>
+      <w:r>
+        <w:rPr>
+          <w:rStyle w:val="VerbatimChar"/>
+        </w:rPr>
+        <w:t xml:space="preserve">main</w:t>
+      </w:r>
+      <w:r>
+        <w:t xml:space="preserve">); the authoring editor, screens, preview, publishing, and</w:t>
+      </w:r>
+      <w:r>
+        <w:t xml:space="preserve"> </w:t>
+      </w:r>
+      <w:r>
+        <w:t xml:space="preserve">onboarding are</w:t>
       </w:r>
       <w:r>
         <w:t xml:space="preserve"> </w:t>
@@ -12456,13 +12887,7 @@
         <w:t xml:space="preserve">designed and planned</w:t>
       </w:r>
       <w:r>
-        <w:t xml:space="preserve">, ready to</w:t>
-      </w:r>
-      <w:r>
-        <w:t xml:space="preserve"> </w:t>
-      </w:r>
-      <w:r>
-        <w:t xml:space="preserve">build in sequence.</w:t>
+        <w:t xml:space="preserve">, ready to build in sequence.</w:t>
       </w:r>
     </w:p>
     <w:p>
@@ -12526,13 +12951,13 @@
         <w:t xml:space="preserve"> </w:t>
       </w:r>
       <w:r>
-        <w:t xml:space="preserve">(the public GitHub repo) — the foundation, the admin-API auth retarget, and the</w:t>
-      </w:r>
-      <w:r>
-        <w:t xml:space="preserve"> </w:t>
-      </w:r>
-      <w:r>
-        <w:t xml:space="preserve">content engine are live on GitHub. Note</w:t>
+        <w:t xml:space="preserve">(the public GitHub repo) — the foundation, the admin-API auth retarget, the</w:t>
+      </w:r>
+      <w:r>
+        <w:t xml:space="preserve"> </w:t>
+      </w:r>
+      <w:r>
+        <w:t xml:space="preserve">content engine, and the media layer are all live on GitHub. Note</w:t>
       </w:r>
       <w:r>
         <w:t xml:space="preserve"> </w:t>
@@ -12547,7 +12972,13 @@
         <w:t xml:space="preserve"> </w:t>
       </w:r>
       <w:r>
-        <w:t xml:space="preserve">includes the dev-only</w:t>
+        <w:t xml:space="preserve">includes</w:t>
+      </w:r>
+      <w:r>
+        <w:t xml:space="preserve"> </w:t>
+      </w:r>
+      <w:r>
+        <w:t xml:space="preserve">the dev-only</w:t>
       </w:r>
       <w:r>
         <w:t xml:space="preserve"> </w:t>
@@ -12575,43 +13006,35 @@
         <w:t xml:space="preserve">REMOVE BEFORE DEPLOY</w:t>
       </w:r>
       <w:r>
-        <w:t xml:space="preserve">. With the auth retarget</w:t>
-      </w:r>
-      <w:r>
-        <w:t xml:space="preserve"> </w:t>
-      </w:r>
-      <w:r>
-        <w:t xml:space="preserve">landed, Content-Manager reads and writes are unblocked;</w:t>
-      </w:r>
-      <w:r>
-        <w:t xml:space="preserve"> </w:t>
-      </w:r>
-      <w:r>
-        <w:rPr>
-          <w:b/>
-          <w:bCs/>
-        </w:rPr>
-        <w:t xml:space="preserve">Phase 3 (Media &amp;</w:t>
-      </w:r>
-      <w:r>
-        <w:rPr>
-          <w:b/>
-          <w:bCs/>
-        </w:rPr>
-        <w:t xml:space="preserve"> </w:t>
-      </w:r>
-      <w:r>
-        <w:rPr>
-          <w:b/>
-          <w:bCs/>
-        </w:rPr>
-        <w:t xml:space="preserve">Images)</w:t>
-      </w:r>
-      <w:r>
-        <w:t xml:space="preserve"> </w:t>
-      </w:r>
-      <w:r>
-        <w:t xml:space="preserve">is the next recommended execution target.</w:t>
+        <w:t xml:space="preserve">. With</w:t>
+      </w:r>
+      <w:r>
+        <w:t xml:space="preserve"> </w:t>
+      </w:r>
+      <w:r>
+        <w:t xml:space="preserve">Phases 1–3 landed,</w:t>
+      </w:r>
+      <w:r>
+        <w:t xml:space="preserve"> </w:t>
+      </w:r>
+      <w:r>
+        <w:rPr>
+          <w:b/>
+          <w:bCs/>
+        </w:rPr>
+        <w:t xml:space="preserve">Phase 4 (Authoring Editor)</w:t>
+      </w:r>
+      <w:r>
+        <w:t xml:space="preserve"> </w:t>
+      </w:r>
+      <w:r>
+        <w:t xml:space="preserve">is the next recommended</w:t>
+      </w:r>
+      <w:r>
+        <w:t xml:space="preserve"> </w:t>
+      </w:r>
+      <w:r>
+        <w:t xml:space="preserve">execution target.</w:t>
       </w:r>
     </w:p>
     <w:p>

</xml_diff>

<commit_message>
docs: TL;DR — frame Hub 1.0 as a proven multi-year platform (with reach stats) that Hub 2.0 modernizes (stack + authoring) for R&A authors
</commit_message>
<xml_diff>
--- a/docs/ICJIA-Research-Hub-Studio-2026-Design-and-Implementation-Spec.docx
+++ b/docs/ICJIA-Research-Hub-Studio-2026-Design-and-Implementation-Spec.docx
@@ -504,29 +504,61 @@
           <w:b/>
           <w:bCs/>
         </w:rPr>
-        <w:t xml:space="preserve">Why it matters:</w:t>
-      </w:r>
-      <w:r>
-        <w:t xml:space="preserve"> </w:t>
-      </w:r>
-      <w:r>
-        <w:t xml:space="preserve">the Research Hub is the most-read content on the agency’s public site — roughly</w:t>
-      </w:r>
-      <w:r>
-        <w:t xml:space="preserve"> </w:t>
-      </w:r>
-      <w:r>
-        <w:rPr>
-          <w:b/>
-          <w:bCs/>
-        </w:rPr>
-        <w:t xml:space="preserve">45% of all pageviews and 57% of all visitors</w:t>
-      </w:r>
-      <w:r>
-        <w:t xml:space="preserve"> </w:t>
-      </w:r>
-      <w:r>
-        <w:t xml:space="preserve">to icjia.illinois.gov over the last six months. The Studio is the tool staff use to produce it.</w:t>
+        <w:t xml:space="preserve">A proven platform, now modernized:</w:t>
+      </w:r>
+      <w:r>
+        <w:t xml:space="preserve"> </w:t>
+      </w:r>
+      <w:r>
+        <w:t xml:space="preserve">this is not a new bet. Under</w:t>
+      </w:r>
+      <w:r>
+        <w:t xml:space="preserve"> </w:t>
+      </w:r>
+      <w:r>
+        <w:rPr>
+          <w:b/>
+          <w:bCs/>
+        </w:rPr>
+        <w:t xml:space="preserve">Hub 1.0</w:t>
+      </w:r>
+      <w:r>
+        <w:t xml:space="preserve"> </w:t>
+      </w:r>
+      <w:r>
+        <w:t xml:space="preserve">(in production since 2019), the Research Hub became the most-read content on ICJIA’s public site — about</w:t>
+      </w:r>
+      <w:r>
+        <w:t xml:space="preserve"> </w:t>
+      </w:r>
+      <w:r>
+        <w:rPr>
+          <w:b/>
+          <w:bCs/>
+        </w:rPr>
+        <w:t xml:space="preserve">45–50% of all pageviews</w:t>
+      </w:r>
+      <w:r>
+        <w:t xml:space="preserve"> </w:t>
+      </w:r>
+      <w:r>
+        <w:t xml:space="preserve">(and up to ~66% of visitors) on icjia.illinois.gov.</w:t>
+      </w:r>
+      <w:r>
+        <w:t xml:space="preserve"> </w:t>
+      </w:r>
+      <w:r>
+        <w:rPr>
+          <w:b/>
+          <w:bCs/>
+        </w:rPr>
+        <w:t xml:space="preserve">Hub 2.0</w:t>
+      </w:r>
+      <w:r>
+        <w:t xml:space="preserve"> </w:t>
+      </w:r>
+      <w:r>
+        <w:t xml:space="preserve">carries that track record forward: the same publishing mission for Research &amp; Analysis (R&amp;A) authors, rebuilt on a modern web stack and content management system, with a faster, friendlier authoring experience.</w:t>
       </w:r>
     </w:p>
     <w:p>

</xml_diff>

<commit_message>
docs: recast Research Hub reach as editorial-vs-task traffic and a durable, compounding library (zero in on the Hub); honest about grants' deadline-driven, expiring spikes
</commit_message>
<xml_diff>
--- a/docs/ICJIA-Research-Hub-Studio-2026-Design-and-Implementation-Spec.docx
+++ b/docs/ICJIA-Research-Hub-Studio-2026-Design-and-Implementation-Spec.docx
@@ -2224,50 +2224,308 @@
         <w:pStyle w:val="FirstParagraph"/>
       </w:pPr>
       <w:r>
-        <w:t xml:space="preserve">The homepage is the single most-visited page — it is the site’s front door — and</w:t>
-      </w:r>
-      <w:r>
-        <w:t xml:space="preserve"> </w:t>
-      </w:r>
-      <w:r>
-        <w:t xml:space="preserve">the grants section is a strong second. Stating that plainly is not a concession;</w:t>
-      </w:r>
-      <w:r>
-        <w:t xml:space="preserve"> </w:t>
-      </w:r>
-      <w:r>
-        <w:t xml:space="preserve">it strengthens the case. Even with the homepage and grants set alongside it, the</w:t>
-      </w:r>
-      <w:r>
-        <w:t xml:space="preserve"> </w:t>
-      </w:r>
-      <w:r>
-        <w:t xml:space="preserve">Research Hub is still the</w:t>
-      </w:r>
-      <w:r>
-        <w:t xml:space="preserve"> </w:t>
-      </w:r>
-      <w:r>
-        <w:rPr>
-          <w:b/>
-          <w:bCs/>
-        </w:rPr>
-        <w:t xml:space="preserve">largest content section by roughly 2×</w:t>
-      </w:r>
-      <w:r>
-        <w:t xml:space="preserve">, and its</w:t>
-      </w:r>
-      <w:r>
-        <w:t xml:space="preserve"> </w:t>
-      </w:r>
-      <w:r>
-        <w:t xml:space="preserve">articles are the most-read pages on the entire site after the homepage. Four of</w:t>
-      </w:r>
-      <w:r>
-        <w:t xml:space="preserve"> </w:t>
-      </w:r>
-      <w:r>
-        <w:t xml:space="preserve">the top five pages are Research Hub articles, and nine of the top twelve.</w:t>
+        <w:t xml:space="preserve">Two kinds of traffic share this site, and separating them sharpens the picture.</w:t>
+      </w:r>
+      <w:r>
+        <w:t xml:space="preserve"> </w:t>
+      </w:r>
+      <w:r>
+        <w:t xml:space="preserve">Some pages are</w:t>
+      </w:r>
+      <w:r>
+        <w:t xml:space="preserve"> </w:t>
+      </w:r>
+      <w:r>
+        <w:rPr>
+          <w:b/>
+          <w:bCs/>
+        </w:rPr>
+        <w:t xml:space="preserve">task traffic</w:t>
+      </w:r>
+      <w:r>
+        <w:t xml:space="preserve"> </w:t>
+      </w:r>
+      <w:r>
+        <w:t xml:space="preserve">— people who arrive to</w:t>
+      </w:r>
+      <w:r>
+        <w:t xml:space="preserve"> </w:t>
+      </w:r>
+      <w:r>
+        <w:rPr>
+          <w:i/>
+          <w:iCs/>
+        </w:rPr>
+        <w:t xml:space="preserve">do</w:t>
+      </w:r>
+      <w:r>
+        <w:t xml:space="preserve"> </w:t>
+      </w:r>
+      <w:r>
+        <w:t xml:space="preserve">something, most</w:t>
+      </w:r>
+      <w:r>
+        <w:t xml:space="preserve"> </w:t>
+      </w:r>
+      <w:r>
+        <w:t xml:space="preserve">visibly to find grant funding, in visits that spike around application deadlines.</w:t>
+      </w:r>
+      <w:r>
+        <w:t xml:space="preserve"> </w:t>
+      </w:r>
+      <w:r>
+        <w:t xml:space="preserve">The Research Hub is the other kind:</w:t>
+      </w:r>
+      <w:r>
+        <w:t xml:space="preserve"> </w:t>
+      </w:r>
+      <w:r>
+        <w:rPr>
+          <w:b/>
+          <w:bCs/>
+        </w:rPr>
+        <w:t xml:space="preserve">editorial content</w:t>
+      </w:r>
+      <w:r>
+        <w:t xml:space="preserve"> </w:t>
+      </w:r>
+      <w:r>
+        <w:t xml:space="preserve">— the research the</w:t>
+      </w:r>
+      <w:r>
+        <w:t xml:space="preserve"> </w:t>
+      </w:r>
+      <w:r>
+        <w:t xml:space="preserve">agency publishes for the public to</w:t>
+      </w:r>
+      <w:r>
+        <w:t xml:space="preserve"> </w:t>
+      </w:r>
+      <w:r>
+        <w:rPr>
+          <w:i/>
+          <w:iCs/>
+        </w:rPr>
+        <w:t xml:space="preserve">read</w:t>
+      </w:r>
+      <w:r>
+        <w:t xml:space="preserve">. Among everything on the site meant to</w:t>
+      </w:r>
+      <w:r>
+        <w:t xml:space="preserve"> </w:t>
+      </w:r>
+      <w:r>
+        <w:t xml:space="preserve">be read, the Research Hub is not merely ahead; it is effectively the site’s</w:t>
+      </w:r>
+      <w:r>
+        <w:t xml:space="preserve"> </w:t>
+      </w:r>
+      <w:r>
+        <w:t xml:space="preserve">content.</w:t>
+      </w:r>
+    </w:p>
+    <w:p>
+      <w:pPr>
+        <w:pStyle w:val="BodyText"/>
+      </w:pPr>
+      <w:r>
+        <w:t xml:space="preserve">And it is read consistently, not occasionally. Across every sustained window —</w:t>
+      </w:r>
+      <w:r>
+        <w:t xml:space="preserve"> </w:t>
+      </w:r>
+      <w:r>
+        <w:t xml:space="preserve">the last month, the last six months, the last twelve — Research Hub articles are</w:t>
+      </w:r>
+      <w:r>
+        <w:t xml:space="preserve"> </w:t>
+      </w:r>
+      <w:r>
+        <w:t xml:space="preserve">the most-read pages on the site: the</w:t>
+      </w:r>
+      <w:r>
+        <w:t xml:space="preserve"> </w:t>
+      </w:r>
+      <w:r>
+        <w:rPr>
+          <w:b/>
+          <w:bCs/>
+        </w:rPr>
+        <w:t xml:space="preserve">four most-visited pages after the homepage</w:t>
+      </w:r>
+      <w:r>
+        <w:rPr>
+          <w:b/>
+          <w:bCs/>
+        </w:rPr>
+        <w:t xml:space="preserve"> </w:t>
+      </w:r>
+      <w:r>
+        <w:rPr>
+          <w:b/>
+          <w:bCs/>
+        </w:rPr>
+        <w:t xml:space="preserve">are all articles, and nine of the top twelve overall</w:t>
+      </w:r>
+      <w:r>
+        <w:t xml:space="preserve">. A</w:t>
+      </w:r>
+      <w:r>
+        <w:t xml:space="preserve"> </w:t>
+      </w:r>
+      <w:r>
+        <w:rPr>
+          <w:b/>
+          <w:bCs/>
+        </w:rPr>
+        <w:t xml:space="preserve">majority of everyone</w:t>
+      </w:r>
+      <w:r>
+        <w:rPr>
+          <w:b/>
+          <w:bCs/>
+        </w:rPr>
+        <w:t xml:space="preserve"> </w:t>
+      </w:r>
+      <w:r>
+        <w:rPr>
+          <w:b/>
+          <w:bCs/>
+        </w:rPr>
+        <w:t xml:space="preserve">who visits the site reaches the Research Hub</w:t>
+      </w:r>
+      <w:r>
+        <w:t xml:space="preserve"> </w:t>
+      </w:r>
+      <w:r>
+        <w:t xml:space="preserve">— about</w:t>
+      </w:r>
+      <w:r>
+        <w:t xml:space="preserve"> </w:t>
+      </w:r>
+      <w:r>
+        <w:rPr>
+          <w:b/>
+          <w:bCs/>
+        </w:rPr>
+        <w:t xml:space="preserve">57% over six months and</w:t>
+      </w:r>
+      <w:r>
+        <w:rPr>
+          <w:b/>
+          <w:bCs/>
+        </w:rPr>
+        <w:t xml:space="preserve"> </w:t>
+      </w:r>
+      <w:r>
+        <w:rPr>
+          <w:b/>
+          <w:bCs/>
+        </w:rPr>
+        <w:t xml:space="preserve">66% over twelve</w:t>
+      </w:r>
+      <w:r>
+        <w:t xml:space="preserve">. (The homepage is the single most-visited page, as on any site;</w:t>
+      </w:r>
+      <w:r>
+        <w:t xml:space="preserve"> </w:t>
+      </w:r>
+      <w:r>
+        <w:t xml:space="preserve">it is the front door everyone enters through, not a destination.) Grants is the</w:t>
+      </w:r>
+      <w:r>
+        <w:t xml:space="preserve"> </w:t>
+      </w:r>
+      <w:r>
+        <w:t xml:space="preserve">next-largest section by volume, but that is task-driven, deadline-bound traffic —</w:t>
+      </w:r>
+      <w:r>
+        <w:t xml:space="preserve"> </w:t>
+      </w:r>
+      <w:r>
+        <w:t xml:space="preserve">people transacting, not readers — so it rises and falls with funding cycles while</w:t>
+      </w:r>
+      <w:r>
+        <w:t xml:space="preserve"> </w:t>
+      </w:r>
+      <w:r>
+        <w:t xml:space="preserve">Research Hub readership holds steady.</w:t>
+      </w:r>
+    </w:p>
+    <w:p>
+      <w:pPr>
+        <w:pStyle w:val="BodyText"/>
+      </w:pPr>
+      <w:r>
+        <w:t xml:space="preserve">The difference compounds over time. A Research Hub article is</w:t>
+      </w:r>
+      <w:r>
+        <w:t xml:space="preserve"> </w:t>
+      </w:r>
+      <w:r>
+        <w:rPr>
+          <w:b/>
+          <w:bCs/>
+        </w:rPr>
+        <w:t xml:space="preserve">permanent</w:t>
+      </w:r>
+      <w:r>
+        <w:t xml:space="preserve">:</w:t>
+      </w:r>
+      <w:r>
+        <w:t xml:space="preserve"> </w:t>
+      </w:r>
+      <w:r>
+        <w:t xml:space="preserve">published once, it keeps drawing readers for years — the same articles top the</w:t>
+      </w:r>
+      <w:r>
+        <w:t xml:space="preserve"> </w:t>
+      </w:r>
+      <w:r>
+        <w:t xml:space="preserve">6-month and 12-month rankings, so this is durable readership, not a passing</w:t>
+      </w:r>
+      <w:r>
+        <w:t xml:space="preserve"> </w:t>
+      </w:r>
+      <w:r>
+        <w:t xml:space="preserve">spike — and the library grows with every new article. A grant funding page is</w:t>
+      </w:r>
+      <w:r>
+        <w:t xml:space="preserve"> </w:t>
+      </w:r>
+      <w:r>
+        <w:rPr>
+          <w:b/>
+          <w:bCs/>
+        </w:rPr>
+        <w:t xml:space="preserve">temporary by design</w:t>
+      </w:r>
+      <w:r>
+        <w:t xml:space="preserve">: it exists only between its open and close dates, then</w:t>
+      </w:r>
+      <w:r>
+        <w:t xml:space="preserve"> </w:t>
+      </w:r>
+      <w:r>
+        <w:t xml:space="preserve">expires. So the Research Hub is a durable, compounding asset the agency keeps for</w:t>
+      </w:r>
+      <w:r>
+        <w:t xml:space="preserve"> </w:t>
+      </w:r>
+      <w:r>
+        <w:t xml:space="preserve">good, while grants traffic is necessary churn that resets with each cycle. That is</w:t>
+      </w:r>
+      <w:r>
+        <w:t xml:space="preserve"> </w:t>
+      </w:r>
+      <w:r>
+        <w:t xml:space="preserve">the strongest case of all for investing well in the tool that produces the</w:t>
+      </w:r>
+      <w:r>
+        <w:t xml:space="preserve"> </w:t>
+      </w:r>
+      <w:r>
+        <w:t xml:space="preserve">durable side of the site.</w:t>
       </w:r>
     </w:p>
     <w:p>

</xml_diff>

<commit_message>
docs: list per-finding remediation (not just the vulnerabilities) in the README + spec red/blue audit summaries
</commit_message>
<xml_diff>
--- a/docs/ICJIA-Research-Hub-Studio-2026-Design-and-Implementation-Spec.docx
+++ b/docs/ICJIA-Research-Hub-Studio-2026-Design-and-Implementation-Spec.docx
@@ -9183,6 +9183,810 @@
       </w:r>
       <w:r>
         <w:t xml:space="preserve">login — a short, documented checklist.</w:t>
+      </w:r>
+    </w:p>
+    <w:p>
+      <w:pPr>
+        <w:pStyle w:val="FirstParagraph"/>
+      </w:pPr>
+      <w:r>
+        <w:rPr>
+          <w:b/>
+          <w:bCs/>
+        </w:rPr>
+        <w:t xml:space="preserve">Findings &amp; remediation</w:t>
+      </w:r>
+    </w:p>
+    <w:tbl>
+      <w:tblPr>
+        <w:tblStyle w:val="Table"/>
+        <w:tblW w:type="pct" w:w="5000"/>
+        <w:tblLayout w:type="fixed"/>
+        <w:tblLook w:firstRow="1" w:lastRow="0" w:firstColumn="0" w:lastColumn="0" w:noHBand="0" w:noVBand="0" w:val="0020"/>
+      </w:tblPr>
+      <w:tblGrid>
+        <w:gridCol w:w="1980"/>
+        <w:gridCol w:w="1980"/>
+        <w:gridCol w:w="1980"/>
+        <w:gridCol w:w="1980"/>
+      </w:tblGrid>
+      <w:tr>
+        <w:trPr>
+          <w:tblHeader w:val="on"/>
+        </w:trPr>
+        <w:tc>
+          <w:tcPr/>
+          <w:p>
+            <w:pPr>
+              <w:pStyle w:val="Compact"/>
+            </w:pPr>
+            <w:r>
+              <w:t xml:space="preserve">Finding</w:t>
+            </w:r>
+          </w:p>
+        </w:tc>
+        <w:tc>
+          <w:tcPr/>
+          <w:p>
+            <w:pPr>
+              <w:pStyle w:val="Compact"/>
+            </w:pPr>
+            <w:r>
+              <w:t xml:space="preserve">Severity</w:t>
+            </w:r>
+          </w:p>
+        </w:tc>
+        <w:tc>
+          <w:tcPr/>
+          <w:p>
+            <w:pPr>
+              <w:pStyle w:val="Compact"/>
+            </w:pPr>
+            <w:r>
+              <w:t xml:space="preserve">Remediation</w:t>
+            </w:r>
+          </w:p>
+        </w:tc>
+        <w:tc>
+          <w:tcPr/>
+          <w:p>
+            <w:pPr>
+              <w:pStyle w:val="Compact"/>
+            </w:pPr>
+            <w:r>
+              <w:t xml:space="preserve">Status</w:t>
+            </w:r>
+          </w:p>
+        </w:tc>
+      </w:tr>
+      <w:tr>
+        <w:tc>
+          <w:tcPr/>
+          <w:p>
+            <w:pPr>
+              <w:pStyle w:val="Compact"/>
+            </w:pPr>
+            <w:r>
+              <w:t xml:space="preserve">H-1 — No CSP / security headers (admin JWT in a JS-readable cookie)</w:t>
+            </w:r>
+          </w:p>
+        </w:tc>
+        <w:tc>
+          <w:tcPr/>
+          <w:p>
+            <w:pPr>
+              <w:pStyle w:val="Compact"/>
+            </w:pPr>
+            <w:r>
+              <w:t xml:space="preserve">High</w:t>
+            </w:r>
+          </w:p>
+        </w:tc>
+        <w:tc>
+          <w:tcPr/>
+          <w:p>
+            <w:pPr>
+              <w:pStyle w:val="Compact"/>
+            </w:pPr>
+            <w:r>
+              <w:t xml:space="preserve">Added a Content-Security-Policy + security headers via</w:t>
+            </w:r>
+            <w:r>
+              <w:t xml:space="preserve"> </w:t>
+            </w:r>
+            <w:r>
+              <w:rPr>
+                <w:rStyle w:val="VerbatimChar"/>
+              </w:rPr>
+              <w:t xml:space="preserve">public/_headers</w:t>
+            </w:r>
+            <w:r>
+              <w:t xml:space="preserve"> </w:t>
+            </w:r>
+            <w:r>
+              <w:t xml:space="preserve">(CSP,</w:t>
+            </w:r>
+            <w:r>
+              <w:t xml:space="preserve"> </w:t>
+            </w:r>
+            <w:r>
+              <w:rPr>
+                <w:rStyle w:val="VerbatimChar"/>
+              </w:rPr>
+              <w:t xml:space="preserve">X-Content-Type-Options: nosniff</w:t>
+            </w:r>
+            <w:r>
+              <w:t xml:space="preserve">,</w:t>
+            </w:r>
+            <w:r>
+              <w:t xml:space="preserve"> </w:t>
+            </w:r>
+            <w:r>
+              <w:rPr>
+                <w:rStyle w:val="VerbatimChar"/>
+              </w:rPr>
+              <w:t xml:space="preserve">X-Frame-Options: DENY</w:t>
+            </w:r>
+            <w:r>
+              <w:t xml:space="preserve">, HSTS, Referrer-Policy)</w:t>
+            </w:r>
+          </w:p>
+        </w:tc>
+        <w:tc>
+          <w:tcPr/>
+          <w:p>
+            <w:pPr>
+              <w:pStyle w:val="Compact"/>
+            </w:pPr>
+            <w:r>
+              <w:t xml:space="preserve">✅ Fixed in repo (</w:t>
+            </w:r>
+            <w:r>
+              <w:rPr>
+                <w:rStyle w:val="VerbatimChar"/>
+              </w:rPr>
+              <w:t xml:space="preserve">e402f3d</w:t>
+            </w:r>
+            <w:r>
+              <w:t xml:space="preserve">); CSP to be confirmed on a deploy preview</w:t>
+            </w:r>
+          </w:p>
+        </w:tc>
+      </w:tr>
+      <w:tr>
+        <w:tc>
+          <w:tcPr/>
+          <w:p>
+            <w:pPr>
+              <w:pStyle w:val="Compact"/>
+            </w:pPr>
+            <w:r>
+              <w:t xml:space="preserve">M-1 — Session kept on transient/5xx boot errors</w:t>
+            </w:r>
+          </w:p>
+        </w:tc>
+        <w:tc>
+          <w:tcPr/>
+          <w:p>
+            <w:pPr>
+              <w:pStyle w:val="Compact"/>
+            </w:pPr>
+            <w:r>
+              <w:t xml:space="preserve">Medium</w:t>
+            </w:r>
+          </w:p>
+        </w:tc>
+        <w:tc>
+          <w:tcPr/>
+          <w:p>
+            <w:pPr>
+              <w:pStyle w:val="Compact"/>
+            </w:pPr>
+            <w:r>
+              <w:rPr>
+                <w:rStyle w:val="VerbatimChar"/>
+              </w:rPr>
+              <w:t xml:space="preserve">init()</w:t>
+            </w:r>
+            <w:r>
+              <w:t xml:space="preserve"> </w:t>
+            </w:r>
+            <w:r>
+              <w:t xml:space="preserve">now clears the session on a definitive</w:t>
+            </w:r>
+            <w:r>
+              <w:t xml:space="preserve"> </w:t>
+            </w:r>
+            <w:r>
+              <w:rPr>
+                <w:rStyle w:val="VerbatimChar"/>
+              </w:rPr>
+              <w:t xml:space="preserve">403</w:t>
+            </w:r>
+          </w:p>
+        </w:tc>
+        <w:tc>
+          <w:tcPr/>
+          <w:p>
+            <w:pPr>
+              <w:pStyle w:val="Compact"/>
+            </w:pPr>
+            <w:r>
+              <w:t xml:space="preserve">✅ Fixed (</w:t>
+            </w:r>
+            <w:r>
+              <w:rPr>
+                <w:rStyle w:val="VerbatimChar"/>
+              </w:rPr>
+              <w:t xml:space="preserve">e402f3d</w:t>
+            </w:r>
+            <w:r>
+              <w:t xml:space="preserve">)</w:t>
+            </w:r>
+          </w:p>
+        </w:tc>
+      </w:tr>
+      <w:tr>
+        <w:tc>
+          <w:tcPr/>
+          <w:p>
+            <w:pPr>
+              <w:pStyle w:val="Compact"/>
+            </w:pPr>
+            <w:r>
+              <w:t xml:space="preserve">M-2 — Fragile regex Table-of-Contents id injection</w:t>
+            </w:r>
+          </w:p>
+        </w:tc>
+        <w:tc>
+          <w:tcPr/>
+          <w:p>
+            <w:pPr>
+              <w:pStyle w:val="Compact"/>
+            </w:pPr>
+            <w:r>
+              <w:t xml:space="preserve">Medium</w:t>
+            </w:r>
+          </w:p>
+        </w:tc>
+        <w:tc>
+          <w:tcPr/>
+          <w:p>
+            <w:pPr>
+              <w:pStyle w:val="Compact"/>
+            </w:pPr>
+            <w:r>
+              <w:t xml:space="preserve">Heading ids now derived from the Markdown AST and HTML-escaped</w:t>
+            </w:r>
+          </w:p>
+        </w:tc>
+        <w:tc>
+          <w:tcPr/>
+          <w:p>
+            <w:pPr>
+              <w:pStyle w:val="Compact"/>
+            </w:pPr>
+            <w:r>
+              <w:t xml:space="preserve">✅ Fixed (</w:t>
+            </w:r>
+            <w:r>
+              <w:rPr>
+                <w:rStyle w:val="VerbatimChar"/>
+              </w:rPr>
+              <w:t xml:space="preserve">e402f3d</w:t>
+            </w:r>
+            <w:r>
+              <w:t xml:space="preserve">)</w:t>
+            </w:r>
+          </w:p>
+        </w:tc>
+      </w:tr>
+      <w:tr>
+        <w:tc>
+          <w:tcPr/>
+          <w:p>
+            <w:pPr>
+              <w:pStyle w:val="Compact"/>
+            </w:pPr>
+            <w:r>
+              <w:t xml:space="preserve">M-3 / M-4 — SVG + document-upload validation is client-side only</w:t>
+            </w:r>
+          </w:p>
+        </w:tc>
+        <w:tc>
+          <w:tcPr/>
+          <w:p>
+            <w:pPr>
+              <w:pStyle w:val="Compact"/>
+            </w:pPr>
+            <w:r>
+              <w:t xml:space="preserve">Medium</w:t>
+            </w:r>
+          </w:p>
+        </w:tc>
+        <w:tc>
+          <w:tcPr/>
+          <w:p>
+            <w:pPr>
+              <w:pStyle w:val="Compact"/>
+            </w:pPr>
+            <w:r>
+              <w:t xml:space="preserve">Enforce MIME/size limits at the Strapi Media Library; serve uploads as non-inline (</w:t>
+            </w:r>
+            <w:r>
+              <w:rPr>
+                <w:rStyle w:val="VerbatimChar"/>
+              </w:rPr>
+              <w:t xml:space="preserve">attachment</w:t>
+            </w:r>
+            <w:r>
+              <w:t xml:space="preserve"> </w:t>
+            </w:r>
+            <w:r>
+              <w:t xml:space="preserve">/</w:t>
+            </w:r>
+            <w:r>
+              <w:t xml:space="preserve"> </w:t>
+            </w:r>
+            <w:r>
+              <w:rPr>
+                <w:rStyle w:val="VerbatimChar"/>
+              </w:rPr>
+              <w:t xml:space="preserve">nosniff</w:t>
+            </w:r>
+            <w:r>
+              <w:t xml:space="preserve">)</w:t>
+            </w:r>
+          </w:p>
+        </w:tc>
+        <w:tc>
+          <w:tcPr/>
+          <w:p>
+            <w:pPr>
+              <w:pStyle w:val="Compact"/>
+            </w:pPr>
+            <w:r>
+              <w:t xml:space="preserve">⏳ Launch-time (Strapi side — Research &amp; Analysis)</w:t>
+            </w:r>
+          </w:p>
+        </w:tc>
+      </w:tr>
+      <w:tr>
+        <w:tc>
+          <w:tcPr/>
+          <w:p>
+            <w:pPr>
+              <w:pStyle w:val="Compact"/>
+            </w:pPr>
+            <w:r>
+              <w:t xml:space="preserve">M-5 — Unthrottled review-email relay</w:t>
+            </w:r>
+          </w:p>
+        </w:tc>
+        <w:tc>
+          <w:tcPr/>
+          <w:p>
+            <w:pPr>
+              <w:pStyle w:val="Compact"/>
+            </w:pPr>
+            <w:r>
+              <w:t xml:space="preserve">Medium</w:t>
+            </w:r>
+          </w:p>
+        </w:tc>
+        <w:tc>
+          <w:tcPr/>
+          <w:p>
+            <w:pPr>
+              <w:pStyle w:val="Compact"/>
+            </w:pPr>
+            <w:r>
+              <w:t xml:space="preserve">Rate-limited the endpoint (5 sends / 10 min → HTTP 429)</w:t>
+            </w:r>
+          </w:p>
+        </w:tc>
+        <w:tc>
+          <w:tcPr/>
+          <w:p>
+            <w:pPr>
+              <w:pStyle w:val="Compact"/>
+            </w:pPr>
+            <w:r>
+              <w:t xml:space="preserve">✅ Fixed (</w:t>
+            </w:r>
+            <w:r>
+              <w:rPr>
+                <w:rStyle w:val="VerbatimChar"/>
+              </w:rPr>
+              <w:t xml:space="preserve">e402f3d</w:t>
+            </w:r>
+            <w:r>
+              <w:t xml:space="preserve">)</w:t>
+            </w:r>
+          </w:p>
+        </w:tc>
+      </w:tr>
+      <w:tr>
+        <w:tc>
+          <w:tcPr/>
+          <w:p>
+            <w:pPr>
+              <w:pStyle w:val="Compact"/>
+            </w:pPr>
+            <w:r>
+              <w:t xml:space="preserve">L-4 — Dataset source/datafile URLs not gated at save time</w:t>
+            </w:r>
+          </w:p>
+        </w:tc>
+        <w:tc>
+          <w:tcPr/>
+          <w:p>
+            <w:pPr>
+              <w:pStyle w:val="Compact"/>
+            </w:pPr>
+            <w:r>
+              <w:t xml:space="preserve">Low</w:t>
+            </w:r>
+          </w:p>
+        </w:tc>
+        <w:tc>
+          <w:tcPr/>
+          <w:p>
+            <w:pPr>
+              <w:pStyle w:val="Compact"/>
+            </w:pPr>
+            <w:r>
+              <w:rPr>
+                <w:rStyle w:val="VerbatimChar"/>
+              </w:rPr>
+              <w:t xml:space="preserve">validateDataset</w:t>
+            </w:r>
+            <w:r>
+              <w:t xml:space="preserve"> </w:t>
+            </w:r>
+            <w:r>
+              <w:t xml:space="preserve">now rejects</w:t>
+            </w:r>
+            <w:r>
+              <w:t xml:space="preserve"> </w:t>
+            </w:r>
+            <w:r>
+              <w:rPr>
+                <w:rStyle w:val="VerbatimChar"/>
+              </w:rPr>
+              <w:t xml:space="preserve">javascript:</w:t>
+            </w:r>
+            <w:r>
+              <w:t xml:space="preserve"> </w:t>
+            </w:r>
+            <w:r>
+              <w:t xml:space="preserve">/</w:t>
+            </w:r>
+            <w:r>
+              <w:t xml:space="preserve"> </w:t>
+            </w:r>
+            <w:r>
+              <w:rPr>
+                <w:rStyle w:val="VerbatimChar"/>
+              </w:rPr>
+              <w:t xml:space="preserve">data:</w:t>
+            </w:r>
+            <w:r>
+              <w:t xml:space="preserve"> </w:t>
+            </w:r>
+            <w:r>
+              <w:t xml:space="preserve">/</w:t>
+            </w:r>
+            <w:r>
+              <w:t xml:space="preserve"> </w:t>
+            </w:r>
+            <w:r>
+              <w:rPr>
+                <w:rStyle w:val="VerbatimChar"/>
+              </w:rPr>
+              <w:t xml:space="preserve">vbscript:</w:t>
+            </w:r>
+            <w:r>
+              <w:t xml:space="preserve"> </w:t>
+            </w:r>
+            <w:r>
+              <w:t xml:space="preserve">/</w:t>
+            </w:r>
+            <w:r>
+              <w:t xml:space="preserve"> </w:t>
+            </w:r>
+            <w:r>
+              <w:rPr>
+                <w:rStyle w:val="VerbatimChar"/>
+              </w:rPr>
+              <w:t xml:space="preserve">file:</w:t>
+            </w:r>
+            <w:r>
+              <w:t xml:space="preserve"> </w:t>
+            </w:r>
+            <w:r>
+              <w:t xml:space="preserve">URLs</w:t>
+            </w:r>
+          </w:p>
+        </w:tc>
+        <w:tc>
+          <w:tcPr/>
+          <w:p>
+            <w:pPr>
+              <w:pStyle w:val="Compact"/>
+            </w:pPr>
+            <w:r>
+              <w:t xml:space="preserve">✅ Fixed (</w:t>
+            </w:r>
+            <w:r>
+              <w:rPr>
+                <w:rStyle w:val="VerbatimChar"/>
+              </w:rPr>
+              <w:t xml:space="preserve">e402f3d</w:t>
+            </w:r>
+            <w:r>
+              <w:t xml:space="preserve">)</w:t>
+            </w:r>
+          </w:p>
+        </w:tc>
+      </w:tr>
+      <w:tr>
+        <w:tc>
+          <w:tcPr/>
+          <w:p>
+            <w:pPr>
+              <w:pStyle w:val="Compact"/>
+            </w:pPr>
+            <w:r>
+              <w:t xml:space="preserve">L-5 — Error page could surface raw error text</w:t>
+            </w:r>
+          </w:p>
+        </w:tc>
+        <w:tc>
+          <w:tcPr/>
+          <w:p>
+            <w:pPr>
+              <w:pStyle w:val="Compact"/>
+            </w:pPr>
+            <w:r>
+              <w:t xml:space="preserve">Low</w:t>
+            </w:r>
+          </w:p>
+        </w:tc>
+        <w:tc>
+          <w:tcPr/>
+          <w:p>
+            <w:pPr>
+              <w:pStyle w:val="Compact"/>
+            </w:pPr>
+            <w:r>
+              <w:t xml:space="preserve">Production error page renders a generic message (detail only in dev)</w:t>
+            </w:r>
+          </w:p>
+        </w:tc>
+        <w:tc>
+          <w:tcPr/>
+          <w:p>
+            <w:pPr>
+              <w:pStyle w:val="Compact"/>
+            </w:pPr>
+            <w:r>
+              <w:t xml:space="preserve">✅ Fixed (</w:t>
+            </w:r>
+            <w:r>
+              <w:rPr>
+                <w:rStyle w:val="VerbatimChar"/>
+              </w:rPr>
+              <w:t xml:space="preserve">e402f3d</w:t>
+            </w:r>
+            <w:r>
+              <w:t xml:space="preserve">)</w:t>
+            </w:r>
+          </w:p>
+        </w:tc>
+      </w:tr>
+      <w:tr>
+        <w:tc>
+          <w:tcPr/>
+          <w:p>
+            <w:pPr>
+              <w:pStyle w:val="Compact"/>
+            </w:pPr>
+            <w:r>
+              <w:t xml:space="preserve">I-5 — Zero-base64 enforced only at the form</w:t>
+            </w:r>
+          </w:p>
+        </w:tc>
+        <w:tc>
+          <w:tcPr/>
+          <w:p>
+            <w:pPr>
+              <w:pStyle w:val="Compact"/>
+            </w:pPr>
+            <w:r>
+              <w:t xml:space="preserve">Info</w:t>
+            </w:r>
+          </w:p>
+        </w:tc>
+        <w:tc>
+          <w:tcPr/>
+          <w:p>
+            <w:pPr>
+              <w:pStyle w:val="Compact"/>
+            </w:pPr>
+            <w:r>
+              <w:rPr>
+                <w:rStyle w:val="VerbatimChar"/>
+              </w:rPr>
+              <w:t xml:space="preserve">assertNoBase64</w:t>
+            </w:r>
+            <w:r>
+              <w:t xml:space="preserve"> </w:t>
+            </w:r>
+            <w:r>
+              <w:t xml:space="preserve">wired into the repository write boundary</w:t>
+            </w:r>
+          </w:p>
+        </w:tc>
+        <w:tc>
+          <w:tcPr/>
+          <w:p>
+            <w:pPr>
+              <w:pStyle w:val="Compact"/>
+            </w:pPr>
+            <w:r>
+              <w:t xml:space="preserve">✅ Fixed (</w:t>
+            </w:r>
+            <w:r>
+              <w:rPr>
+                <w:rStyle w:val="VerbatimChar"/>
+              </w:rPr>
+              <w:t xml:space="preserve">e402f3d</w:t>
+            </w:r>
+            <w:r>
+              <w:t xml:space="preserve">)</w:t>
+            </w:r>
+          </w:p>
+        </w:tc>
+      </w:tr>
+      <w:tr>
+        <w:tc>
+          <w:tcPr/>
+          <w:p>
+            <w:pPr>
+              <w:pStyle w:val="Compact"/>
+            </w:pPr>
+            <w:r>
+              <w:t xml:space="preserve">Server-side authorization / admin-JWT lifetime (incl. L-1 token revocation)</w:t>
+            </w:r>
+          </w:p>
+        </w:tc>
+        <w:tc>
+          <w:tcPr/>
+          <w:p>
+            <w:pPr>
+              <w:pStyle w:val="Compact"/>
+            </w:pPr>
+            <w:r>
+              <w:t xml:space="preserve">—</w:t>
+            </w:r>
+          </w:p>
+        </w:tc>
+        <w:tc>
+          <w:tcPr/>
+          <w:p>
+            <w:pPr>
+              <w:pStyle w:val="Compact"/>
+            </w:pPr>
+            <w:r>
+              <w:t xml:space="preserve">Verify in the Strapi instance: publisher-only publish, per-role permissions, a sane admin-JWT lifetime</w:t>
+            </w:r>
+          </w:p>
+        </w:tc>
+        <w:tc>
+          <w:tcPr/>
+          <w:p>
+            <w:pPr>
+              <w:pStyle w:val="Compact"/>
+            </w:pPr>
+            <w:r>
+              <w:t xml:space="preserve">⏳ Launch-time (Strapi side — Research &amp; Analysis)</w:t>
+            </w:r>
+          </w:p>
+        </w:tc>
+      </w:tr>
+      <w:tr>
+        <w:tc>
+          <w:tcPr/>
+          <w:p>
+            <w:pPr>
+              <w:pStyle w:val="Compact"/>
+            </w:pPr>
+            <w:r>
+              <w:t xml:space="preserve">Dev</w:t>
+            </w:r>
+            <w:r>
+              <w:t xml:space="preserve"> </w:t>
+            </w:r>
+            <w:r>
+              <w:rPr>
+                <w:rStyle w:val="VerbatimChar"/>
+              </w:rPr>
+              <w:t xml:space="preserve">admin/admin</w:t>
+            </w:r>
+            <w:r>
+              <w:t xml:space="preserve"> </w:t>
+            </w:r>
+            <w:r>
+              <w:t xml:space="preserve">bypass (D-1/2/3)</w:t>
+            </w:r>
+          </w:p>
+        </w:tc>
+        <w:tc>
+          <w:tcPr/>
+          <w:p>
+            <w:pPr>
+              <w:pStyle w:val="Compact"/>
+            </w:pPr>
+            <w:r>
+              <w:t xml:space="preserve">Dev-only</w:t>
+            </w:r>
+          </w:p>
+        </w:tc>
+        <w:tc>
+          <w:tcPr/>
+          <w:p>
+            <w:pPr>
+              <w:pStyle w:val="Compact"/>
+            </w:pPr>
+            <w:r>
+              <w:t xml:space="preserve">Remove end-to-end before production and add a CI check that fails if it ships; meanwhile it is tree-shaken out of production builds</w:t>
+            </w:r>
+          </w:p>
+        </w:tc>
+        <w:tc>
+          <w:tcPr/>
+          <w:p>
+            <w:pPr>
+              <w:pStyle w:val="Compact"/>
+            </w:pPr>
+            <w:r>
+              <w:t xml:space="preserve">⏳ Launch-time</w:t>
+            </w:r>
+          </w:p>
+        </w:tc>
+      </w:tr>
+    </w:tbl>
+    <w:p>
+      <w:pPr>
+        <w:pStyle w:val="BodyText"/>
+      </w:pPr>
+      <w:r>
+        <w:t xml:space="preserve">Dependency monitoring (Dependabot) was also added in</w:t>
+      </w:r>
+      <w:r>
+        <w:t xml:space="preserve"> </w:t>
+      </w:r>
+      <w:r>
+        <w:rPr>
+          <w:rStyle w:val="VerbatimChar"/>
+        </w:rPr>
+        <w:t xml:space="preserve">e402f3d</w:t>
+      </w:r>
+      <w:r>
+        <w:t xml:space="preserve">; the full detail is in</w:t>
+      </w:r>
+      <w:r>
+        <w:t xml:space="preserve"> </w:t>
+      </w:r>
+      <w:r>
+        <w:rPr>
+          <w:rStyle w:val="VerbatimChar"/>
+        </w:rPr>
+        <w:t xml:space="preserve">docs/security-audit.md</w:t>
+      </w:r>
+      <w:r>
+        <w:t xml:space="preserve">.</w:t>
       </w:r>
     </w:p>
     <w:p>

</xml_diff>

<commit_message>
docs: mirror the demo & public-deploy audit summary (findings + remediations) into the README and spec/.docx; refresh test count to 405
</commit_message>
<xml_diff>
--- a/docs/ICJIA-Research-Hub-Studio-2026-Design-and-Implementation-Spec.docx
+++ b/docs/ICJIA-Research-Hub-Studio-2026-Design-and-Implementation-Spec.docx
@@ -649,7 +649,23 @@
         <w:t xml:space="preserve"> </w:t>
       </w:r>
       <w:r>
-        <w:t xml:space="preserve">independently red/blue-team audited —</w:t>
+        <w:t xml:space="preserve">independently red/blue-team audited (production</w:t>
+      </w:r>
+      <w:r>
+        <w:t xml:space="preserve"> </w:t>
+      </w:r>
+      <w:r>
+        <w:rPr>
+          <w:b/>
+          <w:bCs/>
+        </w:rPr>
+        <w:t xml:space="preserve">and</w:t>
+      </w:r>
+      <w:r>
+        <w:t xml:space="preserve"> </w:t>
+      </w:r>
+      <w:r>
+        <w:t xml:space="preserve">the public demo) —</w:t>
       </w:r>
       <w:r>
         <w:t xml:space="preserve"> </w:t>
@@ -662,7 +678,7 @@
         <w:t xml:space="preserve">0 critical issues</w:t>
       </w:r>
       <w:r>
-        <w:t xml:space="preserve">; the in-repo fixes are done and covered by 375 automated tests (</w:t>
+        <w:t xml:space="preserve">; the in-repo fixes are done and covered by 405 automated tests (</w:t>
       </w:r>
       <w:r>
         <w:rPr>
@@ -9022,7 +9038,7 @@
           <w:b/>
           <w:bCs/>
         </w:rPr>
-        <w:t xml:space="preserve">automated tests (375 of them)</w:t>
+        <w:t xml:space="preserve">automated tests (405 of them)</w:t>
       </w:r>
       <w:r>
         <w:t xml:space="preserve">. The full report lives in the repository</w:t>
@@ -9987,6 +10003,729 @@
       </w:r>
       <w:r>
         <w:t xml:space="preserve">.</w:t>
+      </w:r>
+    </w:p>
+    <w:p>
+      <w:pPr>
+        <w:pStyle w:val="BodyText"/>
+      </w:pPr>
+      <w:r>
+        <w:rPr>
+          <w:b/>
+          <w:bCs/>
+        </w:rPr>
+        <w:t xml:space="preserve">Demo &amp; public-deploy audit (2026-06-21).</w:t>
+      </w:r>
+      <w:r>
+        <w:t xml:space="preserve"> </w:t>
+      </w:r>
+      <w:r>
+        <w:t xml:space="preserve">A second adversarial pass covered the</w:t>
+      </w:r>
+      <w:r>
+        <w:t xml:space="preserve"> </w:t>
+      </w:r>
+      <w:r>
+        <w:t xml:space="preserve">new</w:t>
+      </w:r>
+      <w:r>
+        <w:t xml:space="preserve"> </w:t>
+      </w:r>
+      <w:r>
+        <w:rPr>
+          <w:b/>
+          <w:bCs/>
+        </w:rPr>
+        <w:t xml:space="preserve">public-demo</w:t>
+      </w:r>
+      <w:r>
+        <w:t xml:space="preserve"> </w:t>
+      </w:r>
+      <w:r>
+        <w:t xml:space="preserve">capability — demo mode, the static Netlify deploy, the demo</w:t>
+      </w:r>
+      <w:r>
+        <w:t xml:space="preserve"> </w:t>
+      </w:r>
+      <w:r>
+        <w:t xml:space="preserve">CSP/headers, and icon/image bundling.</w:t>
+      </w:r>
+      <w:r>
+        <w:t xml:space="preserve"> </w:t>
+      </w:r>
+      <w:r>
+        <w:rPr>
+          <w:b/>
+          <w:bCs/>
+        </w:rPr>
+        <w:t xml:space="preserve">Verdict: safe to expose publicly — zero</w:t>
+      </w:r>
+      <w:r>
+        <w:rPr>
+          <w:b/>
+          <w:bCs/>
+        </w:rPr>
+        <w:t xml:space="preserve"> </w:t>
+      </w:r>
+      <w:r>
+        <w:rPr>
+          <w:b/>
+          <w:bCs/>
+        </w:rPr>
+        <w:t xml:space="preserve">Critical, zero High.</w:t>
+      </w:r>
+      <w:r>
+        <w:t xml:space="preserve"> </w:t>
+      </w:r>
+      <w:r>
+        <w:t xml:space="preserve">The demo cannot write to Strapi, cannot sign in as a real</w:t>
+      </w:r>
+      <w:r>
+        <w:t xml:space="preserve"> </w:t>
+      </w:r>
+      <w:r>
+        <w:t xml:space="preserve">user, and ships no secrets; this holds three deep — in-memory data, a sentinel token</w:t>
+      </w:r>
+      <w:r>
+        <w:t xml:space="preserve"> </w:t>
+      </w:r>
+      <w:r>
+        <w:t xml:space="preserve">Strapi rejects, and a CSP</w:t>
+      </w:r>
+      <w:r>
+        <w:t xml:space="preserve"> </w:t>
+      </w:r>
+      <w:r>
+        <w:rPr>
+          <w:rStyle w:val="VerbatimChar"/>
+        </w:rPr>
+        <w:t xml:space="preserve">connect-src 'self'</w:t>
+      </w:r>
+      <w:r>
+        <w:t xml:space="preserve"> </w:t>
+      </w:r>
+      <w:r>
+        <w:t xml:space="preserve">that makes the backend unreachable</w:t>
+      </w:r>
+      <w:r>
+        <w:t xml:space="preserve"> </w:t>
+      </w:r>
+      <w:r>
+        <w:rPr>
+          <w:i/>
+          <w:iCs/>
+        </w:rPr>
+        <w:t xml:space="preserve">even if every client-side guard is bypassed</w:t>
+      </w:r>
+      <w:r>
+        <w:t xml:space="preserve">. Of 10 findings (all Medium/Low),</w:t>
+      </w:r>
+      <w:r>
+        <w:t xml:space="preserve"> </w:t>
+      </w:r>
+      <w:r>
+        <w:rPr>
+          <w:b/>
+          <w:bCs/>
+        </w:rPr>
+        <w:t xml:space="preserve">5 were fixed in code and 5 documented.</w:t>
+      </w:r>
+    </w:p>
+    <w:tbl>
+      <w:tblPr>
+        <w:tblStyle w:val="Table"/>
+        <w:tblW w:type="pct" w:w="5000"/>
+        <w:tblLayout w:type="fixed"/>
+        <w:tblLook w:firstRow="1" w:lastRow="0" w:firstColumn="0" w:lastColumn="0" w:noHBand="0" w:noVBand="0" w:val="0020"/>
+      </w:tblPr>
+      <w:tblGrid>
+        <w:gridCol w:w="1980"/>
+        <w:gridCol w:w="1980"/>
+        <w:gridCol w:w="1980"/>
+        <w:gridCol w:w="1980"/>
+      </w:tblGrid>
+      <w:tr>
+        <w:trPr>
+          <w:tblHeader w:val="on"/>
+        </w:trPr>
+        <w:tc>
+          <w:tcPr/>
+          <w:p>
+            <w:pPr>
+              <w:pStyle w:val="Compact"/>
+            </w:pPr>
+            <w:r>
+              <w:t xml:space="preserve">Finding</w:t>
+            </w:r>
+          </w:p>
+        </w:tc>
+        <w:tc>
+          <w:tcPr/>
+          <w:p>
+            <w:pPr>
+              <w:pStyle w:val="Compact"/>
+            </w:pPr>
+            <w:r>
+              <w:t xml:space="preserve">Severity</w:t>
+            </w:r>
+          </w:p>
+        </w:tc>
+        <w:tc>
+          <w:tcPr/>
+          <w:p>
+            <w:pPr>
+              <w:pStyle w:val="Compact"/>
+            </w:pPr>
+            <w:r>
+              <w:t xml:space="preserve">Remediation</w:t>
+            </w:r>
+          </w:p>
+        </w:tc>
+        <w:tc>
+          <w:tcPr/>
+          <w:p>
+            <w:pPr>
+              <w:pStyle w:val="Compact"/>
+            </w:pPr>
+            <w:r>
+              <w:t xml:space="preserve">Status</w:t>
+            </w:r>
+          </w:p>
+        </w:tc>
+      </w:tr>
+      <w:tr>
+        <w:tc>
+          <w:tcPr/>
+          <w:p>
+            <w:pPr>
+              <w:pStyle w:val="Compact"/>
+            </w:pPr>
+            <w:r>
+              <w:t xml:space="preserve">D-1 — Dev Strapi URL baked into the public demo bundle</w:t>
+            </w:r>
+          </w:p>
+        </w:tc>
+        <w:tc>
+          <w:tcPr/>
+          <w:p>
+            <w:pPr>
+              <w:pStyle w:val="Compact"/>
+            </w:pPr>
+            <w:r>
+              <w:t xml:space="preserve">Medium</w:t>
+            </w:r>
+          </w:p>
+        </w:tc>
+        <w:tc>
+          <w:tcPr/>
+          <w:p>
+            <w:pPr>
+              <w:pStyle w:val="Compact"/>
+            </w:pPr>
+            <w:r>
+              <w:t xml:space="preserve">Blank</w:t>
+            </w:r>
+            <w:r>
+              <w:t xml:space="preserve"> </w:t>
+            </w:r>
+            <w:r>
+              <w:rPr>
+                <w:rStyle w:val="VerbatimChar"/>
+              </w:rPr>
+              <w:t xml:space="preserve">strapiBaseUrl</w:t>
+            </w:r>
+            <w:r>
+              <w:t xml:space="preserve"> </w:t>
+            </w:r>
+            <w:r>
+              <w:t xml:space="preserve">in demo mode (unused — the demo is in-memory)</w:t>
+            </w:r>
+          </w:p>
+        </w:tc>
+        <w:tc>
+          <w:tcPr/>
+          <w:p>
+            <w:pPr>
+              <w:pStyle w:val="Compact"/>
+            </w:pPr>
+            <w:r>
+              <w:t xml:space="preserve">✅ Fixed (</w:t>
+            </w:r>
+            <w:r>
+              <w:rPr>
+                <w:rStyle w:val="VerbatimChar"/>
+              </w:rPr>
+              <w:t xml:space="preserve">cdff530</w:t>
+            </w:r>
+            <w:r>
+              <w:t xml:space="preserve">)</w:t>
+            </w:r>
+          </w:p>
+        </w:tc>
+      </w:tr>
+      <w:tr>
+        <w:tc>
+          <w:tcPr/>
+          <w:p>
+            <w:pPr>
+              <w:pStyle w:val="Compact"/>
+            </w:pPr>
+            <w:r>
+              <w:t xml:space="preserve">D-2 —</w:t>
+            </w:r>
+            <w:r>
+              <w:t xml:space="preserve"> </w:t>
+            </w:r>
+            <w:r>
+              <w:rPr>
+                <w:rStyle w:val="VerbatimChar"/>
+              </w:rPr>
+              <w:t xml:space="preserve">demoMode</w:t>
+            </w:r>
+            <w:r>
+              <w:t xml:space="preserve"> </w:t>
+            </w:r>
+            <w:r>
+              <w:t xml:space="preserve">flag is runtime-mutable (devtools could flip it)</w:t>
+            </w:r>
+          </w:p>
+        </w:tc>
+        <w:tc>
+          <w:tcPr/>
+          <w:p>
+            <w:pPr>
+              <w:pStyle w:val="Compact"/>
+            </w:pPr>
+            <w:r>
+              <w:t xml:space="preserve">Medium</w:t>
+            </w:r>
+          </w:p>
+        </w:tc>
+        <w:tc>
+          <w:tcPr/>
+          <w:p>
+            <w:pPr>
+              <w:pStyle w:val="Compact"/>
+            </w:pPr>
+            <w:r>
+              <w:t xml:space="preserve">Neutralized by the CSP</w:t>
+            </w:r>
+            <w:r>
+              <w:t xml:space="preserve"> </w:t>
+            </w:r>
+            <w:r>
+              <w:rPr>
+                <w:rStyle w:val="VerbatimChar"/>
+              </w:rPr>
+              <w:t xml:space="preserve">connect-src 'self'</w:t>
+            </w:r>
+            <w:r>
+              <w:t xml:space="preserve"> </w:t>
+            </w:r>
+            <w:r>
+              <w:t xml:space="preserve">backstop + the rejected sentinel token; optional freeze + CI guard noted</w:t>
+            </w:r>
+          </w:p>
+        </w:tc>
+        <w:tc>
+          <w:tcPr/>
+          <w:p>
+            <w:pPr>
+              <w:pStyle w:val="Compact"/>
+            </w:pPr>
+            <w:r>
+              <w:t xml:space="preserve">🛡️ Mitigated</w:t>
+            </w:r>
+          </w:p>
+        </w:tc>
+      </w:tr>
+      <w:tr>
+        <w:tc>
+          <w:tcPr/>
+          <w:p>
+            <w:pPr>
+              <w:pStyle w:val="Compact"/>
+            </w:pPr>
+            <w:r>
+              <w:t xml:space="preserve">D-3 — Icons could fetch</w:t>
+            </w:r>
+            <w:r>
+              <w:t xml:space="preserve"> </w:t>
+            </w:r>
+            <w:r>
+              <w:rPr>
+                <w:rStyle w:val="VerbatimChar"/>
+              </w:rPr>
+              <w:t xml:space="preserve">api.iconify.design</w:t>
+            </w:r>
+            <w:r>
+              <w:t xml:space="preserve"> </w:t>
+            </w:r>
+            <w:r>
+              <w:t xml:space="preserve">at runtime</w:t>
+            </w:r>
+          </w:p>
+        </w:tc>
+        <w:tc>
+          <w:tcPr/>
+          <w:p>
+            <w:pPr>
+              <w:pStyle w:val="Compact"/>
+            </w:pPr>
+            <w:r>
+              <w:t xml:space="preserve">Medium</w:t>
+            </w:r>
+          </w:p>
+        </w:tc>
+        <w:tc>
+          <w:tcPr/>
+          <w:p>
+            <w:pPr>
+              <w:pStyle w:val="Compact"/>
+            </w:pPr>
+            <w:r>
+              <w:rPr>
+                <w:rStyle w:val="VerbatimChar"/>
+              </w:rPr>
+              <w:t xml:space="preserve">icon.fallbackToApi:false</w:t>
+            </w:r>
+            <w:r>
+              <w:t xml:space="preserve"> </w:t>
+            </w:r>
+            <w:r>
+              <w:t xml:space="preserve">+ all 46 icons bundled locally</w:t>
+            </w:r>
+          </w:p>
+        </w:tc>
+        <w:tc>
+          <w:tcPr/>
+          <w:p>
+            <w:pPr>
+              <w:pStyle w:val="Compact"/>
+            </w:pPr>
+            <w:r>
+              <w:t xml:space="preserve">✅ Fixed (</w:t>
+            </w:r>
+            <w:r>
+              <w:rPr>
+                <w:rStyle w:val="VerbatimChar"/>
+              </w:rPr>
+              <w:t xml:space="preserve">cdff530</w:t>
+            </w:r>
+            <w:r>
+              <w:t xml:space="preserve">)</w:t>
+            </w:r>
+          </w:p>
+        </w:tc>
+      </w:tr>
+      <w:tr>
+        <w:tc>
+          <w:tcPr/>
+          <w:p>
+            <w:pPr>
+              <w:pStyle w:val="Compact"/>
+            </w:pPr>
+            <w:r>
+              <w:t xml:space="preserve">D-4 — Content reads gated only by the token, not the demo build</w:t>
+            </w:r>
+          </w:p>
+        </w:tc>
+        <w:tc>
+          <w:tcPr/>
+          <w:p>
+            <w:pPr>
+              <w:pStyle w:val="Compact"/>
+            </w:pPr>
+            <w:r>
+              <w:t xml:space="preserve">Low</w:t>
+            </w:r>
+          </w:p>
+        </w:tc>
+        <w:tc>
+          <w:tcPr/>
+          <w:p>
+            <w:pPr>
+              <w:pStyle w:val="Compact"/>
+            </w:pPr>
+            <w:r>
+              <w:rPr>
+                <w:rStyle w:val="VerbatimChar"/>
+              </w:rPr>
+              <w:t xml:space="preserve">isDemoData()</w:t>
+            </w:r>
+            <w:r>
+              <w:t xml:space="preserve"> </w:t>
+            </w:r>
+            <w:r>
+              <w:t xml:space="preserve">read-guard (in-memory repo for the whole demo build)</w:t>
+            </w:r>
+          </w:p>
+        </w:tc>
+        <w:tc>
+          <w:tcPr/>
+          <w:p>
+            <w:pPr>
+              <w:pStyle w:val="Compact"/>
+            </w:pPr>
+            <w:r>
+              <w:t xml:space="preserve">✅ Fixed (</w:t>
+            </w:r>
+            <w:r>
+              <w:rPr>
+                <w:rStyle w:val="VerbatimChar"/>
+              </w:rPr>
+              <w:t xml:space="preserve">cdff530</w:t>
+            </w:r>
+            <w:r>
+              <w:t xml:space="preserve">)</w:t>
+            </w:r>
+          </w:p>
+        </w:tc>
+      </w:tr>
+      <w:tr>
+        <w:tc>
+          <w:tcPr/>
+          <w:p>
+            <w:pPr>
+              <w:pStyle w:val="Compact"/>
+            </w:pPr>
+            <w:r>
+              <w:t xml:space="preserve">D-7 — Icon dependency pinned with a</w:t>
+            </w:r>
+            <w:r>
+              <w:t xml:space="preserve"> </w:t>
+            </w:r>
+            <w:r>
+              <w:rPr>
+                <w:rStyle w:val="VerbatimChar"/>
+              </w:rPr>
+              <w:t xml:space="preserve">^</w:t>
+            </w:r>
+            <w:r>
+              <w:t xml:space="preserve"> </w:t>
+            </w:r>
+            <w:r>
+              <w:t xml:space="preserve">range</w:t>
+            </w:r>
+          </w:p>
+        </w:tc>
+        <w:tc>
+          <w:tcPr/>
+          <w:p>
+            <w:pPr>
+              <w:pStyle w:val="Compact"/>
+            </w:pPr>
+            <w:r>
+              <w:t xml:space="preserve">Low</w:t>
+            </w:r>
+          </w:p>
+        </w:tc>
+        <w:tc>
+          <w:tcPr/>
+          <w:p>
+            <w:pPr>
+              <w:pStyle w:val="Compact"/>
+            </w:pPr>
+            <w:r>
+              <w:t xml:space="preserve">Pinned exact (</w:t>
+            </w:r>
+            <w:r>
+              <w:rPr>
+                <w:rStyle w:val="VerbatimChar"/>
+              </w:rPr>
+              <w:t xml:space="preserve">1.2.114</w:t>
+            </w:r>
+            <w:r>
+              <w:t xml:space="preserve">)</w:t>
+            </w:r>
+          </w:p>
+        </w:tc>
+        <w:tc>
+          <w:tcPr/>
+          <w:p>
+            <w:pPr>
+              <w:pStyle w:val="Compact"/>
+            </w:pPr>
+            <w:r>
+              <w:t xml:space="preserve">✅ Fixed (</w:t>
+            </w:r>
+            <w:r>
+              <w:rPr>
+                <w:rStyle w:val="VerbatimChar"/>
+              </w:rPr>
+              <w:t xml:space="preserve">cdff530</w:t>
+            </w:r>
+            <w:r>
+              <w:t xml:space="preserve">)</w:t>
+            </w:r>
+          </w:p>
+        </w:tc>
+      </w:tr>
+      <w:tr>
+        <w:tc>
+          <w:tcPr/>
+          <w:p>
+            <w:pPr>
+              <w:pStyle w:val="Compact"/>
+            </w:pPr>
+            <w:r>
+              <w:t xml:space="preserve">D-8 — No</w:t>
+            </w:r>
+            <w:r>
+              <w:t xml:space="preserve"> </w:t>
+            </w:r>
+            <w:r>
+              <w:rPr>
+                <w:rStyle w:val="VerbatimChar"/>
+              </w:rPr>
+              <w:t xml:space="preserve">Permissions-Policy</w:t>
+            </w:r>
+            <w:r>
+              <w:t xml:space="preserve"> </w:t>
+            </w:r>
+            <w:r>
+              <w:t xml:space="preserve">header</w:t>
+            </w:r>
+          </w:p>
+        </w:tc>
+        <w:tc>
+          <w:tcPr/>
+          <w:p>
+            <w:pPr>
+              <w:pStyle w:val="Compact"/>
+            </w:pPr>
+            <w:r>
+              <w:t xml:space="preserve">Low</w:t>
+            </w:r>
+          </w:p>
+        </w:tc>
+        <w:tc>
+          <w:tcPr/>
+          <w:p>
+            <w:pPr>
+              <w:pStyle w:val="Compact"/>
+            </w:pPr>
+            <w:r>
+              <w:t xml:space="preserve">Added to both header sets</w:t>
+            </w:r>
+          </w:p>
+        </w:tc>
+        <w:tc>
+          <w:tcPr/>
+          <w:p>
+            <w:pPr>
+              <w:pStyle w:val="Compact"/>
+            </w:pPr>
+            <w:r>
+              <w:t xml:space="preserve">✅ Fixed (</w:t>
+            </w:r>
+            <w:r>
+              <w:rPr>
+                <w:rStyle w:val="VerbatimChar"/>
+              </w:rPr>
+              <w:t xml:space="preserve">cdff530</w:t>
+            </w:r>
+            <w:r>
+              <w:t xml:space="preserve">)</w:t>
+            </w:r>
+          </w:p>
+        </w:tc>
+      </w:tr>
+      <w:tr>
+        <w:tc>
+          <w:tcPr/>
+          <w:p>
+            <w:pPr>
+              <w:pStyle w:val="Compact"/>
+            </w:pPr>
+            <w:r>
+              <w:t xml:space="preserve">D-5, D-6, D-9, D-10 — minor disclosure / prod-scoped</w:t>
+            </w:r>
+          </w:p>
+        </w:tc>
+        <w:tc>
+          <w:tcPr/>
+          <w:p>
+            <w:pPr>
+              <w:pStyle w:val="Compact"/>
+            </w:pPr>
+            <w:r>
+              <w:t xml:space="preserve">Low</w:t>
+            </w:r>
+          </w:p>
+        </w:tc>
+        <w:tc>
+          <w:tcPr/>
+          <w:p>
+            <w:pPr>
+              <w:pStyle w:val="Compact"/>
+            </w:pPr>
+            <w:r>
+              <w:t xml:space="preserve">Documented (sentinel creds worthless vs real Strapi; email-domain placeholder; HSTS</w:t>
+            </w:r>
+            <w:r>
+              <w:t xml:space="preserve"> </w:t>
+            </w:r>
+            <w:r>
+              <w:rPr>
+                <w:rStyle w:val="VerbatimChar"/>
+              </w:rPr>
+              <w:t xml:space="preserve">preload</w:t>
+            </w:r>
+            <w:r>
+              <w:t xml:space="preserve">; cookie</w:t>
+            </w:r>
+            <w:r>
+              <w:t xml:space="preserve"> </w:t>
+            </w:r>
+            <w:r>
+              <w:rPr>
+                <w:rStyle w:val="VerbatimChar"/>
+              </w:rPr>
+              <w:t xml:space="preserve">HttpOnly</w:t>
+            </w:r>
+            <w:r>
+              <w:t xml:space="preserve"> </w:t>
+            </w:r>
+            <w:r>
+              <w:t xml:space="preserve">= prod H-1)</w:t>
+            </w:r>
+          </w:p>
+        </w:tc>
+        <w:tc>
+          <w:tcPr/>
+          <w:p>
+            <w:pPr>
+              <w:pStyle w:val="Compact"/>
+            </w:pPr>
+            <w:r>
+              <w:t xml:space="preserve">📄 Documented</w:t>
+            </w:r>
+          </w:p>
+        </w:tc>
+      </w:tr>
+    </w:tbl>
+    <w:p>
+      <w:pPr>
+        <w:pStyle w:val="BodyText"/>
+      </w:pPr>
+      <w:r>
+        <w:t xml:space="preserve">Full detail in</w:t>
+      </w:r>
+      <w:r>
+        <w:t xml:space="preserve"> </w:t>
+      </w:r>
+      <w:r>
+        <w:rPr>
+          <w:rStyle w:val="VerbatimChar"/>
+        </w:rPr>
+        <w:t xml:space="preserve">docs/security-audit.md</w:t>
+      </w:r>
+      <w:r>
+        <w:t xml:space="preserve"> </w:t>
+      </w:r>
+      <w:r>
+        <w:t xml:space="preserve">§7.</w:t>
       </w:r>
     </w:p>
     <w:p>

</xml_diff>